<commit_message>
Research paper: verify references, fix ARLUE model versions and misattributed claims
Co-Authored-By: Claude Opus 5.5 (1M context) <noreply@anthropic.com>
</commit_message>
<xml_diff>
--- a/research-paper/البحث_العلمي_تصنيف_استفسارات_الطلاب.docx
+++ b/research-paper/البحث_العلمي_تصنيف_استفسارات_الطلاب.docx
@@ -399,7 +399,7 @@
           <w:szCs w:val="28"/>
           <w:rtl/>
         </w:rPr>
-        <w:t xml:space="preserve"> محددات التدريب المسبق والخصائص البنيوية للنماذج الثلاثة [3], [4].</w:t>
+        <w:t xml:space="preserve"> محددات التدريب المسبق لـ AraBERTv2 وللإصدارين الأولين من ARBERT وMARBERT [3], [4]؛ وتُعرض بيانات الإصدارين الثانيين في القسم 4.1.</w:t>
       </w:r>
     </w:p>
     <w:tbl>
@@ -736,7 +736,7 @@
                 <w:szCs w:val="28"/>
                 <w:rtl/>
               </w:rPr>
-              <w:t xml:space="preserve">ARBERTv2</w:t>
+              <w:t xml:space="preserve">ARBERT</w:t>
             </w:r>
           </w:p>
         </w:tc>
@@ -873,7 +873,7 @@
                 <w:szCs w:val="28"/>
                 <w:rtl/>
               </w:rPr>
-              <w:t xml:space="preserve">MARBERTv2</w:t>
+              <w:t xml:space="preserve">MARBERT</w:t>
             </w:r>
           </w:p>
         </w:tc>
@@ -1009,7 +1009,7 @@
           <w:szCs w:val="28"/>
           <w:rtl/>
         </w:rPr>
-        <w:t xml:space="preserve">يُخضِع AraBERTv2 النص لمعالجة صرفية مسبقة بأداة Farasa تفكك الكلمة إلى سوابقها وجذعها ولواحقها قبل تمريرها إلى مجزّئ SentencePiece [3], [15]؛ فتُفكَّك كلمة «اللغة» مثلاً إلى «ال + لغ + ة». ويقلل هذا التصميم تضخم القاموس الناجم عن الطبيعة الالتصاقية للعربية، ويحسّن تعميم الفهم بين الصيغ المشتقة من الجذر ذاته. أما ARBERTv2 وMARBERTv2 فيطبقان خوارزمية WordPiece مباشرة على النص الخام [4]. وقد أكدت دراسات تقييم المجزّئات أن دمج التجزئة الصرفية مع خوارزميات التجزئة الجزئية يتفوق في مهام تصنيف الأخبار وتحليل المشاعر [7], [8]، لكنها رصدت أيضاً تراجع فاعلية Farasa عندما يغلب الطابع العامي على النص [8]. وهذا يعني أن الميزة الصرفية لـ AraBERTv2 قد تتحول إلى نقطة ضعف كلما ابتعد النص عن الفصحى، وهو احتمال قائم في الاستفسارات الطلابية. ومن جهة أخرى، دُرّب AraBERTv2 على تسلسلات تصل إلى 512 رمزاً، بينما اقتصر تدريب ARBERT وMARBERT الأصليين على 128 رمزاً تماشياً مع قِصر التغريدات [4].</w:t>
+        <w:t xml:space="preserve">يُخضِع AraBERTv2 النص لمعالجة صرفية مسبقة بأداة Farasa تفكك الكلمة إلى سوابقها وجذعها ولواحقها قبل تمريرها إلى مجزّئ SentencePiece [3], [15]؛ فتُفكَّك كلمة «اللغة» مثلاً إلى «ال + لغ + ة». ويقلل هذا التصميم تضخم القاموس الناجم عن الطبيعة الالتصاقية للعربية، ويحسّن تعميم الفهم بين الصيغ المشتقة من الجذر ذاته. أما ARBERTv2 وMARBERTv2 فيطبقان خوارزمية WordPiece مباشرة على النص الخام [4]. وقد خلصت دراسة لاستراتيجيات التجزئة العربية إلى أن دمج ترميز زوج البايتات (BPE) مع التجزئة الصرفية لأداة Farasa يتفوق في مهام متعددة منها تصنيف الأخبار، لكنها رصدت أيضاً تراجع الأداء في تحليل المشاعر بسبب صعوبات تجزئة البنى اللهجية [8]. وأظهرت دراسة أخرى أنه لا يوجد مجزّئ يتفوق في كل الحالات، وأن الأداء يتوقف على حجم البيانات ونوع المهمة ودرجة الغنى الصرفي للنص [7]. وهذا يعني أن الميزة الصرفية لـ AraBERTv2 قد تتحول إلى نقطة ضعف كلما ابتعد النص عن الفصحى، وهو احتمال قائم في الاستفسارات الطلابية. ومن جهة أخرى، دُرّب AraBERTv2 على تسلسلات تصل إلى 512 رمزاً، بينما اقتصر تدريب ARBERT وMARBERT الأصليين على 128 رمزاً تماشياً مع قِصر التغريدات [4].</w:t>
       </w:r>
     </w:p>
     <w:p>
@@ -1043,7 +1043,7 @@
           <w:szCs w:val="28"/>
           <w:rtl/>
         </w:rPr>
-        <w:t xml:space="preserve">يضم معيار ARLUE [4] اثنتين وأربعين مجموعة بيانات موزّعة على ستة تجمعات مهام. وتُظهر نتائجه (الجدول 2) أن MARBERTv2 يتصدر المهام ذات الطابع العفوي كتحليل المشاعر وتمييز اللهجات، بينما يتصدر AraBERTv2 تجمّع تصنيف المواضيع بنسبة 92.97%. ويحقق ARBERTv2 أعلى درجة كلية (76.07) بفارق 0.08 فقط عن MARBERTv2، ما يؤكد أن التفوق في معيار متعدد المهام لا يعني الأفضلية في كل مهمة فرعية. وتُعدّ مهمة تصنيف المواضيع الأقرب بنيوياً إلى تصنيف الاستفسارات الجامعية، لأنها تصنيف متعدد الفئات لنصوص قصيرة إلى متوسطة تُحدَّد فئتها بمضمونها الموضوعي لا بنبرتها العاطفية.</w:t>
+        <w:t xml:space="preserve">يضم معيار ARLUE [4] اثنتين وأربعين مجموعة بيانات موزّعة على ستة تجمعات مهام، وقد قُيّم عليه AraBERT والإصداران الأولان من ARBERT وMARBERT، إضافة إلى MARBERTv2. وتُظهر نتائجه (الجدول 2) أن MARBERT يتصدر المهام ذات الطابع العفوي كتحليل المشاعر وتمييز اللهجات، بينما يتصدر AraBERT تجمّع تصنيف المواضيع بين النماذج العربية بدرجة F1 تساوي 92.97. ويحقق ARBERT درجة كلية (76.07) أعلى بفارق 0.08 فقط من MARBERT (75.99)، ثم يأتي MARBERTv2 بأعلى درجة كلية (77.40)، ما يؤكد أن التفوق في معيار متعدد المهام لا يعني الأفضلية في كل مهمة فرعية. وتُعدّ مهمة تصنيف المواضيع الأقرب بنيوياً إلى تصنيف الاستفسارات الجامعية، لأنها تصنيف متعدد الفئات لنصوص قصيرة إلى متوسطة تُحدَّد فئتها بمضمونها الموضوعي لا بنبرتها العاطفية.</w:t>
       </w:r>
     </w:p>
     <w:p>
@@ -1071,7 +1071,1442 @@
           <w:szCs w:val="28"/>
           <w:rtl/>
         </w:rPr>
-        <w:t xml:space="preserve"> أداء النماذج على تجمّعات مختارة من معيار ARLUE [4].</w:t>
+        <w:t xml:space="preserve"> درجات F1 على مجموعات الاختبار في معيار ARLUE كما وردت في [4].</w:t>
+      </w:r>
+    </w:p>
+    <w:tbl>
+      <w:tblPr>
+        <w:bidiVisual/>
+        <w:tblW w:type="dxa" w:w="9300"/>
+        <w:tblBorders>
+          <w:top w:val="single" w:color="auto" w:sz="4"/>
+          <w:left w:val="single" w:color="auto" w:sz="4"/>
+          <w:bottom w:val="single" w:color="auto" w:sz="4"/>
+          <w:right w:val="single" w:color="auto" w:sz="4"/>
+          <w:insideH w:val="single" w:color="auto" w:sz="4"/>
+          <w:insideV w:val="single" w:color="auto" w:sz="4"/>
+        </w:tblBorders>
+      </w:tblPr>
+      <w:tblGrid>
+        <w:gridCol w:w="2700"/>
+        <w:gridCol w:w="1500"/>
+        <w:gridCol w:w="1500"/>
+        <w:gridCol w:w="1700"/>
+        <w:gridCol w:w="1900"/>
+      </w:tblGrid>
+      <w:tr>
+        <w:trPr>
+          <w:tblHeader/>
+        </w:trPr>
+        <w:tc>
+          <w:tcPr>
+            <w:tcW w:type="dxa" w:w="2700"/>
+            <w:tcBorders>
+              <w:top w:val="single" w:color="808080" w:sz="4"/>
+              <w:left w:val="single" w:color="808080" w:sz="4"/>
+              <w:bottom w:val="single" w:color="808080" w:sz="4"/>
+              <w:right w:val="single" w:color="808080" w:sz="4"/>
+            </w:tcBorders>
+            <w:shd w:fill="DCE6F0" w:color="auto" w:val="clear"/>
+            <w:tcMar>
+              <w:top w:type="dxa" w:w="50"/>
+              <w:left w:type="dxa" w:w="60"/>
+              <w:bottom w:type="dxa" w:w="50"/>
+              <w:right w:type="dxa" w:w="60"/>
+            </w:tcMar>
+          </w:tcPr>
+          <w:p>
+            <w:pPr>
+              <w:bidi/>
+              <w:jc w:val="center"/>
+            </w:pPr>
+            <w:r>
+              <w:rPr>
+                <w:rFonts w:ascii="Times New Roman" w:hAnsi="Times New Roman" w:cs="Times New Roman" w:eastAsia="Times New Roman"/>
+                <w:b/>
+                <w:bCs/>
+                <w:sz w:val="28"/>
+                <w:szCs w:val="28"/>
+                <w:rtl/>
+              </w:rPr>
+              <w:t xml:space="preserve">تجمّع المهام</w:t>
+            </w:r>
+          </w:p>
+        </w:tc>
+        <w:tc>
+          <w:tcPr>
+            <w:tcW w:type="dxa" w:w="1500"/>
+            <w:tcBorders>
+              <w:top w:val="single" w:color="808080" w:sz="4"/>
+              <w:left w:val="single" w:color="808080" w:sz="4"/>
+              <w:bottom w:val="single" w:color="808080" w:sz="4"/>
+              <w:right w:val="single" w:color="808080" w:sz="4"/>
+            </w:tcBorders>
+            <w:shd w:fill="DCE6F0" w:color="auto" w:val="clear"/>
+            <w:tcMar>
+              <w:top w:type="dxa" w:w="50"/>
+              <w:left w:type="dxa" w:w="60"/>
+              <w:bottom w:type="dxa" w:w="50"/>
+              <w:right w:type="dxa" w:w="60"/>
+            </w:tcMar>
+          </w:tcPr>
+          <w:p>
+            <w:pPr>
+              <w:bidi/>
+              <w:jc w:val="center"/>
+            </w:pPr>
+            <w:r>
+              <w:rPr>
+                <w:rFonts w:ascii="Times New Roman" w:hAnsi="Times New Roman" w:cs="Times New Roman" w:eastAsia="Times New Roman"/>
+                <w:b/>
+                <w:bCs/>
+                <w:sz w:val="28"/>
+                <w:szCs w:val="28"/>
+                <w:rtl/>
+              </w:rPr>
+              <w:t xml:space="preserve">AraBERT</w:t>
+            </w:r>
+          </w:p>
+        </w:tc>
+        <w:tc>
+          <w:tcPr>
+            <w:tcW w:type="dxa" w:w="1500"/>
+            <w:tcBorders>
+              <w:top w:val="single" w:color="808080" w:sz="4"/>
+              <w:left w:val="single" w:color="808080" w:sz="4"/>
+              <w:bottom w:val="single" w:color="808080" w:sz="4"/>
+              <w:right w:val="single" w:color="808080" w:sz="4"/>
+            </w:tcBorders>
+            <w:shd w:fill="DCE6F0" w:color="auto" w:val="clear"/>
+            <w:tcMar>
+              <w:top w:type="dxa" w:w="50"/>
+              <w:left w:type="dxa" w:w="60"/>
+              <w:bottom w:type="dxa" w:w="50"/>
+              <w:right w:type="dxa" w:w="60"/>
+            </w:tcMar>
+          </w:tcPr>
+          <w:p>
+            <w:pPr>
+              <w:bidi/>
+              <w:jc w:val="center"/>
+            </w:pPr>
+            <w:r>
+              <w:rPr>
+                <w:rFonts w:ascii="Times New Roman" w:hAnsi="Times New Roman" w:cs="Times New Roman" w:eastAsia="Times New Roman"/>
+                <w:b/>
+                <w:bCs/>
+                <w:sz w:val="28"/>
+                <w:szCs w:val="28"/>
+                <w:rtl/>
+              </w:rPr>
+              <w:t xml:space="preserve">ARBERT</w:t>
+            </w:r>
+          </w:p>
+        </w:tc>
+        <w:tc>
+          <w:tcPr>
+            <w:tcW w:type="dxa" w:w="1700"/>
+            <w:tcBorders>
+              <w:top w:val="single" w:color="808080" w:sz="4"/>
+              <w:left w:val="single" w:color="808080" w:sz="4"/>
+              <w:bottom w:val="single" w:color="808080" w:sz="4"/>
+              <w:right w:val="single" w:color="808080" w:sz="4"/>
+            </w:tcBorders>
+            <w:shd w:fill="DCE6F0" w:color="auto" w:val="clear"/>
+            <w:tcMar>
+              <w:top w:type="dxa" w:w="50"/>
+              <w:left w:type="dxa" w:w="60"/>
+              <w:bottom w:type="dxa" w:w="50"/>
+              <w:right w:type="dxa" w:w="60"/>
+            </w:tcMar>
+          </w:tcPr>
+          <w:p>
+            <w:pPr>
+              <w:bidi/>
+              <w:jc w:val="center"/>
+            </w:pPr>
+            <w:r>
+              <w:rPr>
+                <w:rFonts w:ascii="Times New Roman" w:hAnsi="Times New Roman" w:cs="Times New Roman" w:eastAsia="Times New Roman"/>
+                <w:b/>
+                <w:bCs/>
+                <w:sz w:val="28"/>
+                <w:szCs w:val="28"/>
+                <w:rtl/>
+              </w:rPr>
+              <w:t xml:space="preserve">MARBERT</w:t>
+            </w:r>
+          </w:p>
+        </w:tc>
+        <w:tc>
+          <w:tcPr>
+            <w:tcW w:type="dxa" w:w="1900"/>
+            <w:tcBorders>
+              <w:top w:val="single" w:color="808080" w:sz="4"/>
+              <w:left w:val="single" w:color="808080" w:sz="4"/>
+              <w:bottom w:val="single" w:color="808080" w:sz="4"/>
+              <w:right w:val="single" w:color="808080" w:sz="4"/>
+            </w:tcBorders>
+            <w:shd w:fill="DCE6F0" w:color="auto" w:val="clear"/>
+            <w:tcMar>
+              <w:top w:type="dxa" w:w="50"/>
+              <w:left w:type="dxa" w:w="60"/>
+              <w:bottom w:type="dxa" w:w="50"/>
+              <w:right w:type="dxa" w:w="60"/>
+            </w:tcMar>
+          </w:tcPr>
+          <w:p>
+            <w:pPr>
+              <w:bidi/>
+              <w:jc w:val="center"/>
+            </w:pPr>
+            <w:r>
+              <w:rPr>
+                <w:rFonts w:ascii="Times New Roman" w:hAnsi="Times New Roman" w:cs="Times New Roman" w:eastAsia="Times New Roman"/>
+                <w:b/>
+                <w:bCs/>
+                <w:sz w:val="28"/>
+                <w:szCs w:val="28"/>
+                <w:rtl/>
+              </w:rPr>
+              <w:t xml:space="preserve">MARBERTv2</w:t>
+            </w:r>
+          </w:p>
+        </w:tc>
+      </w:tr>
+      <w:tr>
+        <w:trPr>
+          <w:tblHeader w:val="false"/>
+        </w:trPr>
+        <w:tc>
+          <w:tcPr>
+            <w:tcW w:type="dxa" w:w="2700"/>
+            <w:tcBorders>
+              <w:top w:val="single" w:color="808080" w:sz="4"/>
+              <w:left w:val="single" w:color="808080" w:sz="4"/>
+              <w:bottom w:val="single" w:color="808080" w:sz="4"/>
+              <w:right w:val="single" w:color="808080" w:sz="4"/>
+            </w:tcBorders>
+            <w:tcMar>
+              <w:top w:type="dxa" w:w="50"/>
+              <w:left w:type="dxa" w:w="60"/>
+              <w:bottom w:type="dxa" w:w="50"/>
+              <w:right w:type="dxa" w:w="60"/>
+            </w:tcMar>
+          </w:tcPr>
+          <w:p>
+            <w:pPr>
+              <w:bidi/>
+              <w:jc w:val="center"/>
+            </w:pPr>
+            <w:r>
+              <w:rPr>
+                <w:rFonts w:ascii="Times New Roman" w:hAnsi="Times New Roman" w:cs="Times New Roman" w:eastAsia="Times New Roman"/>
+                <w:b w:val="false"/>
+                <w:sz w:val="28"/>
+                <w:szCs w:val="28"/>
+                <w:rtl/>
+              </w:rPr>
+              <w:t xml:space="preserve">تحليل المشاعر</w:t>
+            </w:r>
+          </w:p>
+        </w:tc>
+        <w:tc>
+          <w:tcPr>
+            <w:tcW w:type="dxa" w:w="1500"/>
+            <w:tcBorders>
+              <w:top w:val="single" w:color="808080" w:sz="4"/>
+              <w:left w:val="single" w:color="808080" w:sz="4"/>
+              <w:bottom w:val="single" w:color="808080" w:sz="4"/>
+              <w:right w:val="single" w:color="808080" w:sz="4"/>
+            </w:tcBorders>
+            <w:tcMar>
+              <w:top w:type="dxa" w:w="50"/>
+              <w:left w:type="dxa" w:w="60"/>
+              <w:bottom w:type="dxa" w:w="50"/>
+              <w:right w:type="dxa" w:w="60"/>
+            </w:tcMar>
+          </w:tcPr>
+          <w:p>
+            <w:pPr>
+              <w:bidi/>
+              <w:jc w:val="center"/>
+            </w:pPr>
+            <w:r>
+              <w:rPr>
+                <w:rFonts w:ascii="Times New Roman" w:hAnsi="Times New Roman" w:cs="Times New Roman" w:eastAsia="Times New Roman"/>
+                <w:b w:val="false"/>
+                <w:sz w:val="28"/>
+                <w:szCs w:val="28"/>
+                <w:rtl/>
+              </w:rPr>
+              <w:t xml:space="preserve">78.50</w:t>
+            </w:r>
+          </w:p>
+        </w:tc>
+        <w:tc>
+          <w:tcPr>
+            <w:tcW w:type="dxa" w:w="1500"/>
+            <w:tcBorders>
+              <w:top w:val="single" w:color="808080" w:sz="4"/>
+              <w:left w:val="single" w:color="808080" w:sz="4"/>
+              <w:bottom w:val="single" w:color="808080" w:sz="4"/>
+              <w:right w:val="single" w:color="808080" w:sz="4"/>
+            </w:tcBorders>
+            <w:tcMar>
+              <w:top w:type="dxa" w:w="50"/>
+              <w:left w:type="dxa" w:w="60"/>
+              <w:bottom w:type="dxa" w:w="50"/>
+              <w:right w:type="dxa" w:w="60"/>
+            </w:tcMar>
+          </w:tcPr>
+          <w:p>
+            <w:pPr>
+              <w:bidi/>
+              <w:jc w:val="center"/>
+            </w:pPr>
+            <w:r>
+              <w:rPr>
+                <w:rFonts w:ascii="Times New Roman" w:hAnsi="Times New Roman" w:cs="Times New Roman" w:eastAsia="Times New Roman"/>
+                <w:b w:val="false"/>
+                <w:sz w:val="28"/>
+                <w:szCs w:val="28"/>
+                <w:rtl/>
+              </w:rPr>
+              <w:t xml:space="preserve">88.50</w:t>
+            </w:r>
+          </w:p>
+        </w:tc>
+        <w:tc>
+          <w:tcPr>
+            <w:tcW w:type="dxa" w:w="1700"/>
+            <w:tcBorders>
+              <w:top w:val="single" w:color="808080" w:sz="4"/>
+              <w:left w:val="single" w:color="808080" w:sz="4"/>
+              <w:bottom w:val="single" w:color="808080" w:sz="4"/>
+              <w:right w:val="single" w:color="808080" w:sz="4"/>
+            </w:tcBorders>
+            <w:tcMar>
+              <w:top w:type="dxa" w:w="50"/>
+              <w:left w:type="dxa" w:w="60"/>
+              <w:bottom w:type="dxa" w:w="50"/>
+              <w:right w:type="dxa" w:w="60"/>
+            </w:tcMar>
+          </w:tcPr>
+          <w:p>
+            <w:pPr>
+              <w:bidi/>
+              <w:jc w:val="center"/>
+            </w:pPr>
+            <w:r>
+              <w:rPr>
+                <w:rFonts w:ascii="Times New Roman" w:hAnsi="Times New Roman" w:cs="Times New Roman" w:eastAsia="Times New Roman"/>
+                <w:b w:val="false"/>
+                <w:sz w:val="28"/>
+                <w:szCs w:val="28"/>
+                <w:rtl/>
+              </w:rPr>
+              <w:t xml:space="preserve">94.00</w:t>
+            </w:r>
+          </w:p>
+        </w:tc>
+        <w:tc>
+          <w:tcPr>
+            <w:tcW w:type="dxa" w:w="1900"/>
+            <w:tcBorders>
+              <w:top w:val="single" w:color="808080" w:sz="4"/>
+              <w:left w:val="single" w:color="808080" w:sz="4"/>
+              <w:bottom w:val="single" w:color="808080" w:sz="4"/>
+              <w:right w:val="single" w:color="808080" w:sz="4"/>
+            </w:tcBorders>
+            <w:tcMar>
+              <w:top w:type="dxa" w:w="50"/>
+              <w:left w:type="dxa" w:w="60"/>
+              <w:bottom w:type="dxa" w:w="50"/>
+              <w:right w:type="dxa" w:w="60"/>
+            </w:tcMar>
+          </w:tcPr>
+          <w:p>
+            <w:pPr>
+              <w:bidi/>
+              <w:jc w:val="center"/>
+            </w:pPr>
+            <w:r>
+              <w:rPr>
+                <w:rFonts w:ascii="Times New Roman" w:hAnsi="Times New Roman" w:cs="Times New Roman" w:eastAsia="Times New Roman"/>
+                <w:b w:val="false"/>
+                <w:sz w:val="28"/>
+                <w:szCs w:val="28"/>
+                <w:rtl/>
+              </w:rPr>
+              <w:t xml:space="preserve">94.00</w:t>
+            </w:r>
+          </w:p>
+        </w:tc>
+      </w:tr>
+      <w:tr>
+        <w:trPr>
+          <w:tblHeader w:val="false"/>
+        </w:trPr>
+        <w:tc>
+          <w:tcPr>
+            <w:tcW w:type="dxa" w:w="2700"/>
+            <w:tcBorders>
+              <w:top w:val="single" w:color="808080" w:sz="4"/>
+              <w:left w:val="single" w:color="808080" w:sz="4"/>
+              <w:bottom w:val="single" w:color="808080" w:sz="4"/>
+              <w:right w:val="single" w:color="808080" w:sz="4"/>
+            </w:tcBorders>
+            <w:tcMar>
+              <w:top w:type="dxa" w:w="50"/>
+              <w:left w:type="dxa" w:w="60"/>
+              <w:bottom w:type="dxa" w:w="50"/>
+              <w:right w:type="dxa" w:w="60"/>
+            </w:tcMar>
+          </w:tcPr>
+          <w:p>
+            <w:pPr>
+              <w:bidi/>
+              <w:jc w:val="center"/>
+            </w:pPr>
+            <w:r>
+              <w:rPr>
+                <w:rFonts w:ascii="Times New Roman" w:hAnsi="Times New Roman" w:cs="Times New Roman" w:eastAsia="Times New Roman"/>
+                <w:b w:val="false"/>
+                <w:sz w:val="28"/>
+                <w:szCs w:val="28"/>
+                <w:rtl/>
+              </w:rPr>
+              <w:t xml:space="preserve">المعاني الاجتماعية</w:t>
+            </w:r>
+          </w:p>
+        </w:tc>
+        <w:tc>
+          <w:tcPr>
+            <w:tcW w:type="dxa" w:w="1500"/>
+            <w:tcBorders>
+              <w:top w:val="single" w:color="808080" w:sz="4"/>
+              <w:left w:val="single" w:color="808080" w:sz="4"/>
+              <w:bottom w:val="single" w:color="808080" w:sz="4"/>
+              <w:right w:val="single" w:color="808080" w:sz="4"/>
+            </w:tcBorders>
+            <w:tcMar>
+              <w:top w:type="dxa" w:w="50"/>
+              <w:left w:type="dxa" w:w="60"/>
+              <w:bottom w:type="dxa" w:w="50"/>
+              <w:right w:type="dxa" w:w="60"/>
+            </w:tcMar>
+          </w:tcPr>
+          <w:p>
+            <w:pPr>
+              <w:bidi/>
+              <w:jc w:val="center"/>
+            </w:pPr>
+            <w:r>
+              <w:rPr>
+                <w:rFonts w:ascii="Times New Roman" w:hAnsi="Times New Roman" w:cs="Times New Roman" w:eastAsia="Times New Roman"/>
+                <w:b w:val="false"/>
+                <w:sz w:val="28"/>
+                <w:szCs w:val="28"/>
+                <w:rtl/>
+              </w:rPr>
+              <w:t xml:space="preserve">72.03</w:t>
+            </w:r>
+          </w:p>
+        </w:tc>
+        <w:tc>
+          <w:tcPr>
+            <w:tcW w:type="dxa" w:w="1500"/>
+            <w:tcBorders>
+              <w:top w:val="single" w:color="808080" w:sz="4"/>
+              <w:left w:val="single" w:color="808080" w:sz="4"/>
+              <w:bottom w:val="single" w:color="808080" w:sz="4"/>
+              <w:right w:val="single" w:color="808080" w:sz="4"/>
+            </w:tcBorders>
+            <w:tcMar>
+              <w:top w:type="dxa" w:w="50"/>
+              <w:left w:type="dxa" w:w="60"/>
+              <w:bottom w:type="dxa" w:w="50"/>
+              <w:right w:type="dxa" w:w="60"/>
+            </w:tcMar>
+          </w:tcPr>
+          <w:p>
+            <w:pPr>
+              <w:bidi/>
+              <w:jc w:val="center"/>
+            </w:pPr>
+            <w:r>
+              <w:rPr>
+                <w:rFonts w:ascii="Times New Roman" w:hAnsi="Times New Roman" w:cs="Times New Roman" w:eastAsia="Times New Roman"/>
+                <w:b w:val="false"/>
+                <w:sz w:val="28"/>
+                <w:szCs w:val="28"/>
+                <w:rtl/>
+              </w:rPr>
+              <w:t xml:space="preserve">74.22</w:t>
+            </w:r>
+          </w:p>
+        </w:tc>
+        <w:tc>
+          <w:tcPr>
+            <w:tcW w:type="dxa" w:w="1700"/>
+            <w:tcBorders>
+              <w:top w:val="single" w:color="808080" w:sz="4"/>
+              <w:left w:val="single" w:color="808080" w:sz="4"/>
+              <w:bottom w:val="single" w:color="808080" w:sz="4"/>
+              <w:right w:val="single" w:color="808080" w:sz="4"/>
+            </w:tcBorders>
+            <w:tcMar>
+              <w:top w:type="dxa" w:w="50"/>
+              <w:left w:type="dxa" w:w="60"/>
+              <w:bottom w:type="dxa" w:w="50"/>
+              <w:right w:type="dxa" w:w="60"/>
+            </w:tcMar>
+          </w:tcPr>
+          <w:p>
+            <w:pPr>
+              <w:bidi/>
+              <w:jc w:val="center"/>
+            </w:pPr>
+            <w:r>
+              <w:rPr>
+                <w:rFonts w:ascii="Times New Roman" w:hAnsi="Times New Roman" w:cs="Times New Roman" w:eastAsia="Times New Roman"/>
+                <w:b w:val="false"/>
+                <w:sz w:val="28"/>
+                <w:szCs w:val="28"/>
+                <w:rtl/>
+              </w:rPr>
+              <w:t xml:space="preserve">77.13</w:t>
+            </w:r>
+          </w:p>
+        </w:tc>
+        <w:tc>
+          <w:tcPr>
+            <w:tcW w:type="dxa" w:w="1900"/>
+            <w:tcBorders>
+              <w:top w:val="single" w:color="808080" w:sz="4"/>
+              <w:left w:val="single" w:color="808080" w:sz="4"/>
+              <w:bottom w:val="single" w:color="808080" w:sz="4"/>
+              <w:right w:val="single" w:color="808080" w:sz="4"/>
+            </w:tcBorders>
+            <w:tcMar>
+              <w:top w:type="dxa" w:w="50"/>
+              <w:left w:type="dxa" w:w="60"/>
+              <w:bottom w:type="dxa" w:w="50"/>
+              <w:right w:type="dxa" w:w="60"/>
+            </w:tcMar>
+          </w:tcPr>
+          <w:p>
+            <w:pPr>
+              <w:bidi/>
+              <w:jc w:val="center"/>
+            </w:pPr>
+            <w:r>
+              <w:rPr>
+                <w:rFonts w:ascii="Times New Roman" w:hAnsi="Times New Roman" w:cs="Times New Roman" w:eastAsia="Times New Roman"/>
+                <w:b w:val="false"/>
+                <w:sz w:val="28"/>
+                <w:szCs w:val="28"/>
+                <w:rtl/>
+              </w:rPr>
+              <w:t xml:space="preserve">77.13</w:t>
+            </w:r>
+          </w:p>
+        </w:tc>
+      </w:tr>
+      <w:tr>
+        <w:trPr>
+          <w:tblHeader w:val="false"/>
+        </w:trPr>
+        <w:tc>
+          <w:tcPr>
+            <w:tcW w:type="dxa" w:w="2700"/>
+            <w:tcBorders>
+              <w:top w:val="single" w:color="808080" w:sz="4"/>
+              <w:left w:val="single" w:color="808080" w:sz="4"/>
+              <w:bottom w:val="single" w:color="808080" w:sz="4"/>
+              <w:right w:val="single" w:color="808080" w:sz="4"/>
+            </w:tcBorders>
+            <w:tcMar>
+              <w:top w:type="dxa" w:w="50"/>
+              <w:left w:type="dxa" w:w="60"/>
+              <w:bottom w:type="dxa" w:w="50"/>
+              <w:right w:type="dxa" w:w="60"/>
+            </w:tcMar>
+          </w:tcPr>
+          <w:p>
+            <w:pPr>
+              <w:bidi/>
+              <w:jc w:val="center"/>
+            </w:pPr>
+            <w:r>
+              <w:rPr>
+                <w:rFonts w:ascii="Times New Roman" w:hAnsi="Times New Roman" w:cs="Times New Roman" w:eastAsia="Times New Roman"/>
+                <w:b w:val="false"/>
+                <w:sz w:val="28"/>
+                <w:szCs w:val="28"/>
+                <w:rtl/>
+              </w:rPr>
+              <w:t xml:space="preserve">تصنيف المواضيع</w:t>
+            </w:r>
+          </w:p>
+        </w:tc>
+        <w:tc>
+          <w:tcPr>
+            <w:tcW w:type="dxa" w:w="1500"/>
+            <w:tcBorders>
+              <w:top w:val="single" w:color="808080" w:sz="4"/>
+              <w:left w:val="single" w:color="808080" w:sz="4"/>
+              <w:bottom w:val="single" w:color="808080" w:sz="4"/>
+              <w:right w:val="single" w:color="808080" w:sz="4"/>
+            </w:tcBorders>
+            <w:tcMar>
+              <w:top w:type="dxa" w:w="50"/>
+              <w:left w:type="dxa" w:w="60"/>
+              <w:bottom w:type="dxa" w:w="50"/>
+              <w:right w:type="dxa" w:w="60"/>
+            </w:tcMar>
+          </w:tcPr>
+          <w:p>
+            <w:pPr>
+              <w:bidi/>
+              <w:jc w:val="center"/>
+            </w:pPr>
+            <w:r>
+              <w:rPr>
+                <w:rFonts w:ascii="Times New Roman" w:hAnsi="Times New Roman" w:cs="Times New Roman" w:eastAsia="Times New Roman"/>
+                <w:b w:val="false"/>
+                <w:sz w:val="28"/>
+                <w:szCs w:val="28"/>
+                <w:rtl/>
+              </w:rPr>
+              <w:t xml:space="preserve">92.97</w:t>
+            </w:r>
+          </w:p>
+        </w:tc>
+        <w:tc>
+          <w:tcPr>
+            <w:tcW w:type="dxa" w:w="1500"/>
+            <w:tcBorders>
+              <w:top w:val="single" w:color="808080" w:sz="4"/>
+              <w:left w:val="single" w:color="808080" w:sz="4"/>
+              <w:bottom w:val="single" w:color="808080" w:sz="4"/>
+              <w:right w:val="single" w:color="808080" w:sz="4"/>
+            </w:tcBorders>
+            <w:tcMar>
+              <w:top w:type="dxa" w:w="50"/>
+              <w:left w:type="dxa" w:w="60"/>
+              <w:bottom w:type="dxa" w:w="50"/>
+              <w:right w:type="dxa" w:w="60"/>
+            </w:tcMar>
+          </w:tcPr>
+          <w:p>
+            <w:pPr>
+              <w:bidi/>
+              <w:jc w:val="center"/>
+            </w:pPr>
+            <w:r>
+              <w:rPr>
+                <w:rFonts w:ascii="Times New Roman" w:hAnsi="Times New Roman" w:cs="Times New Roman" w:eastAsia="Times New Roman"/>
+                <w:b w:val="false"/>
+                <w:sz w:val="28"/>
+                <w:szCs w:val="28"/>
+                <w:rtl/>
+              </w:rPr>
+              <w:t xml:space="preserve">92.65</w:t>
+            </w:r>
+          </w:p>
+        </w:tc>
+        <w:tc>
+          <w:tcPr>
+            <w:tcW w:type="dxa" w:w="1700"/>
+            <w:tcBorders>
+              <w:top w:val="single" w:color="808080" w:sz="4"/>
+              <w:left w:val="single" w:color="808080" w:sz="4"/>
+              <w:bottom w:val="single" w:color="808080" w:sz="4"/>
+              <w:right w:val="single" w:color="808080" w:sz="4"/>
+            </w:tcBorders>
+            <w:tcMar>
+              <w:top w:type="dxa" w:w="50"/>
+              <w:left w:type="dxa" w:w="60"/>
+              <w:bottom w:type="dxa" w:w="50"/>
+              <w:right w:type="dxa" w:w="60"/>
+            </w:tcMar>
+          </w:tcPr>
+          <w:p>
+            <w:pPr>
+              <w:bidi/>
+              <w:jc w:val="center"/>
+            </w:pPr>
+            <w:r>
+              <w:rPr>
+                <w:rFonts w:ascii="Times New Roman" w:hAnsi="Times New Roman" w:cs="Times New Roman" w:eastAsia="Times New Roman"/>
+                <w:b w:val="false"/>
+                <w:sz w:val="28"/>
+                <w:szCs w:val="28"/>
+                <w:rtl/>
+              </w:rPr>
+              <w:t xml:space="preserve">90.97</w:t>
+            </w:r>
+          </w:p>
+        </w:tc>
+        <w:tc>
+          <w:tcPr>
+            <w:tcW w:type="dxa" w:w="1900"/>
+            <w:tcBorders>
+              <w:top w:val="single" w:color="808080" w:sz="4"/>
+              <w:left w:val="single" w:color="808080" w:sz="4"/>
+              <w:bottom w:val="single" w:color="808080" w:sz="4"/>
+              <w:right w:val="single" w:color="808080" w:sz="4"/>
+            </w:tcBorders>
+            <w:tcMar>
+              <w:top w:type="dxa" w:w="50"/>
+              <w:left w:type="dxa" w:w="60"/>
+              <w:bottom w:type="dxa" w:w="50"/>
+              <w:right w:type="dxa" w:w="60"/>
+            </w:tcMar>
+          </w:tcPr>
+          <w:p>
+            <w:pPr>
+              <w:bidi/>
+              <w:jc w:val="center"/>
+            </w:pPr>
+            <w:r>
+              <w:rPr>
+                <w:rFonts w:ascii="Times New Roman" w:hAnsi="Times New Roman" w:cs="Times New Roman" w:eastAsia="Times New Roman"/>
+                <w:b w:val="false"/>
+                <w:sz w:val="28"/>
+                <w:szCs w:val="28"/>
+                <w:rtl/>
+              </w:rPr>
+              <w:t xml:space="preserve">91.54</w:t>
+            </w:r>
+          </w:p>
+        </w:tc>
+      </w:tr>
+      <w:tr>
+        <w:trPr>
+          <w:tblHeader w:val="false"/>
+        </w:trPr>
+        <w:tc>
+          <w:tcPr>
+            <w:tcW w:type="dxa" w:w="2700"/>
+            <w:tcBorders>
+              <w:top w:val="single" w:color="808080" w:sz="4"/>
+              <w:left w:val="single" w:color="808080" w:sz="4"/>
+              <w:bottom w:val="single" w:color="808080" w:sz="4"/>
+              <w:right w:val="single" w:color="808080" w:sz="4"/>
+            </w:tcBorders>
+            <w:tcMar>
+              <w:top w:type="dxa" w:w="50"/>
+              <w:left w:type="dxa" w:w="60"/>
+              <w:bottom w:type="dxa" w:w="50"/>
+              <w:right w:type="dxa" w:w="60"/>
+            </w:tcMar>
+          </w:tcPr>
+          <w:p>
+            <w:pPr>
+              <w:bidi/>
+              <w:jc w:val="center"/>
+            </w:pPr>
+            <w:r>
+              <w:rPr>
+                <w:rFonts w:ascii="Times New Roman" w:hAnsi="Times New Roman" w:cs="Times New Roman" w:eastAsia="Times New Roman"/>
+                <w:b w:val="false"/>
+                <w:sz w:val="28"/>
+                <w:szCs w:val="28"/>
+                <w:rtl/>
+              </w:rPr>
+              <w:t xml:space="preserve">تمييز اللهجات (المستوى الإقليمي)</w:t>
+            </w:r>
+          </w:p>
+        </w:tc>
+        <w:tc>
+          <w:tcPr>
+            <w:tcW w:type="dxa" w:w="1500"/>
+            <w:tcBorders>
+              <w:top w:val="single" w:color="808080" w:sz="4"/>
+              <w:left w:val="single" w:color="808080" w:sz="4"/>
+              <w:bottom w:val="single" w:color="808080" w:sz="4"/>
+              <w:right w:val="single" w:color="808080" w:sz="4"/>
+            </w:tcBorders>
+            <w:tcMar>
+              <w:top w:type="dxa" w:w="50"/>
+              <w:left w:type="dxa" w:w="60"/>
+              <w:bottom w:type="dxa" w:w="50"/>
+              <w:right w:type="dxa" w:w="60"/>
+            </w:tcMar>
+          </w:tcPr>
+          <w:p>
+            <w:pPr>
+              <w:bidi/>
+              <w:jc w:val="center"/>
+            </w:pPr>
+            <w:r>
+              <w:rPr>
+                <w:rFonts w:ascii="Times New Roman" w:hAnsi="Times New Roman" w:cs="Times New Roman" w:eastAsia="Times New Roman"/>
+                <w:b w:val="false"/>
+                <w:sz w:val="28"/>
+                <w:szCs w:val="28"/>
+                <w:rtl/>
+              </w:rPr>
+              <w:t xml:space="preserve">86.92</w:t>
+            </w:r>
+          </w:p>
+        </w:tc>
+        <w:tc>
+          <w:tcPr>
+            <w:tcW w:type="dxa" w:w="1500"/>
+            <w:tcBorders>
+              <w:top w:val="single" w:color="808080" w:sz="4"/>
+              <w:left w:val="single" w:color="808080" w:sz="4"/>
+              <w:bottom w:val="single" w:color="808080" w:sz="4"/>
+              <w:right w:val="single" w:color="808080" w:sz="4"/>
+            </w:tcBorders>
+            <w:tcMar>
+              <w:top w:type="dxa" w:w="50"/>
+              <w:left w:type="dxa" w:w="60"/>
+              <w:bottom w:type="dxa" w:w="50"/>
+              <w:right w:type="dxa" w:w="60"/>
+            </w:tcMar>
+          </w:tcPr>
+          <w:p>
+            <w:pPr>
+              <w:bidi/>
+              <w:jc w:val="center"/>
+            </w:pPr>
+            <w:r>
+              <w:rPr>
+                <w:rFonts w:ascii="Times New Roman" w:hAnsi="Times New Roman" w:cs="Times New Roman" w:eastAsia="Times New Roman"/>
+                <w:b w:val="false"/>
+                <w:sz w:val="28"/>
+                <w:szCs w:val="28"/>
+                <w:rtl/>
+              </w:rPr>
+              <w:t xml:space="preserve">88.49</w:t>
+            </w:r>
+          </w:p>
+        </w:tc>
+        <w:tc>
+          <w:tcPr>
+            <w:tcW w:type="dxa" w:w="1700"/>
+            <w:tcBorders>
+              <w:top w:val="single" w:color="808080" w:sz="4"/>
+              <w:left w:val="single" w:color="808080" w:sz="4"/>
+              <w:bottom w:val="single" w:color="808080" w:sz="4"/>
+              <w:right w:val="single" w:color="808080" w:sz="4"/>
+            </w:tcBorders>
+            <w:tcMar>
+              <w:top w:type="dxa" w:w="50"/>
+              <w:left w:type="dxa" w:w="60"/>
+              <w:bottom w:type="dxa" w:w="50"/>
+              <w:right w:type="dxa" w:w="60"/>
+            </w:tcMar>
+          </w:tcPr>
+          <w:p>
+            <w:pPr>
+              <w:bidi/>
+              <w:jc w:val="center"/>
+            </w:pPr>
+            <w:r>
+              <w:rPr>
+                <w:rFonts w:ascii="Times New Roman" w:hAnsi="Times New Roman" w:cs="Times New Roman" w:eastAsia="Times New Roman"/>
+                <w:b w:val="false"/>
+                <w:sz w:val="28"/>
+                <w:szCs w:val="28"/>
+                <w:rtl/>
+              </w:rPr>
+              <w:t xml:space="preserve">90.65</w:t>
+            </w:r>
+          </w:p>
+        </w:tc>
+        <w:tc>
+          <w:tcPr>
+            <w:tcW w:type="dxa" w:w="1900"/>
+            <w:tcBorders>
+              <w:top w:val="single" w:color="808080" w:sz="4"/>
+              <w:left w:val="single" w:color="808080" w:sz="4"/>
+              <w:bottom w:val="single" w:color="808080" w:sz="4"/>
+              <w:right w:val="single" w:color="808080" w:sz="4"/>
+            </w:tcBorders>
+            <w:tcMar>
+              <w:top w:type="dxa" w:w="50"/>
+              <w:left w:type="dxa" w:w="60"/>
+              <w:bottom w:type="dxa" w:w="50"/>
+              <w:right w:type="dxa" w:w="60"/>
+            </w:tcMar>
+          </w:tcPr>
+          <w:p>
+            <w:pPr>
+              <w:bidi/>
+              <w:jc w:val="center"/>
+            </w:pPr>
+            <w:r>
+              <w:rPr>
+                <w:rFonts w:ascii="Times New Roman" w:hAnsi="Times New Roman" w:cs="Times New Roman" w:eastAsia="Times New Roman"/>
+                <w:b w:val="false"/>
+                <w:sz w:val="28"/>
+                <w:szCs w:val="28"/>
+                <w:rtl/>
+              </w:rPr>
+              <w:t xml:space="preserve">89.67</w:t>
+            </w:r>
+          </w:p>
+        </w:tc>
+      </w:tr>
+      <w:tr>
+        <w:trPr>
+          <w:tblHeader w:val="false"/>
+        </w:trPr>
+        <w:tc>
+          <w:tcPr>
+            <w:tcW w:type="dxa" w:w="2700"/>
+            <w:tcBorders>
+              <w:top w:val="single" w:color="808080" w:sz="4"/>
+              <w:left w:val="single" w:color="808080" w:sz="4"/>
+              <w:bottom w:val="single" w:color="808080" w:sz="4"/>
+              <w:right w:val="single" w:color="808080" w:sz="4"/>
+            </w:tcBorders>
+            <w:tcMar>
+              <w:top w:type="dxa" w:w="50"/>
+              <w:left w:type="dxa" w:w="60"/>
+              <w:bottom w:type="dxa" w:w="50"/>
+              <w:right w:type="dxa" w:w="60"/>
+            </w:tcMar>
+          </w:tcPr>
+          <w:p>
+            <w:pPr>
+              <w:bidi/>
+              <w:jc w:val="center"/>
+            </w:pPr>
+            <w:r>
+              <w:rPr>
+                <w:rFonts w:ascii="Times New Roman" w:hAnsi="Times New Roman" w:cs="Times New Roman" w:eastAsia="Times New Roman"/>
+                <w:b w:val="false"/>
+                <w:sz w:val="28"/>
+                <w:szCs w:val="28"/>
+                <w:rtl/>
+              </w:rPr>
+              <w:t xml:space="preserve">التعرف على الكيانات المسماة</w:t>
+            </w:r>
+          </w:p>
+        </w:tc>
+        <w:tc>
+          <w:tcPr>
+            <w:tcW w:type="dxa" w:w="1500"/>
+            <w:tcBorders>
+              <w:top w:val="single" w:color="808080" w:sz="4"/>
+              <w:left w:val="single" w:color="808080" w:sz="4"/>
+              <w:bottom w:val="single" w:color="808080" w:sz="4"/>
+              <w:right w:val="single" w:color="808080" w:sz="4"/>
+            </w:tcBorders>
+            <w:tcMar>
+              <w:top w:type="dxa" w:w="50"/>
+              <w:left w:type="dxa" w:w="60"/>
+              <w:bottom w:type="dxa" w:w="50"/>
+              <w:right w:type="dxa" w:w="60"/>
+            </w:tcMar>
+          </w:tcPr>
+          <w:p>
+            <w:pPr>
+              <w:bidi/>
+              <w:jc w:val="center"/>
+            </w:pPr>
+            <w:r>
+              <w:rPr>
+                <w:rFonts w:ascii="Times New Roman" w:hAnsi="Times New Roman" w:cs="Times New Roman" w:eastAsia="Times New Roman"/>
+                <w:b w:val="false"/>
+                <w:sz w:val="28"/>
+                <w:szCs w:val="28"/>
+                <w:rtl/>
+              </w:rPr>
+              <w:t xml:space="preserve">76.19</w:t>
+            </w:r>
+          </w:p>
+        </w:tc>
+        <w:tc>
+          <w:tcPr>
+            <w:tcW w:type="dxa" w:w="1500"/>
+            <w:tcBorders>
+              <w:top w:val="single" w:color="808080" w:sz="4"/>
+              <w:left w:val="single" w:color="808080" w:sz="4"/>
+              <w:bottom w:val="single" w:color="808080" w:sz="4"/>
+              <w:right w:val="single" w:color="808080" w:sz="4"/>
+            </w:tcBorders>
+            <w:tcMar>
+              <w:top w:type="dxa" w:w="50"/>
+              <w:left w:type="dxa" w:w="60"/>
+              <w:bottom w:type="dxa" w:w="50"/>
+              <w:right w:type="dxa" w:w="60"/>
+            </w:tcMar>
+          </w:tcPr>
+          <w:p>
+            <w:pPr>
+              <w:bidi/>
+              <w:jc w:val="center"/>
+            </w:pPr>
+            <w:r>
+              <w:rPr>
+                <w:rFonts w:ascii="Times New Roman" w:hAnsi="Times New Roman" w:cs="Times New Roman" w:eastAsia="Times New Roman"/>
+                <w:b w:val="false"/>
+                <w:sz w:val="28"/>
+                <w:szCs w:val="28"/>
+                <w:rtl/>
+              </w:rPr>
+              <w:t xml:space="preserve">76.83</w:t>
+            </w:r>
+          </w:p>
+        </w:tc>
+        <w:tc>
+          <w:tcPr>
+            <w:tcW w:type="dxa" w:w="1700"/>
+            <w:tcBorders>
+              <w:top w:val="single" w:color="808080" w:sz="4"/>
+              <w:left w:val="single" w:color="808080" w:sz="4"/>
+              <w:bottom w:val="single" w:color="808080" w:sz="4"/>
+              <w:right w:val="single" w:color="808080" w:sz="4"/>
+            </w:tcBorders>
+            <w:tcMar>
+              <w:top w:type="dxa" w:w="50"/>
+              <w:left w:type="dxa" w:w="60"/>
+              <w:bottom w:type="dxa" w:w="50"/>
+              <w:right w:type="dxa" w:w="60"/>
+            </w:tcMar>
+          </w:tcPr>
+          <w:p>
+            <w:pPr>
+              <w:bidi/>
+              <w:jc w:val="center"/>
+            </w:pPr>
+            <w:r>
+              <w:rPr>
+                <w:rFonts w:ascii="Times New Roman" w:hAnsi="Times New Roman" w:cs="Times New Roman" w:eastAsia="Times New Roman"/>
+                <w:b w:val="false"/>
+                <w:sz w:val="28"/>
+                <w:szCs w:val="28"/>
+                <w:rtl/>
+              </w:rPr>
+              <w:t xml:space="preserve">71.93</w:t>
+            </w:r>
+          </w:p>
+        </w:tc>
+        <w:tc>
+          <w:tcPr>
+            <w:tcW w:type="dxa" w:w="1900"/>
+            <w:tcBorders>
+              <w:top w:val="single" w:color="808080" w:sz="4"/>
+              <w:left w:val="single" w:color="808080" w:sz="4"/>
+              <w:bottom w:val="single" w:color="808080" w:sz="4"/>
+              <w:right w:val="single" w:color="808080" w:sz="4"/>
+            </w:tcBorders>
+            <w:tcMar>
+              <w:top w:type="dxa" w:w="50"/>
+              <w:left w:type="dxa" w:w="60"/>
+              <w:bottom w:type="dxa" w:w="50"/>
+              <w:right w:type="dxa" w:w="60"/>
+            </w:tcMar>
+          </w:tcPr>
+          <w:p>
+            <w:pPr>
+              <w:bidi/>
+              <w:jc w:val="center"/>
+            </w:pPr>
+            <w:r>
+              <w:rPr>
+                <w:rFonts w:ascii="Times New Roman" w:hAnsi="Times New Roman" w:cs="Times New Roman" w:eastAsia="Times New Roman"/>
+                <w:b w:val="false"/>
+                <w:sz w:val="28"/>
+                <w:szCs w:val="28"/>
+                <w:rtl/>
+              </w:rPr>
+              <w:t xml:space="preserve">74.70</w:t>
+            </w:r>
+          </w:p>
+        </w:tc>
+      </w:tr>
+      <w:tr>
+        <w:trPr>
+          <w:tblHeader w:val="false"/>
+        </w:trPr>
+        <w:tc>
+          <w:tcPr>
+            <w:tcW w:type="dxa" w:w="2700"/>
+            <w:tcBorders>
+              <w:top w:val="single" w:color="808080" w:sz="4"/>
+              <w:left w:val="single" w:color="808080" w:sz="4"/>
+              <w:bottom w:val="single" w:color="808080" w:sz="4"/>
+              <w:right w:val="single" w:color="808080" w:sz="4"/>
+            </w:tcBorders>
+            <w:tcMar>
+              <w:top w:type="dxa" w:w="50"/>
+              <w:left w:type="dxa" w:w="60"/>
+              <w:bottom w:type="dxa" w:w="50"/>
+              <w:right w:type="dxa" w:w="60"/>
+            </w:tcMar>
+          </w:tcPr>
+          <w:p>
+            <w:pPr>
+              <w:bidi/>
+              <w:jc w:val="center"/>
+            </w:pPr>
+            <w:r>
+              <w:rPr>
+                <w:rFonts w:ascii="Times New Roman" w:hAnsi="Times New Roman" w:cs="Times New Roman" w:eastAsia="Times New Roman"/>
+                <w:b w:val="false"/>
+                <w:sz w:val="28"/>
+                <w:szCs w:val="28"/>
+                <w:rtl/>
+              </w:rPr>
+              <w:t xml:space="preserve">الإجابة على الأسئلة</w:t>
+            </w:r>
+          </w:p>
+        </w:tc>
+        <w:tc>
+          <w:tcPr>
+            <w:tcW w:type="dxa" w:w="1500"/>
+            <w:tcBorders>
+              <w:top w:val="single" w:color="808080" w:sz="4"/>
+              <w:left w:val="single" w:color="808080" w:sz="4"/>
+              <w:bottom w:val="single" w:color="808080" w:sz="4"/>
+              <w:right w:val="single" w:color="808080" w:sz="4"/>
+            </w:tcBorders>
+            <w:tcMar>
+              <w:top w:type="dxa" w:w="50"/>
+              <w:left w:type="dxa" w:w="60"/>
+              <w:bottom w:type="dxa" w:w="50"/>
+              <w:right w:type="dxa" w:w="60"/>
+            </w:tcMar>
+          </w:tcPr>
+          <w:p>
+            <w:pPr>
+              <w:bidi/>
+              <w:jc w:val="center"/>
+            </w:pPr>
+            <w:r>
+              <w:rPr>
+                <w:rFonts w:ascii="Times New Roman" w:hAnsi="Times New Roman" w:cs="Times New Roman" w:eastAsia="Times New Roman"/>
+                <w:b w:val="false"/>
+                <w:sz w:val="28"/>
+                <w:szCs w:val="28"/>
+                <w:rtl/>
+              </w:rPr>
+              <w:t xml:space="preserve">58.10</w:t>
+            </w:r>
+          </w:p>
+        </w:tc>
+        <w:tc>
+          <w:tcPr>
+            <w:tcW w:type="dxa" w:w="1500"/>
+            <w:tcBorders>
+              <w:top w:val="single" w:color="808080" w:sz="4"/>
+              <w:left w:val="single" w:color="808080" w:sz="4"/>
+              <w:bottom w:val="single" w:color="808080" w:sz="4"/>
+              <w:right w:val="single" w:color="808080" w:sz="4"/>
+            </w:tcBorders>
+            <w:tcMar>
+              <w:top w:type="dxa" w:w="50"/>
+              <w:left w:type="dxa" w:w="60"/>
+              <w:bottom w:type="dxa" w:w="50"/>
+              <w:right w:type="dxa" w:w="60"/>
+            </w:tcMar>
+          </w:tcPr>
+          <w:p>
+            <w:pPr>
+              <w:bidi/>
+              <w:jc w:val="center"/>
+            </w:pPr>
+            <w:r>
+              <w:rPr>
+                <w:rFonts w:ascii="Times New Roman" w:hAnsi="Times New Roman" w:cs="Times New Roman" w:eastAsia="Times New Roman"/>
+                <w:b w:val="false"/>
+                <w:sz w:val="28"/>
+                <w:szCs w:val="28"/>
+                <w:rtl/>
+              </w:rPr>
+              <w:t xml:space="preserve">57.81</w:t>
+            </w:r>
+          </w:p>
+        </w:tc>
+        <w:tc>
+          <w:tcPr>
+            <w:tcW w:type="dxa" w:w="1700"/>
+            <w:tcBorders>
+              <w:top w:val="single" w:color="808080" w:sz="4"/>
+              <w:left w:val="single" w:color="808080" w:sz="4"/>
+              <w:bottom w:val="single" w:color="808080" w:sz="4"/>
+              <w:right w:val="single" w:color="808080" w:sz="4"/>
+            </w:tcBorders>
+            <w:tcMar>
+              <w:top w:type="dxa" w:w="50"/>
+              <w:left w:type="dxa" w:w="60"/>
+              <w:bottom w:type="dxa" w:w="50"/>
+              <w:right w:type="dxa" w:w="60"/>
+            </w:tcMar>
+          </w:tcPr>
+          <w:p>
+            <w:pPr>
+              <w:bidi/>
+              <w:jc w:val="center"/>
+            </w:pPr>
+            <w:r>
+              <w:rPr>
+                <w:rFonts w:ascii="Times New Roman" w:hAnsi="Times New Roman" w:cs="Times New Roman" w:eastAsia="Times New Roman"/>
+                <w:b w:val="false"/>
+                <w:sz w:val="28"/>
+                <w:szCs w:val="28"/>
+                <w:rtl/>
+              </w:rPr>
+              <w:t xml:space="preserve">48.83</w:t>
+            </w:r>
+          </w:p>
+        </w:tc>
+        <w:tc>
+          <w:tcPr>
+            <w:tcW w:type="dxa" w:w="1900"/>
+            <w:tcBorders>
+              <w:top w:val="single" w:color="808080" w:sz="4"/>
+              <w:left w:val="single" w:color="808080" w:sz="4"/>
+              <w:bottom w:val="single" w:color="808080" w:sz="4"/>
+              <w:right w:val="single" w:color="808080" w:sz="4"/>
+            </w:tcBorders>
+            <w:tcMar>
+              <w:top w:type="dxa" w:w="50"/>
+              <w:left w:type="dxa" w:w="60"/>
+              <w:bottom w:type="dxa" w:w="50"/>
+              <w:right w:type="dxa" w:w="60"/>
+            </w:tcMar>
+          </w:tcPr>
+          <w:p>
+            <w:pPr>
+              <w:bidi/>
+              <w:jc w:val="center"/>
+            </w:pPr>
+            <w:r>
+              <w:rPr>
+                <w:rFonts w:ascii="Times New Roman" w:hAnsi="Times New Roman" w:cs="Times New Roman" w:eastAsia="Times New Roman"/>
+                <w:b w:val="false"/>
+                <w:sz w:val="28"/>
+                <w:szCs w:val="28"/>
+                <w:rtl/>
+              </w:rPr>
+              <w:t xml:space="preserve">62.09</w:t>
+            </w:r>
+          </w:p>
+        </w:tc>
+      </w:tr>
+      <w:tr>
+        <w:trPr>
+          <w:tblHeader w:val="false"/>
+        </w:trPr>
+        <w:tc>
+          <w:tcPr>
+            <w:tcW w:type="dxa" w:w="2700"/>
+            <w:tcBorders>
+              <w:top w:val="single" w:color="808080" w:sz="4"/>
+              <w:left w:val="single" w:color="808080" w:sz="4"/>
+              <w:bottom w:val="single" w:color="808080" w:sz="4"/>
+              <w:right w:val="single" w:color="808080" w:sz="4"/>
+            </w:tcBorders>
+            <w:tcMar>
+              <w:top w:type="dxa" w:w="50"/>
+              <w:left w:type="dxa" w:w="60"/>
+              <w:bottom w:type="dxa" w:w="50"/>
+              <w:right w:type="dxa" w:w="60"/>
+            </w:tcMar>
+          </w:tcPr>
+          <w:p>
+            <w:pPr>
+              <w:bidi/>
+              <w:jc w:val="center"/>
+            </w:pPr>
+            <w:r>
+              <w:rPr>
+                <w:rFonts w:ascii="Times New Roman" w:hAnsi="Times New Roman" w:cs="Times New Roman" w:eastAsia="Times New Roman"/>
+                <w:b w:val="false"/>
+                <w:sz w:val="28"/>
+                <w:szCs w:val="28"/>
+                <w:rtl/>
+              </w:rPr>
+              <w:t xml:space="preserve">الدرجة الكلية ARLUE</w:t>
+            </w:r>
+          </w:p>
+        </w:tc>
+        <w:tc>
+          <w:tcPr>
+            <w:tcW w:type="dxa" w:w="1500"/>
+            <w:tcBorders>
+              <w:top w:val="single" w:color="808080" w:sz="4"/>
+              <w:left w:val="single" w:color="808080" w:sz="4"/>
+              <w:bottom w:val="single" w:color="808080" w:sz="4"/>
+              <w:right w:val="single" w:color="808080" w:sz="4"/>
+            </w:tcBorders>
+            <w:tcMar>
+              <w:top w:type="dxa" w:w="50"/>
+              <w:left w:type="dxa" w:w="60"/>
+              <w:bottom w:type="dxa" w:w="50"/>
+              <w:right w:type="dxa" w:w="60"/>
+            </w:tcMar>
+          </w:tcPr>
+          <w:p>
+            <w:pPr>
+              <w:bidi/>
+              <w:jc w:val="center"/>
+            </w:pPr>
+            <w:r>
+              <w:rPr>
+                <w:rFonts w:ascii="Times New Roman" w:hAnsi="Times New Roman" w:cs="Times New Roman" w:eastAsia="Times New Roman"/>
+                <w:b w:val="false"/>
+                <w:sz w:val="28"/>
+                <w:szCs w:val="28"/>
+                <w:rtl/>
+              </w:rPr>
+              <w:t xml:space="preserve">73.91</w:t>
+            </w:r>
+          </w:p>
+        </w:tc>
+        <w:tc>
+          <w:tcPr>
+            <w:tcW w:type="dxa" w:w="1500"/>
+            <w:tcBorders>
+              <w:top w:val="single" w:color="808080" w:sz="4"/>
+              <w:left w:val="single" w:color="808080" w:sz="4"/>
+              <w:bottom w:val="single" w:color="808080" w:sz="4"/>
+              <w:right w:val="single" w:color="808080" w:sz="4"/>
+            </w:tcBorders>
+            <w:tcMar>
+              <w:top w:type="dxa" w:w="50"/>
+              <w:left w:type="dxa" w:w="60"/>
+              <w:bottom w:type="dxa" w:w="50"/>
+              <w:right w:type="dxa" w:w="60"/>
+            </w:tcMar>
+          </w:tcPr>
+          <w:p>
+            <w:pPr>
+              <w:bidi/>
+              <w:jc w:val="center"/>
+            </w:pPr>
+            <w:r>
+              <w:rPr>
+                <w:rFonts w:ascii="Times New Roman" w:hAnsi="Times New Roman" w:cs="Times New Roman" w:eastAsia="Times New Roman"/>
+                <w:b w:val="false"/>
+                <w:sz w:val="28"/>
+                <w:szCs w:val="28"/>
+                <w:rtl/>
+              </w:rPr>
+              <w:t xml:space="preserve">76.07</w:t>
+            </w:r>
+          </w:p>
+        </w:tc>
+        <w:tc>
+          <w:tcPr>
+            <w:tcW w:type="dxa" w:w="1700"/>
+            <w:tcBorders>
+              <w:top w:val="single" w:color="808080" w:sz="4"/>
+              <w:left w:val="single" w:color="808080" w:sz="4"/>
+              <w:bottom w:val="single" w:color="808080" w:sz="4"/>
+              <w:right w:val="single" w:color="808080" w:sz="4"/>
+            </w:tcBorders>
+            <w:tcMar>
+              <w:top w:type="dxa" w:w="50"/>
+              <w:left w:type="dxa" w:w="60"/>
+              <w:bottom w:type="dxa" w:w="50"/>
+              <w:right w:type="dxa" w:w="60"/>
+            </w:tcMar>
+          </w:tcPr>
+          <w:p>
+            <w:pPr>
+              <w:bidi/>
+              <w:jc w:val="center"/>
+            </w:pPr>
+            <w:r>
+              <w:rPr>
+                <w:rFonts w:ascii="Times New Roman" w:hAnsi="Times New Roman" w:cs="Times New Roman" w:eastAsia="Times New Roman"/>
+                <w:b w:val="false"/>
+                <w:sz w:val="28"/>
+                <w:szCs w:val="28"/>
+                <w:rtl/>
+              </w:rPr>
+              <w:t xml:space="preserve">75.99</w:t>
+            </w:r>
+          </w:p>
+        </w:tc>
+        <w:tc>
+          <w:tcPr>
+            <w:tcW w:type="dxa" w:w="1900"/>
+            <w:tcBorders>
+              <w:top w:val="single" w:color="808080" w:sz="4"/>
+              <w:left w:val="single" w:color="808080" w:sz="4"/>
+              <w:bottom w:val="single" w:color="808080" w:sz="4"/>
+              <w:right w:val="single" w:color="808080" w:sz="4"/>
+            </w:tcBorders>
+            <w:tcMar>
+              <w:top w:type="dxa" w:w="50"/>
+              <w:left w:type="dxa" w:w="60"/>
+              <w:bottom w:type="dxa" w:w="50"/>
+              <w:right w:type="dxa" w:w="60"/>
+            </w:tcMar>
+          </w:tcPr>
+          <w:p>
+            <w:pPr>
+              <w:bidi/>
+              <w:jc w:val="center"/>
+            </w:pPr>
+            <w:r>
+              <w:rPr>
+                <w:rFonts w:ascii="Times New Roman" w:hAnsi="Times New Roman" w:cs="Times New Roman" w:eastAsia="Times New Roman"/>
+                <w:b w:val="false"/>
+                <w:sz w:val="28"/>
+                <w:szCs w:val="28"/>
+                <w:rtl/>
+              </w:rPr>
+              <w:t xml:space="preserve">77.40</w:t>
+            </w:r>
+          </w:p>
+        </w:tc>
+      </w:tr>
+    </w:tbl>
+    <w:p>
+      <w:pPr>
+        <w:bidi/>
+        <w:spacing w:after="120" w:line="300"/>
+        <w:jc w:val="both"/>
+      </w:pPr>
+      <w:r>
+        <w:rPr>
+          <w:rFonts w:ascii="Times New Roman" w:hAnsi="Times New Roman" w:cs="Times New Roman" w:eastAsia="Times New Roman"/>
+          <w:sz w:val="28"/>
+          <w:szCs w:val="28"/>
+          <w:rtl/>
+        </w:rPr>
+        <w:t xml:space="preserve">غير أن النتائج داخل تجمّع تصنيف المواضيع نفسه لا تتجه لصالح نموذج واحد (الجدول 3): يتفوق AraBERT على مجموعة ANT بالنص الكامل (88.17)، بينما يتفوق ARBERT على Khaleej وOSAC بفوارق ضيقة، ويسجّل MARBERT الأداء الأدنى في معظم الحالات [4]. ويعزو مطورو MARBERT ذلك إلى أن التغريدات نادراً ما تحمل تفصيلاً موضوعياً [4]. ويؤكد هذا التباين أن الأفضلية مشروطة بخصائص كل مجموعة بيانات، ما يبرر إجراء مقارنة مستقلة على بيانات الاستفسارات الجامعية.</w:t>
+      </w:r>
+    </w:p>
+    <w:p>
+      <w:pPr>
+        <w:bidi/>
+        <w:spacing w:before="60" w:after="200"/>
+        <w:jc w:val="center"/>
+      </w:pPr>
+      <w:r>
+        <w:rPr>
+          <w:rFonts w:ascii="Times New Roman" w:hAnsi="Times New Roman" w:cs="Times New Roman" w:eastAsia="Times New Roman"/>
+          <w:b/>
+          <w:bCs/>
+          <w:sz w:val="28"/>
+          <w:szCs w:val="28"/>
+          <w:rtl/>
+        </w:rPr>
+        <w:t xml:space="preserve">الجدول 3.</w:t>
+      </w:r>
+      <w:r>
+        <w:rPr>
+          <w:rFonts w:ascii="Times New Roman" w:hAnsi="Times New Roman" w:cs="Times New Roman" w:eastAsia="Times New Roman"/>
+          <w:b w:val="false"/>
+          <w:sz w:val="28"/>
+          <w:szCs w:val="28"/>
+          <w:rtl/>
+        </w:rPr>
+        <w:t xml:space="preserve"> أداء النماذج في تصنيف المواضيع عبر مجموعات بيانات مختلفة [4].</w:t>
       </w:r>
     </w:p>
     <w:tbl>
@@ -1128,7 +2563,7 @@
                 <w:szCs w:val="28"/>
                 <w:rtl/>
               </w:rPr>
-              <w:t xml:space="preserve">تجمّع المهام</w:t>
+              <w:t xml:space="preserve">مجموعة البيانات (عدد الفئات)</w:t>
             </w:r>
           </w:p>
         </w:tc>
@@ -1163,7 +2598,7 @@
                 <w:szCs w:val="28"/>
                 <w:rtl/>
               </w:rPr>
-              <w:t xml:space="preserve">AraBERTv2</w:t>
+              <w:t xml:space="preserve">AraBERT</w:t>
             </w:r>
           </w:p>
         </w:tc>
@@ -1198,7 +2633,7 @@
                 <w:szCs w:val="28"/>
                 <w:rtl/>
               </w:rPr>
-              <w:t xml:space="preserve">ARBERTv2</w:t>
+              <w:t xml:space="preserve">ARBERT</w:t>
             </w:r>
           </w:p>
         </w:tc>
@@ -1233,1175 +2668,7 @@
                 <w:szCs w:val="28"/>
                 <w:rtl/>
               </w:rPr>
-              <w:t xml:space="preserve">MARBERTv2</w:t>
-            </w:r>
-          </w:p>
-        </w:tc>
-      </w:tr>
-      <w:tr>
-        <w:trPr>
-          <w:tblHeader w:val="false"/>
-        </w:trPr>
-        <w:tc>
-          <w:tcPr>
-            <w:tcW w:type="dxa" w:w="3300"/>
-            <w:tcBorders>
-              <w:top w:val="single" w:color="808080" w:sz="4"/>
-              <w:left w:val="single" w:color="808080" w:sz="4"/>
-              <w:bottom w:val="single" w:color="808080" w:sz="4"/>
-              <w:right w:val="single" w:color="808080" w:sz="4"/>
-            </w:tcBorders>
-            <w:tcMar>
-              <w:top w:type="dxa" w:w="50"/>
-              <w:left w:type="dxa" w:w="60"/>
-              <w:bottom w:type="dxa" w:w="50"/>
-              <w:right w:type="dxa" w:w="60"/>
-            </w:tcMar>
-          </w:tcPr>
-          <w:p>
-            <w:pPr>
-              <w:bidi/>
-              <w:jc w:val="center"/>
-            </w:pPr>
-            <w:r>
-              <w:rPr>
-                <w:rFonts w:ascii="Times New Roman" w:hAnsi="Times New Roman" w:cs="Times New Roman" w:eastAsia="Times New Roman"/>
-                <w:b w:val="false"/>
-                <w:sz w:val="28"/>
-                <w:szCs w:val="28"/>
-                <w:rtl/>
-              </w:rPr>
-              <w:t xml:space="preserve">تحليل المشاعر (F1)</w:t>
-            </w:r>
-          </w:p>
-        </w:tc>
-        <w:tc>
-          <w:tcPr>
-            <w:tcW w:type="dxa" w:w="1900"/>
-            <w:tcBorders>
-              <w:top w:val="single" w:color="808080" w:sz="4"/>
-              <w:left w:val="single" w:color="808080" w:sz="4"/>
-              <w:bottom w:val="single" w:color="808080" w:sz="4"/>
-              <w:right w:val="single" w:color="808080" w:sz="4"/>
-            </w:tcBorders>
-            <w:tcMar>
-              <w:top w:type="dxa" w:w="50"/>
-              <w:left w:type="dxa" w:w="60"/>
-              <w:bottom w:type="dxa" w:w="50"/>
-              <w:right w:type="dxa" w:w="60"/>
-            </w:tcMar>
-          </w:tcPr>
-          <w:p>
-            <w:pPr>
-              <w:bidi/>
-              <w:jc w:val="center"/>
-            </w:pPr>
-            <w:r>
-              <w:rPr>
-                <w:rFonts w:ascii="Times New Roman" w:hAnsi="Times New Roman" w:cs="Times New Roman" w:eastAsia="Times New Roman"/>
-                <w:b w:val="false"/>
-                <w:sz w:val="28"/>
-                <w:szCs w:val="28"/>
-                <w:rtl/>
-              </w:rPr>
-              <w:t xml:space="preserve">78.26</w:t>
-            </w:r>
-          </w:p>
-        </w:tc>
-        <w:tc>
-          <w:tcPr>
-            <w:tcW w:type="dxa" w:w="1900"/>
-            <w:tcBorders>
-              <w:top w:val="single" w:color="808080" w:sz="4"/>
-              <w:left w:val="single" w:color="808080" w:sz="4"/>
-              <w:bottom w:val="single" w:color="808080" w:sz="4"/>
-              <w:right w:val="single" w:color="808080" w:sz="4"/>
-            </w:tcBorders>
-            <w:tcMar>
-              <w:top w:type="dxa" w:w="50"/>
-              <w:left w:type="dxa" w:w="60"/>
-              <w:bottom w:type="dxa" w:w="50"/>
-              <w:right w:type="dxa" w:w="60"/>
-            </w:tcMar>
-          </w:tcPr>
-          <w:p>
-            <w:pPr>
-              <w:bidi/>
-              <w:jc w:val="center"/>
-            </w:pPr>
-            <w:r>
-              <w:rPr>
-                <w:rFonts w:ascii="Times New Roman" w:hAnsi="Times New Roman" w:cs="Times New Roman" w:eastAsia="Times New Roman"/>
-                <w:b w:val="false"/>
-                <w:sz w:val="28"/>
-                <w:szCs w:val="28"/>
-                <w:rtl/>
-              </w:rPr>
-              <w:t xml:space="preserve">87.96</w:t>
-            </w:r>
-          </w:p>
-        </w:tc>
-        <w:tc>
-          <w:tcPr>
-            <w:tcW w:type="dxa" w:w="1900"/>
-            <w:tcBorders>
-              <w:top w:val="single" w:color="808080" w:sz="4"/>
-              <w:left w:val="single" w:color="808080" w:sz="4"/>
-              <w:bottom w:val="single" w:color="808080" w:sz="4"/>
-              <w:right w:val="single" w:color="808080" w:sz="4"/>
-            </w:tcBorders>
-            <w:tcMar>
-              <w:top w:type="dxa" w:w="50"/>
-              <w:left w:type="dxa" w:w="60"/>
-              <w:bottom w:type="dxa" w:w="50"/>
-              <w:right w:type="dxa" w:w="60"/>
-            </w:tcMar>
-          </w:tcPr>
-          <w:p>
-            <w:pPr>
-              <w:bidi/>
-              <w:jc w:val="center"/>
-            </w:pPr>
-            <w:r>
-              <w:rPr>
-                <w:rFonts w:ascii="Times New Roman" w:hAnsi="Times New Roman" w:cs="Times New Roman" w:eastAsia="Times New Roman"/>
-                <w:b w:val="false"/>
-                <w:sz w:val="28"/>
-                <w:szCs w:val="28"/>
-                <w:rtl/>
-              </w:rPr>
-              <w:t xml:space="preserve">93.30</w:t>
-            </w:r>
-          </w:p>
-        </w:tc>
-      </w:tr>
-      <w:tr>
-        <w:trPr>
-          <w:tblHeader w:val="false"/>
-        </w:trPr>
-        <w:tc>
-          <w:tcPr>
-            <w:tcW w:type="dxa" w:w="3300"/>
-            <w:tcBorders>
-              <w:top w:val="single" w:color="808080" w:sz="4"/>
-              <w:left w:val="single" w:color="808080" w:sz="4"/>
-              <w:bottom w:val="single" w:color="808080" w:sz="4"/>
-              <w:right w:val="single" w:color="808080" w:sz="4"/>
-            </w:tcBorders>
-            <w:tcMar>
-              <w:top w:type="dxa" w:w="50"/>
-              <w:left w:type="dxa" w:w="60"/>
-              <w:bottom w:type="dxa" w:w="50"/>
-              <w:right w:type="dxa" w:w="60"/>
-            </w:tcMar>
-          </w:tcPr>
-          <w:p>
-            <w:pPr>
-              <w:bidi/>
-              <w:jc w:val="center"/>
-            </w:pPr>
-            <w:r>
-              <w:rPr>
-                <w:rFonts w:ascii="Times New Roman" w:hAnsi="Times New Roman" w:cs="Times New Roman" w:eastAsia="Times New Roman"/>
-                <w:b w:val="false"/>
-                <w:sz w:val="28"/>
-                <w:szCs w:val="28"/>
-                <w:rtl/>
-              </w:rPr>
-              <w:t xml:space="preserve">المعاني الاجتماعية</w:t>
-            </w:r>
-          </w:p>
-        </w:tc>
-        <w:tc>
-          <w:tcPr>
-            <w:tcW w:type="dxa" w:w="1900"/>
-            <w:tcBorders>
-              <w:top w:val="single" w:color="808080" w:sz="4"/>
-              <w:left w:val="single" w:color="808080" w:sz="4"/>
-              <w:bottom w:val="single" w:color="808080" w:sz="4"/>
-              <w:right w:val="single" w:color="808080" w:sz="4"/>
-            </w:tcBorders>
-            <w:tcMar>
-              <w:top w:type="dxa" w:w="50"/>
-              <w:left w:type="dxa" w:w="60"/>
-              <w:bottom w:type="dxa" w:w="50"/>
-              <w:right w:type="dxa" w:w="60"/>
-            </w:tcMar>
-          </w:tcPr>
-          <w:p>
-            <w:pPr>
-              <w:bidi/>
-              <w:jc w:val="center"/>
-            </w:pPr>
-            <w:r>
-              <w:rPr>
-                <w:rFonts w:ascii="Times New Roman" w:hAnsi="Times New Roman" w:cs="Times New Roman" w:eastAsia="Times New Roman"/>
-                <w:b w:val="false"/>
-                <w:sz w:val="28"/>
-                <w:szCs w:val="28"/>
-                <w:rtl/>
-              </w:rPr>
-              <w:t xml:space="preserve">72.03</w:t>
-            </w:r>
-          </w:p>
-        </w:tc>
-        <w:tc>
-          <w:tcPr>
-            <w:tcW w:type="dxa" w:w="1900"/>
-            <w:tcBorders>
-              <w:top w:val="single" w:color="808080" w:sz="4"/>
-              <w:left w:val="single" w:color="808080" w:sz="4"/>
-              <w:bottom w:val="single" w:color="808080" w:sz="4"/>
-              <w:right w:val="single" w:color="808080" w:sz="4"/>
-            </w:tcBorders>
-            <w:tcMar>
-              <w:top w:type="dxa" w:w="50"/>
-              <w:left w:type="dxa" w:w="60"/>
-              <w:bottom w:type="dxa" w:w="50"/>
-              <w:right w:type="dxa" w:w="60"/>
-            </w:tcMar>
-          </w:tcPr>
-          <w:p>
-            <w:pPr>
-              <w:bidi/>
-              <w:jc w:val="center"/>
-            </w:pPr>
-            <w:r>
-              <w:rPr>
-                <w:rFonts w:ascii="Times New Roman" w:hAnsi="Times New Roman" w:cs="Times New Roman" w:eastAsia="Times New Roman"/>
-                <w:b w:val="false"/>
-                <w:sz w:val="28"/>
-                <w:szCs w:val="28"/>
-                <w:rtl/>
-              </w:rPr>
-              <w:t xml:space="preserve">74.22</w:t>
-            </w:r>
-          </w:p>
-        </w:tc>
-        <w:tc>
-          <w:tcPr>
-            <w:tcW w:type="dxa" w:w="1900"/>
-            <w:tcBorders>
-              <w:top w:val="single" w:color="808080" w:sz="4"/>
-              <w:left w:val="single" w:color="808080" w:sz="4"/>
-              <w:bottom w:val="single" w:color="808080" w:sz="4"/>
-              <w:right w:val="single" w:color="808080" w:sz="4"/>
-            </w:tcBorders>
-            <w:tcMar>
-              <w:top w:type="dxa" w:w="50"/>
-              <w:left w:type="dxa" w:w="60"/>
-              <w:bottom w:type="dxa" w:w="50"/>
-              <w:right w:type="dxa" w:w="60"/>
-            </w:tcMar>
-          </w:tcPr>
-          <w:p>
-            <w:pPr>
-              <w:bidi/>
-              <w:jc w:val="center"/>
-            </w:pPr>
-            <w:r>
-              <w:rPr>
-                <w:rFonts w:ascii="Times New Roman" w:hAnsi="Times New Roman" w:cs="Times New Roman" w:eastAsia="Times New Roman"/>
-                <w:b w:val="false"/>
-                <w:sz w:val="28"/>
-                <w:szCs w:val="28"/>
-                <w:rtl/>
-              </w:rPr>
-              <w:t xml:space="preserve">77.13</w:t>
-            </w:r>
-          </w:p>
-        </w:tc>
-      </w:tr>
-      <w:tr>
-        <w:trPr>
-          <w:tblHeader w:val="false"/>
-        </w:trPr>
-        <w:tc>
-          <w:tcPr>
-            <w:tcW w:type="dxa" w:w="3300"/>
-            <w:tcBorders>
-              <w:top w:val="single" w:color="808080" w:sz="4"/>
-              <w:left w:val="single" w:color="808080" w:sz="4"/>
-              <w:bottom w:val="single" w:color="808080" w:sz="4"/>
-              <w:right w:val="single" w:color="808080" w:sz="4"/>
-            </w:tcBorders>
-            <w:tcMar>
-              <w:top w:type="dxa" w:w="50"/>
-              <w:left w:type="dxa" w:w="60"/>
-              <w:bottom w:type="dxa" w:w="50"/>
-              <w:right w:type="dxa" w:w="60"/>
-            </w:tcMar>
-          </w:tcPr>
-          <w:p>
-            <w:pPr>
-              <w:bidi/>
-              <w:jc w:val="center"/>
-            </w:pPr>
-            <w:r>
-              <w:rPr>
-                <w:rFonts w:ascii="Times New Roman" w:hAnsi="Times New Roman" w:cs="Times New Roman" w:eastAsia="Times New Roman"/>
-                <w:b w:val="false"/>
-                <w:sz w:val="28"/>
-                <w:szCs w:val="28"/>
-                <w:rtl/>
-              </w:rPr>
-              <w:t xml:space="preserve">تصنيف المواضيع</w:t>
-            </w:r>
-          </w:p>
-        </w:tc>
-        <w:tc>
-          <w:tcPr>
-            <w:tcW w:type="dxa" w:w="1900"/>
-            <w:tcBorders>
-              <w:top w:val="single" w:color="808080" w:sz="4"/>
-              <w:left w:val="single" w:color="808080" w:sz="4"/>
-              <w:bottom w:val="single" w:color="808080" w:sz="4"/>
-              <w:right w:val="single" w:color="808080" w:sz="4"/>
-            </w:tcBorders>
-            <w:tcMar>
-              <w:top w:type="dxa" w:w="50"/>
-              <w:left w:type="dxa" w:w="60"/>
-              <w:bottom w:type="dxa" w:w="50"/>
-              <w:right w:type="dxa" w:w="60"/>
-            </w:tcMar>
-          </w:tcPr>
-          <w:p>
-            <w:pPr>
-              <w:bidi/>
-              <w:jc w:val="center"/>
-            </w:pPr>
-            <w:r>
-              <w:rPr>
-                <w:rFonts w:ascii="Times New Roman" w:hAnsi="Times New Roman" w:cs="Times New Roman" w:eastAsia="Times New Roman"/>
-                <w:b w:val="false"/>
-                <w:sz w:val="28"/>
-                <w:szCs w:val="28"/>
-                <w:rtl/>
-              </w:rPr>
-              <w:t xml:space="preserve">92.97</w:t>
-            </w:r>
-          </w:p>
-        </w:tc>
-        <w:tc>
-          <w:tcPr>
-            <w:tcW w:type="dxa" w:w="1900"/>
-            <w:tcBorders>
-              <w:top w:val="single" w:color="808080" w:sz="4"/>
-              <w:left w:val="single" w:color="808080" w:sz="4"/>
-              <w:bottom w:val="single" w:color="808080" w:sz="4"/>
-              <w:right w:val="single" w:color="808080" w:sz="4"/>
-            </w:tcBorders>
-            <w:tcMar>
-              <w:top w:type="dxa" w:w="50"/>
-              <w:left w:type="dxa" w:w="60"/>
-              <w:bottom w:type="dxa" w:w="50"/>
-              <w:right w:type="dxa" w:w="60"/>
-            </w:tcMar>
-          </w:tcPr>
-          <w:p>
-            <w:pPr>
-              <w:bidi/>
-              <w:jc w:val="center"/>
-            </w:pPr>
-            <w:r>
-              <w:rPr>
-                <w:rFonts w:ascii="Times New Roman" w:hAnsi="Times New Roman" w:cs="Times New Roman" w:eastAsia="Times New Roman"/>
-                <w:b w:val="false"/>
-                <w:sz w:val="28"/>
-                <w:szCs w:val="28"/>
-                <w:rtl/>
-              </w:rPr>
-              <w:t xml:space="preserve">92.65</w:t>
-            </w:r>
-          </w:p>
-        </w:tc>
-        <w:tc>
-          <w:tcPr>
-            <w:tcW w:type="dxa" w:w="1900"/>
-            <w:tcBorders>
-              <w:top w:val="single" w:color="808080" w:sz="4"/>
-              <w:left w:val="single" w:color="808080" w:sz="4"/>
-              <w:bottom w:val="single" w:color="808080" w:sz="4"/>
-              <w:right w:val="single" w:color="808080" w:sz="4"/>
-            </w:tcBorders>
-            <w:tcMar>
-              <w:top w:type="dxa" w:w="50"/>
-              <w:left w:type="dxa" w:w="60"/>
-              <w:bottom w:type="dxa" w:w="50"/>
-              <w:right w:type="dxa" w:w="60"/>
-            </w:tcMar>
-          </w:tcPr>
-          <w:p>
-            <w:pPr>
-              <w:bidi/>
-              <w:jc w:val="center"/>
-            </w:pPr>
-            <w:r>
-              <w:rPr>
-                <w:rFonts w:ascii="Times New Roman" w:hAnsi="Times New Roman" w:cs="Times New Roman" w:eastAsia="Times New Roman"/>
-                <w:b w:val="false"/>
-                <w:sz w:val="28"/>
-                <w:szCs w:val="28"/>
-                <w:rtl/>
-              </w:rPr>
-              <w:t xml:space="preserve">91.54</w:t>
-            </w:r>
-          </w:p>
-        </w:tc>
-      </w:tr>
-      <w:tr>
-        <w:trPr>
-          <w:tblHeader w:val="false"/>
-        </w:trPr>
-        <w:tc>
-          <w:tcPr>
-            <w:tcW w:type="dxa" w:w="3300"/>
-            <w:tcBorders>
-              <w:top w:val="single" w:color="808080" w:sz="4"/>
-              <w:left w:val="single" w:color="808080" w:sz="4"/>
-              <w:bottom w:val="single" w:color="808080" w:sz="4"/>
-              <w:right w:val="single" w:color="808080" w:sz="4"/>
-            </w:tcBorders>
-            <w:tcMar>
-              <w:top w:type="dxa" w:w="50"/>
-              <w:left w:type="dxa" w:w="60"/>
-              <w:bottom w:type="dxa" w:w="50"/>
-              <w:right w:type="dxa" w:w="60"/>
-            </w:tcMar>
-          </w:tcPr>
-          <w:p>
-            <w:pPr>
-              <w:bidi/>
-              <w:jc w:val="center"/>
-            </w:pPr>
-            <w:r>
-              <w:rPr>
-                <w:rFonts w:ascii="Times New Roman" w:hAnsi="Times New Roman" w:cs="Times New Roman" w:eastAsia="Times New Roman"/>
-                <w:b w:val="false"/>
-                <w:sz w:val="28"/>
-                <w:szCs w:val="28"/>
-                <w:rtl/>
-              </w:rPr>
-              <w:t xml:space="preserve">تمييز اللهجات</w:t>
-            </w:r>
-          </w:p>
-        </w:tc>
-        <w:tc>
-          <w:tcPr>
-            <w:tcW w:type="dxa" w:w="1900"/>
-            <w:tcBorders>
-              <w:top w:val="single" w:color="808080" w:sz="4"/>
-              <w:left w:val="single" w:color="808080" w:sz="4"/>
-              <w:bottom w:val="single" w:color="808080" w:sz="4"/>
-              <w:right w:val="single" w:color="808080" w:sz="4"/>
-            </w:tcBorders>
-            <w:tcMar>
-              <w:top w:type="dxa" w:w="50"/>
-              <w:left w:type="dxa" w:w="60"/>
-              <w:bottom w:type="dxa" w:w="50"/>
-              <w:right w:type="dxa" w:w="60"/>
-            </w:tcMar>
-          </w:tcPr>
-          <w:p>
-            <w:pPr>
-              <w:bidi/>
-              <w:jc w:val="center"/>
-            </w:pPr>
-            <w:r>
-              <w:rPr>
-                <w:rFonts w:ascii="Times New Roman" w:hAnsi="Times New Roman" w:cs="Times New Roman" w:eastAsia="Times New Roman"/>
-                <w:b w:val="false"/>
-                <w:sz w:val="28"/>
-                <w:szCs w:val="28"/>
-                <w:rtl/>
-              </w:rPr>
-              <w:t xml:space="preserve">86.92</w:t>
-            </w:r>
-          </w:p>
-        </w:tc>
-        <w:tc>
-          <w:tcPr>
-            <w:tcW w:type="dxa" w:w="1900"/>
-            <w:tcBorders>
-              <w:top w:val="single" w:color="808080" w:sz="4"/>
-              <w:left w:val="single" w:color="808080" w:sz="4"/>
-              <w:bottom w:val="single" w:color="808080" w:sz="4"/>
-              <w:right w:val="single" w:color="808080" w:sz="4"/>
-            </w:tcBorders>
-            <w:tcMar>
-              <w:top w:type="dxa" w:w="50"/>
-              <w:left w:type="dxa" w:w="60"/>
-              <w:bottom w:type="dxa" w:w="50"/>
-              <w:right w:type="dxa" w:w="60"/>
-            </w:tcMar>
-          </w:tcPr>
-          <w:p>
-            <w:pPr>
-              <w:bidi/>
-              <w:jc w:val="center"/>
-            </w:pPr>
-            <w:r>
-              <w:rPr>
-                <w:rFonts w:ascii="Times New Roman" w:hAnsi="Times New Roman" w:cs="Times New Roman" w:eastAsia="Times New Roman"/>
-                <w:b w:val="false"/>
-                <w:sz w:val="28"/>
-                <w:szCs w:val="28"/>
-                <w:rtl/>
-              </w:rPr>
-              <w:t xml:space="preserve">88.49</w:t>
-            </w:r>
-          </w:p>
-        </w:tc>
-        <w:tc>
-          <w:tcPr>
-            <w:tcW w:type="dxa" w:w="1900"/>
-            <w:tcBorders>
-              <w:top w:val="single" w:color="808080" w:sz="4"/>
-              <w:left w:val="single" w:color="808080" w:sz="4"/>
-              <w:bottom w:val="single" w:color="808080" w:sz="4"/>
-              <w:right w:val="single" w:color="808080" w:sz="4"/>
-            </w:tcBorders>
-            <w:tcMar>
-              <w:top w:type="dxa" w:w="50"/>
-              <w:left w:type="dxa" w:w="60"/>
-              <w:bottom w:type="dxa" w:w="50"/>
-              <w:right w:type="dxa" w:w="60"/>
-            </w:tcMar>
-          </w:tcPr>
-          <w:p>
-            <w:pPr>
-              <w:bidi/>
-              <w:jc w:val="center"/>
-            </w:pPr>
-            <w:r>
-              <w:rPr>
-                <w:rFonts w:ascii="Times New Roman" w:hAnsi="Times New Roman" w:cs="Times New Roman" w:eastAsia="Times New Roman"/>
-                <w:b w:val="false"/>
-                <w:sz w:val="28"/>
-                <w:szCs w:val="28"/>
-                <w:rtl/>
-              </w:rPr>
-              <w:t xml:space="preserve">90.65</w:t>
-            </w:r>
-          </w:p>
-        </w:tc>
-      </w:tr>
-      <w:tr>
-        <w:trPr>
-          <w:tblHeader w:val="false"/>
-        </w:trPr>
-        <w:tc>
-          <w:tcPr>
-            <w:tcW w:type="dxa" w:w="3300"/>
-            <w:tcBorders>
-              <w:top w:val="single" w:color="808080" w:sz="4"/>
-              <w:left w:val="single" w:color="808080" w:sz="4"/>
-              <w:bottom w:val="single" w:color="808080" w:sz="4"/>
-              <w:right w:val="single" w:color="808080" w:sz="4"/>
-            </w:tcBorders>
-            <w:tcMar>
-              <w:top w:type="dxa" w:w="50"/>
-              <w:left w:type="dxa" w:w="60"/>
-              <w:bottom w:type="dxa" w:w="50"/>
-              <w:right w:type="dxa" w:w="60"/>
-            </w:tcMar>
-          </w:tcPr>
-          <w:p>
-            <w:pPr>
-              <w:bidi/>
-              <w:jc w:val="center"/>
-            </w:pPr>
-            <w:r>
-              <w:rPr>
-                <w:rFonts w:ascii="Times New Roman" w:hAnsi="Times New Roman" w:cs="Times New Roman" w:eastAsia="Times New Roman"/>
-                <w:b w:val="false"/>
-                <w:sz w:val="28"/>
-                <w:szCs w:val="28"/>
-                <w:rtl/>
-              </w:rPr>
-              <w:t xml:space="preserve">التعرف على الكيانات المسماة</w:t>
-            </w:r>
-          </w:p>
-        </w:tc>
-        <w:tc>
-          <w:tcPr>
-            <w:tcW w:type="dxa" w:w="1900"/>
-            <w:tcBorders>
-              <w:top w:val="single" w:color="808080" w:sz="4"/>
-              <w:left w:val="single" w:color="808080" w:sz="4"/>
-              <w:bottom w:val="single" w:color="808080" w:sz="4"/>
-              <w:right w:val="single" w:color="808080" w:sz="4"/>
-            </w:tcBorders>
-            <w:tcMar>
-              <w:top w:type="dxa" w:w="50"/>
-              <w:left w:type="dxa" w:w="60"/>
-              <w:bottom w:type="dxa" w:w="50"/>
-              <w:right w:type="dxa" w:w="60"/>
-            </w:tcMar>
-          </w:tcPr>
-          <w:p>
-            <w:pPr>
-              <w:bidi/>
-              <w:jc w:val="center"/>
-            </w:pPr>
-            <w:r>
-              <w:rPr>
-                <w:rFonts w:ascii="Times New Roman" w:hAnsi="Times New Roman" w:cs="Times New Roman" w:eastAsia="Times New Roman"/>
-                <w:b w:val="false"/>
-                <w:sz w:val="28"/>
-                <w:szCs w:val="28"/>
-                <w:rtl/>
-              </w:rPr>
-              <w:t xml:space="preserve">76.19</w:t>
-            </w:r>
-          </w:p>
-        </w:tc>
-        <w:tc>
-          <w:tcPr>
-            <w:tcW w:type="dxa" w:w="1900"/>
-            <w:tcBorders>
-              <w:top w:val="single" w:color="808080" w:sz="4"/>
-              <w:left w:val="single" w:color="808080" w:sz="4"/>
-              <w:bottom w:val="single" w:color="808080" w:sz="4"/>
-              <w:right w:val="single" w:color="808080" w:sz="4"/>
-            </w:tcBorders>
-            <w:tcMar>
-              <w:top w:type="dxa" w:w="50"/>
-              <w:left w:type="dxa" w:w="60"/>
-              <w:bottom w:type="dxa" w:w="50"/>
-              <w:right w:type="dxa" w:w="60"/>
-            </w:tcMar>
-          </w:tcPr>
-          <w:p>
-            <w:pPr>
-              <w:bidi/>
-              <w:jc w:val="center"/>
-            </w:pPr>
-            <w:r>
-              <w:rPr>
-                <w:rFonts w:ascii="Times New Roman" w:hAnsi="Times New Roman" w:cs="Times New Roman" w:eastAsia="Times New Roman"/>
-                <w:b w:val="false"/>
-                <w:sz w:val="28"/>
-                <w:szCs w:val="28"/>
-                <w:rtl/>
-              </w:rPr>
-              <w:t xml:space="preserve">76.83</w:t>
-            </w:r>
-          </w:p>
-        </w:tc>
-        <w:tc>
-          <w:tcPr>
-            <w:tcW w:type="dxa" w:w="1900"/>
-            <w:tcBorders>
-              <w:top w:val="single" w:color="808080" w:sz="4"/>
-              <w:left w:val="single" w:color="808080" w:sz="4"/>
-              <w:bottom w:val="single" w:color="808080" w:sz="4"/>
-              <w:right w:val="single" w:color="808080" w:sz="4"/>
-            </w:tcBorders>
-            <w:tcMar>
-              <w:top w:type="dxa" w:w="50"/>
-              <w:left w:type="dxa" w:w="60"/>
-              <w:bottom w:type="dxa" w:w="50"/>
-              <w:right w:type="dxa" w:w="60"/>
-            </w:tcMar>
-          </w:tcPr>
-          <w:p>
-            <w:pPr>
-              <w:bidi/>
-              <w:jc w:val="center"/>
-            </w:pPr>
-            <w:r>
-              <w:rPr>
-                <w:rFonts w:ascii="Times New Roman" w:hAnsi="Times New Roman" w:cs="Times New Roman" w:eastAsia="Times New Roman"/>
-                <w:b w:val="false"/>
-                <w:sz w:val="28"/>
-                <w:szCs w:val="28"/>
-                <w:rtl/>
-              </w:rPr>
-              <w:t xml:space="preserve">71.93</w:t>
-            </w:r>
-          </w:p>
-        </w:tc>
-      </w:tr>
-      <w:tr>
-        <w:trPr>
-          <w:tblHeader w:val="false"/>
-        </w:trPr>
-        <w:tc>
-          <w:tcPr>
-            <w:tcW w:type="dxa" w:w="3300"/>
-            <w:tcBorders>
-              <w:top w:val="single" w:color="808080" w:sz="4"/>
-              <w:left w:val="single" w:color="808080" w:sz="4"/>
-              <w:bottom w:val="single" w:color="808080" w:sz="4"/>
-              <w:right w:val="single" w:color="808080" w:sz="4"/>
-            </w:tcBorders>
-            <w:tcMar>
-              <w:top w:type="dxa" w:w="50"/>
-              <w:left w:type="dxa" w:w="60"/>
-              <w:bottom w:type="dxa" w:w="50"/>
-              <w:right w:type="dxa" w:w="60"/>
-            </w:tcMar>
-          </w:tcPr>
-          <w:p>
-            <w:pPr>
-              <w:bidi/>
-              <w:jc w:val="center"/>
-            </w:pPr>
-            <w:r>
-              <w:rPr>
-                <w:rFonts w:ascii="Times New Roman" w:hAnsi="Times New Roman" w:cs="Times New Roman" w:eastAsia="Times New Roman"/>
-                <w:b w:val="false"/>
-                <w:sz w:val="28"/>
-                <w:szCs w:val="28"/>
-                <w:rtl/>
-              </w:rPr>
-              <w:t xml:space="preserve">الإجابة على الأسئلة (F1)</w:t>
-            </w:r>
-          </w:p>
-        </w:tc>
-        <w:tc>
-          <w:tcPr>
-            <w:tcW w:type="dxa" w:w="1900"/>
-            <w:tcBorders>
-              <w:top w:val="single" w:color="808080" w:sz="4"/>
-              <w:left w:val="single" w:color="808080" w:sz="4"/>
-              <w:bottom w:val="single" w:color="808080" w:sz="4"/>
-              <w:right w:val="single" w:color="808080" w:sz="4"/>
-            </w:tcBorders>
-            <w:tcMar>
-              <w:top w:type="dxa" w:w="50"/>
-              <w:left w:type="dxa" w:w="60"/>
-              <w:bottom w:type="dxa" w:w="50"/>
-              <w:right w:type="dxa" w:w="60"/>
-            </w:tcMar>
-          </w:tcPr>
-          <w:p>
-            <w:pPr>
-              <w:bidi/>
-              <w:jc w:val="center"/>
-            </w:pPr>
-            <w:r>
-              <w:rPr>
-                <w:rFonts w:ascii="Times New Roman" w:hAnsi="Times New Roman" w:cs="Times New Roman" w:eastAsia="Times New Roman"/>
-                <w:b w:val="false"/>
-                <w:sz w:val="28"/>
-                <w:szCs w:val="28"/>
-                <w:rtl/>
-              </w:rPr>
-              <w:t xml:space="preserve">58.10</w:t>
-            </w:r>
-          </w:p>
-        </w:tc>
-        <w:tc>
-          <w:tcPr>
-            <w:tcW w:type="dxa" w:w="1900"/>
-            <w:tcBorders>
-              <w:top w:val="single" w:color="808080" w:sz="4"/>
-              <w:left w:val="single" w:color="808080" w:sz="4"/>
-              <w:bottom w:val="single" w:color="808080" w:sz="4"/>
-              <w:right w:val="single" w:color="808080" w:sz="4"/>
-            </w:tcBorders>
-            <w:tcMar>
-              <w:top w:type="dxa" w:w="50"/>
-              <w:left w:type="dxa" w:w="60"/>
-              <w:bottom w:type="dxa" w:w="50"/>
-              <w:right w:type="dxa" w:w="60"/>
-            </w:tcMar>
-          </w:tcPr>
-          <w:p>
-            <w:pPr>
-              <w:bidi/>
-              <w:jc w:val="center"/>
-            </w:pPr>
-            <w:r>
-              <w:rPr>
-                <w:rFonts w:ascii="Times New Roman" w:hAnsi="Times New Roman" w:cs="Times New Roman" w:eastAsia="Times New Roman"/>
-                <w:b w:val="false"/>
-                <w:sz w:val="28"/>
-                <w:szCs w:val="28"/>
-                <w:rtl/>
-              </w:rPr>
-              <w:t xml:space="preserve">57.81</w:t>
-            </w:r>
-          </w:p>
-        </w:tc>
-        <w:tc>
-          <w:tcPr>
-            <w:tcW w:type="dxa" w:w="1900"/>
-            <w:tcBorders>
-              <w:top w:val="single" w:color="808080" w:sz="4"/>
-              <w:left w:val="single" w:color="808080" w:sz="4"/>
-              <w:bottom w:val="single" w:color="808080" w:sz="4"/>
-              <w:right w:val="single" w:color="808080" w:sz="4"/>
-            </w:tcBorders>
-            <w:tcMar>
-              <w:top w:type="dxa" w:w="50"/>
-              <w:left w:type="dxa" w:w="60"/>
-              <w:bottom w:type="dxa" w:w="50"/>
-              <w:right w:type="dxa" w:w="60"/>
-            </w:tcMar>
-          </w:tcPr>
-          <w:p>
-            <w:pPr>
-              <w:bidi/>
-              <w:jc w:val="center"/>
-            </w:pPr>
-            <w:r>
-              <w:rPr>
-                <w:rFonts w:ascii="Times New Roman" w:hAnsi="Times New Roman" w:cs="Times New Roman" w:eastAsia="Times New Roman"/>
-                <w:b w:val="false"/>
-                <w:sz w:val="28"/>
-                <w:szCs w:val="28"/>
-                <w:rtl/>
-              </w:rPr>
-              <w:t xml:space="preserve">48.83</w:t>
-            </w:r>
-          </w:p>
-        </w:tc>
-      </w:tr>
-      <w:tr>
-        <w:trPr>
-          <w:tblHeader w:val="false"/>
-        </w:trPr>
-        <w:tc>
-          <w:tcPr>
-            <w:tcW w:type="dxa" w:w="3300"/>
-            <w:tcBorders>
-              <w:top w:val="single" w:color="808080" w:sz="4"/>
-              <w:left w:val="single" w:color="808080" w:sz="4"/>
-              <w:bottom w:val="single" w:color="808080" w:sz="4"/>
-              <w:right w:val="single" w:color="808080" w:sz="4"/>
-            </w:tcBorders>
-            <w:tcMar>
-              <w:top w:type="dxa" w:w="50"/>
-              <w:left w:type="dxa" w:w="60"/>
-              <w:bottom w:type="dxa" w:w="50"/>
-              <w:right w:type="dxa" w:w="60"/>
-            </w:tcMar>
-          </w:tcPr>
-          <w:p>
-            <w:pPr>
-              <w:bidi/>
-              <w:jc w:val="center"/>
-            </w:pPr>
-            <w:r>
-              <w:rPr>
-                <w:rFonts w:ascii="Times New Roman" w:hAnsi="Times New Roman" w:cs="Times New Roman" w:eastAsia="Times New Roman"/>
-                <w:b w:val="false"/>
-                <w:sz w:val="28"/>
-                <w:szCs w:val="28"/>
-                <w:rtl/>
-              </w:rPr>
-              <w:t xml:space="preserve">الدرجة الكلية ARLUE</w:t>
-            </w:r>
-          </w:p>
-        </w:tc>
-        <w:tc>
-          <w:tcPr>
-            <w:tcW w:type="dxa" w:w="1900"/>
-            <w:tcBorders>
-              <w:top w:val="single" w:color="808080" w:sz="4"/>
-              <w:left w:val="single" w:color="808080" w:sz="4"/>
-              <w:bottom w:val="single" w:color="808080" w:sz="4"/>
-              <w:right w:val="single" w:color="808080" w:sz="4"/>
-            </w:tcBorders>
-            <w:tcMar>
-              <w:top w:type="dxa" w:w="50"/>
-              <w:left w:type="dxa" w:w="60"/>
-              <w:bottom w:type="dxa" w:w="50"/>
-              <w:right w:type="dxa" w:w="60"/>
-            </w:tcMar>
-          </w:tcPr>
-          <w:p>
-            <w:pPr>
-              <w:bidi/>
-              <w:jc w:val="center"/>
-            </w:pPr>
-            <w:r>
-              <w:rPr>
-                <w:rFonts w:ascii="Times New Roman" w:hAnsi="Times New Roman" w:cs="Times New Roman" w:eastAsia="Times New Roman"/>
-                <w:b w:val="false"/>
-                <w:sz w:val="28"/>
-                <w:szCs w:val="28"/>
-                <w:rtl/>
-              </w:rPr>
-              <w:t xml:space="preserve">73.91</w:t>
-            </w:r>
-          </w:p>
-        </w:tc>
-        <w:tc>
-          <w:tcPr>
-            <w:tcW w:type="dxa" w:w="1900"/>
-            <w:tcBorders>
-              <w:top w:val="single" w:color="808080" w:sz="4"/>
-              <w:left w:val="single" w:color="808080" w:sz="4"/>
-              <w:bottom w:val="single" w:color="808080" w:sz="4"/>
-              <w:right w:val="single" w:color="808080" w:sz="4"/>
-            </w:tcBorders>
-            <w:tcMar>
-              <w:top w:type="dxa" w:w="50"/>
-              <w:left w:type="dxa" w:w="60"/>
-              <w:bottom w:type="dxa" w:w="50"/>
-              <w:right w:type="dxa" w:w="60"/>
-            </w:tcMar>
-          </w:tcPr>
-          <w:p>
-            <w:pPr>
-              <w:bidi/>
-              <w:jc w:val="center"/>
-            </w:pPr>
-            <w:r>
-              <w:rPr>
-                <w:rFonts w:ascii="Times New Roman" w:hAnsi="Times New Roman" w:cs="Times New Roman" w:eastAsia="Times New Roman"/>
-                <w:b w:val="false"/>
-                <w:sz w:val="28"/>
-                <w:szCs w:val="28"/>
-                <w:rtl/>
-              </w:rPr>
-              <w:t xml:space="preserve">76.07</w:t>
-            </w:r>
-          </w:p>
-        </w:tc>
-        <w:tc>
-          <w:tcPr>
-            <w:tcW w:type="dxa" w:w="1900"/>
-            <w:tcBorders>
-              <w:top w:val="single" w:color="808080" w:sz="4"/>
-              <w:left w:val="single" w:color="808080" w:sz="4"/>
-              <w:bottom w:val="single" w:color="808080" w:sz="4"/>
-              <w:right w:val="single" w:color="808080" w:sz="4"/>
-            </w:tcBorders>
-            <w:tcMar>
-              <w:top w:type="dxa" w:w="50"/>
-              <w:left w:type="dxa" w:w="60"/>
-              <w:bottom w:type="dxa" w:w="50"/>
-              <w:right w:type="dxa" w:w="60"/>
-            </w:tcMar>
-          </w:tcPr>
-          <w:p>
-            <w:pPr>
-              <w:bidi/>
-              <w:jc w:val="center"/>
-            </w:pPr>
-            <w:r>
-              <w:rPr>
-                <w:rFonts w:ascii="Times New Roman" w:hAnsi="Times New Roman" w:cs="Times New Roman" w:eastAsia="Times New Roman"/>
-                <w:b w:val="false"/>
-                <w:sz w:val="28"/>
-                <w:szCs w:val="28"/>
-                <w:rtl/>
-              </w:rPr>
-              <w:t xml:space="preserve">75.99</w:t>
-            </w:r>
-          </w:p>
-        </w:tc>
-      </w:tr>
-    </w:tbl>
-    <w:p>
-      <w:pPr>
-        <w:bidi/>
-        <w:spacing w:after="120" w:line="300"/>
-        <w:jc w:val="both"/>
-      </w:pPr>
-      <w:r>
-        <w:rPr>
-          <w:rFonts w:ascii="Times New Roman" w:hAnsi="Times New Roman" w:cs="Times New Roman" w:eastAsia="Times New Roman"/>
-          <w:sz w:val="28"/>
-          <w:szCs w:val="28"/>
-          <w:rtl/>
-        </w:rPr>
-        <w:t xml:space="preserve">غير أن النتائج داخل تجمّع تصنيف المواضيع نفسه لا تتجه لصالح نموذج واحد (الجدول 3): يتفوق AraBERTv2 على مجموعة ANT بالنص الكامل (88.17%)، بينما يتفوق ARBERTv2 على Khaleej وOSAC بفوارق ضيقة، ويسجّل MARBERTv2 الأداء الأدنى في معظم الحالات [4]. ويعزو مطورو MARBERT ذلك إلى أن التغريدات نادراً ما تحمل تفصيلاً موضوعياً [4]. ويؤكد هذا التباين أن الأفضلية مشروطة بخصائص كل مجموعة بيانات، ما يبرر إجراء مقارنة مستقلة على بيانات الاستفسارات الجامعية.</w:t>
-      </w:r>
-    </w:p>
-    <w:p>
-      <w:pPr>
-        <w:bidi/>
-        <w:spacing w:before="60" w:after="200"/>
-        <w:jc w:val="center"/>
-      </w:pPr>
-      <w:r>
-        <w:rPr>
-          <w:rFonts w:ascii="Times New Roman" w:hAnsi="Times New Roman" w:cs="Times New Roman" w:eastAsia="Times New Roman"/>
-          <w:b/>
-          <w:bCs/>
-          <w:sz w:val="28"/>
-          <w:szCs w:val="28"/>
-          <w:rtl/>
-        </w:rPr>
-        <w:t xml:space="preserve">الجدول 3.</w:t>
-      </w:r>
-      <w:r>
-        <w:rPr>
-          <w:rFonts w:ascii="Times New Roman" w:hAnsi="Times New Roman" w:cs="Times New Roman" w:eastAsia="Times New Roman"/>
-          <w:b w:val="false"/>
-          <w:sz w:val="28"/>
-          <w:szCs w:val="28"/>
-          <w:rtl/>
-        </w:rPr>
-        <w:t xml:space="preserve"> أداء النماذج في تصنيف المواضيع عبر مجموعات بيانات مختلفة [4].</w:t>
-      </w:r>
-    </w:p>
-    <w:tbl>
-      <w:tblPr>
-        <w:bidiVisual/>
-        <w:tblW w:type="dxa" w:w="9000"/>
-        <w:tblBorders>
-          <w:top w:val="single" w:color="auto" w:sz="4"/>
-          <w:left w:val="single" w:color="auto" w:sz="4"/>
-          <w:bottom w:val="single" w:color="auto" w:sz="4"/>
-          <w:right w:val="single" w:color="auto" w:sz="4"/>
-          <w:insideH w:val="single" w:color="auto" w:sz="4"/>
-          <w:insideV w:val="single" w:color="auto" w:sz="4"/>
-        </w:tblBorders>
-      </w:tblPr>
-      <w:tblGrid>
-        <w:gridCol w:w="3300"/>
-        <w:gridCol w:w="1900"/>
-        <w:gridCol w:w="1900"/>
-        <w:gridCol w:w="1900"/>
-      </w:tblGrid>
-      <w:tr>
-        <w:trPr>
-          <w:tblHeader/>
-        </w:trPr>
-        <w:tc>
-          <w:tcPr>
-            <w:tcW w:type="dxa" w:w="3300"/>
-            <w:tcBorders>
-              <w:top w:val="single" w:color="808080" w:sz="4"/>
-              <w:left w:val="single" w:color="808080" w:sz="4"/>
-              <w:bottom w:val="single" w:color="808080" w:sz="4"/>
-              <w:right w:val="single" w:color="808080" w:sz="4"/>
-            </w:tcBorders>
-            <w:shd w:fill="DCE6F0" w:color="auto" w:val="clear"/>
-            <w:tcMar>
-              <w:top w:type="dxa" w:w="50"/>
-              <w:left w:type="dxa" w:w="60"/>
-              <w:bottom w:type="dxa" w:w="50"/>
-              <w:right w:type="dxa" w:w="60"/>
-            </w:tcMar>
-          </w:tcPr>
-          <w:p>
-            <w:pPr>
-              <w:bidi/>
-              <w:jc w:val="center"/>
-            </w:pPr>
-            <w:r>
-              <w:rPr>
-                <w:rFonts w:ascii="Times New Roman" w:hAnsi="Times New Roman" w:cs="Times New Roman" w:eastAsia="Times New Roman"/>
-                <w:b/>
-                <w:bCs/>
-                <w:sz w:val="28"/>
-                <w:szCs w:val="28"/>
-                <w:rtl/>
-              </w:rPr>
-              <w:t xml:space="preserve">مجموعة البيانات (عدد الفئات)</w:t>
-            </w:r>
-          </w:p>
-        </w:tc>
-        <w:tc>
-          <w:tcPr>
-            <w:tcW w:type="dxa" w:w="1900"/>
-            <w:tcBorders>
-              <w:top w:val="single" w:color="808080" w:sz="4"/>
-              <w:left w:val="single" w:color="808080" w:sz="4"/>
-              <w:bottom w:val="single" w:color="808080" w:sz="4"/>
-              <w:right w:val="single" w:color="808080" w:sz="4"/>
-            </w:tcBorders>
-            <w:shd w:fill="DCE6F0" w:color="auto" w:val="clear"/>
-            <w:tcMar>
-              <w:top w:type="dxa" w:w="50"/>
-              <w:left w:type="dxa" w:w="60"/>
-              <w:bottom w:type="dxa" w:w="50"/>
-              <w:right w:type="dxa" w:w="60"/>
-            </w:tcMar>
-          </w:tcPr>
-          <w:p>
-            <w:pPr>
-              <w:bidi/>
-              <w:jc w:val="center"/>
-            </w:pPr>
-            <w:r>
-              <w:rPr>
-                <w:rFonts w:ascii="Times New Roman" w:hAnsi="Times New Roman" w:cs="Times New Roman" w:eastAsia="Times New Roman"/>
-                <w:b/>
-                <w:bCs/>
-                <w:sz w:val="28"/>
-                <w:szCs w:val="28"/>
-                <w:rtl/>
-              </w:rPr>
-              <w:t xml:space="preserve">AraBERTv2</w:t>
-            </w:r>
-          </w:p>
-        </w:tc>
-        <w:tc>
-          <w:tcPr>
-            <w:tcW w:type="dxa" w:w="1900"/>
-            <w:tcBorders>
-              <w:top w:val="single" w:color="808080" w:sz="4"/>
-              <w:left w:val="single" w:color="808080" w:sz="4"/>
-              <w:bottom w:val="single" w:color="808080" w:sz="4"/>
-              <w:right w:val="single" w:color="808080" w:sz="4"/>
-            </w:tcBorders>
-            <w:shd w:fill="DCE6F0" w:color="auto" w:val="clear"/>
-            <w:tcMar>
-              <w:top w:type="dxa" w:w="50"/>
-              <w:left w:type="dxa" w:w="60"/>
-              <w:bottom w:type="dxa" w:w="50"/>
-              <w:right w:type="dxa" w:w="60"/>
-            </w:tcMar>
-          </w:tcPr>
-          <w:p>
-            <w:pPr>
-              <w:bidi/>
-              <w:jc w:val="center"/>
-            </w:pPr>
-            <w:r>
-              <w:rPr>
-                <w:rFonts w:ascii="Times New Roman" w:hAnsi="Times New Roman" w:cs="Times New Roman" w:eastAsia="Times New Roman"/>
-                <w:b/>
-                <w:bCs/>
-                <w:sz w:val="28"/>
-                <w:szCs w:val="28"/>
-                <w:rtl/>
-              </w:rPr>
-              <w:t xml:space="preserve">ARBERTv2</w:t>
-            </w:r>
-          </w:p>
-        </w:tc>
-        <w:tc>
-          <w:tcPr>
-            <w:tcW w:type="dxa" w:w="1900"/>
-            <w:tcBorders>
-              <w:top w:val="single" w:color="808080" w:sz="4"/>
-              <w:left w:val="single" w:color="808080" w:sz="4"/>
-              <w:bottom w:val="single" w:color="808080" w:sz="4"/>
-              <w:right w:val="single" w:color="808080" w:sz="4"/>
-            </w:tcBorders>
-            <w:shd w:fill="DCE6F0" w:color="auto" w:val="clear"/>
-            <w:tcMar>
-              <w:top w:type="dxa" w:w="50"/>
-              <w:left w:type="dxa" w:w="60"/>
-              <w:bottom w:type="dxa" w:w="50"/>
-              <w:right w:type="dxa" w:w="60"/>
-            </w:tcMar>
-          </w:tcPr>
-          <w:p>
-            <w:pPr>
-              <w:bidi/>
-              <w:jc w:val="center"/>
-            </w:pPr>
-            <w:r>
-              <w:rPr>
-                <w:rFonts w:ascii="Times New Roman" w:hAnsi="Times New Roman" w:cs="Times New Roman" w:eastAsia="Times New Roman"/>
-                <w:b/>
-                <w:bCs/>
-                <w:sz w:val="28"/>
-                <w:szCs w:val="28"/>
-                <w:rtl/>
-              </w:rPr>
-              <w:t xml:space="preserve">MARBERTv2</w:t>
+              <w:t xml:space="preserve">MARBERT</w:t>
             </w:r>
           </w:p>
         </w:tc>
@@ -3123,7 +3390,7 @@
           <w:szCs w:val="28"/>
           <w:rtl/>
         </w:rPr>
-        <w:t xml:space="preserve">أظهرت مراجعة منهجية لنماذج BERT العربية في تصنيف النصوص [6] تفوق MARBERT في نسبة كبيرة من الحالات المدروسة، يليه QARiB ثم ARBERT، لكنها تجمع نتائج من بيئات تجريبية متباينة في المعاملات الفائقة وأحجام البيانات وبروتوكولات التقييم، فتصلح مؤشراً لاتجاه عام لا أرقاماً قابلة للمقارنة المباشرة. وفي تصنيف الأخبار، تفوّق AraBERT بدقة 96.04% على CAMeLBERT (94.18%) وmBERT (94.14%) على مجموعة متوازنة من نحو 68 ألف مقال مع معاملات فائقة موحّدة [9].</w:t>
+        <w:t xml:space="preserve">خلصت مراجعة منهجية لنماذج BERT العربية في تصنيف النصوص [6] إلى أن MARBERT هو الأفضل أداءً بحسب عدد مرات تفوقه على النماذج الأخرى، يليه QARiB ثم ARBERT ثم AraBERT، وعزت ذلك إلى أن معظم مجموعات الاختبار المشمولة تحتوي نصوصاً لهجية، لكنها تجمع نتائج من بيئات تجريبية متباينة في المعاملات الفائقة وأحجام البيانات وبروتوكولات التقييم، فتصلح مؤشراً لاتجاه عام لا أرقاماً قابلة للمقارنة المباشرة. وفي تصنيف الأخبار، أفادت دراسة منشورة كمسودة بحثية بتفوق AraBERT بدقة 96.04% على CAMeLBERT (94.18%) وmBERT (94.14%) على مجموعة متوازنة من نحو 68 ألف مقال مع معاملات فائقة موحّدة [9].</w:t>
       </w:r>
     </w:p>
     <w:p>
@@ -3139,7 +3406,7 @@
           <w:szCs w:val="28"/>
           <w:rtl/>
         </w:rPr>
-        <w:t xml:space="preserve">وفي السياقات التعليمية، حقق AraBERT دقة 78% في تحليل مشاعر الطلاب تجاه تقييم أعضاء هيئة التدريس [10]، وحقق بعد الضبط الدقيق F1 يساوي 0.89 في تحليل التغريدات المرتبطة بالإصلاحات التعليمية، متفوقاً على MARBERT وCAMeLBERT [11]. في المقابل، تقارب أداء AraBERTv2 (71.0%) وMARBERTv2 (70.0%) في تحليل مشاعر تغريدات كوفيد-19 [12]، وتفوّق MARBERT مع SVM بدقة 92.14% على مجموعة تقييمات المستشفيات HEAR [13]. وأشارت دراسة لتصنيف نصوص الجرائم الإلكترونية [14] إلى تباين الأدبيات بين مسارات تُظهر تفوق AraBERT وأخرى تُظهر تفوق MARBERT. ويتسق هذا النمط عبر الدراسات: يتفوق AraBERTv2 في المهام الموضوعية ذات الطابع المؤسسي شبه الرسمي، ويتفوق MARBERTv2 في المهام اللهجية العفوية.</w:t>
+        <w:t xml:space="preserve">وفي السياقات التعليمية، حقق AraBERT دقة 78% في تحليل مشاعر الطلاب تجاه تقييم أعضاء هيئة التدريس [10]، وحقق بعد الضبط الدقيق F1 يساوي 0.89 في تحليل التغريدات المرتبطة بالإصلاحات التعليمية، متفوقاً على MARBERT وCAMeLBERT [11]. في المقابل، تفوّق MARBERT على AraBERT بفارق 2.0% إلى 3.3% في F1-Micro في تحليل المشاعر الدقيق لتغريدات كوفيد-19 متعددة اللهجات، وعزا الباحثون ذلك إلى تدريبه على محتوى تويتر بأخطائه الإملائية واختصاراته [12]. ويورد [13] أن دمج MARBERT مع SVM حقق دقة 92.14% على مجموعة HEAR لتقييمات المستشفيات (أكثر من 31 ألف تقييم)، بينما تفوقت نماذج BERT متعددة الرؤوس، وفي مقدمتها AraBERT، على المصنفات التقليدية في تحليل الجوانب الفرعية لتقييمات المواقع السياحية [13]. وأشارت دراسة لتصنيف نصوص الجرائم الإلكترونية [14] إلى تباين الأدبيات بين مسارات تُظهر تفوق AraBERT وأخرى تُظهر تفوق MARBERT. ويتسق هذا النمط عبر الدراسات: يتفوق AraBERTv2 في المهام الموضوعية ذات الطابع المؤسسي شبه الرسمي، ويتفوق MARBERTv2 في المهام اللهجية العفوية.</w:t>
       </w:r>
     </w:p>
     <w:p>
@@ -17125,7 +17392,7 @@
           <w:szCs w:val="28"/>
           <w:rtl w:val="false"/>
         </w:rPr>
-        <w:t xml:space="preserve">[5] A. Elmadany, E. M. B. Nagoudi, and M. Abdul-Mageed, "ORCA: A challenging benchmark for Arabic language understanding," in Findings of the Association for Computational Linguistics: ACL 2023, 2023.</w:t>
+        <w:t xml:space="preserve">[5] A. Elmadany, E. M. B. Nagoudi, and M. Abdul-Mageed, "ORCA: A challenging benchmark for Arabic language understanding," in Findings of the Association for Computational Linguistics: ACL 2023, 2023, pp. 9559–9586.</w:t>
       </w:r>
     </w:p>
     <w:p>
@@ -17159,7 +17426,7 @@
           <w:szCs w:val="28"/>
           <w:rtl w:val="false"/>
         </w:rPr>
-        <w:t xml:space="preserve">[7] Z. Alyafeai, M. S. Al-shaibani, M. Ghaleb, and I. Ahmad, "Evaluating various tokenizers for Arabic text classification," arXiv preprint arXiv:2106.07540, 2021.</w:t>
+        <w:t xml:space="preserve">[7] Z. Alyafeai, M. S. Al-shaibani, M. Ghaleb, and I. Ahmad, "Evaluating various tokenizers for Arabic text classification," Neural Processing Letters, 2023, doi: 10.1007/s11063-022-10990-8.</w:t>
       </w:r>
     </w:p>
     <w:p>
@@ -17176,7 +17443,7 @@
           <w:szCs w:val="28"/>
           <w:rtl w:val="false"/>
         </w:rPr>
-        <w:t xml:space="preserve">[8] "Exploring tokenization strategies and vocabulary sizes for enhanced Arabic language models," arXiv preprint arXiv:2403.11130, 2024.</w:t>
+        <w:t xml:space="preserve">[8] M. T. Alrefaie, N. E. Morsy, and N. Samir, "Exploring tokenization strategies and vocabulary sizes for enhanced Arabic language models," arXiv preprint arXiv:2403.11130, 2024.</w:t>
       </w:r>
     </w:p>
     <w:p>
@@ -17193,7 +17460,7 @@
           <w:szCs w:val="28"/>
           <w:rtl w:val="false"/>
         </w:rPr>
-        <w:t xml:space="preserve">[9] "Comparing the performance of specialized BERT models in classifying Arabic news: AraBERT, CAMeLBERT, and mBERT," 2025.</w:t>
+        <w:t xml:space="preserve">[9] "Comparing the performance of specialized BERT models in classifying Arabic news: AraBERT, CAMeLBERT, and mBERT," ResearchGate preprint, 2025. [أسماء المؤلفين: يُرجى استكمالها]</w:t>
       </w:r>
     </w:p>
     <w:p>
@@ -17210,7 +17477,7 @@
           <w:szCs w:val="28"/>
           <w:rtl w:val="false"/>
         </w:rPr>
-        <w:t xml:space="preserve">[10] H. Alamoudi, "Arabic sentiment analysis for student evaluation using machine learning and the AraBERT transformer," Engineering, Technology &amp; Applied Science Research, vol. 13, no. 5, pp. 11945–11952, 2023.</w:t>
+        <w:t xml:space="preserve">[10] H. Alamoudi et al., "Arabic sentiment analysis for student evaluation using machine learning and the AraBERT transformer," Engineering, Technology &amp; Applied Science Research, vol. 13, no. 5, pp. 11945–11952, 2023.</w:t>
       </w:r>
     </w:p>
     <w:p>
@@ -17227,7 +17494,7 @@
           <w:szCs w:val="28"/>
           <w:rtl w:val="false"/>
         </w:rPr>
-        <w:t xml:space="preserve">[11] "Leveraging social media and deep learning for sentiment analysis for smart governance: A case study of public reactions to educational reforms in Saudi Arabia," Information, 2024.</w:t>
+        <w:t xml:space="preserve">[11] A. Alotaibi and F. Nadeem, "Leveraging social media and deep learning for sentiment analysis for smart governance: A case study of public reactions to educational reforms in Saudi Arabia," Computers, vol. 13, no. 11, p. 280, 2024.</w:t>
       </w:r>
     </w:p>
     <w:p>
@@ -17261,7 +17528,7 @@
           <w:szCs w:val="28"/>
           <w:rtl w:val="false"/>
         </w:rPr>
-        <w:t xml:space="preserve">[13] "Multi-aspect sentiment classification of Arabic tourism reviews using BERT and classical machine learning," Data, vol. 10, no. 11, p. 168, 2025.</w:t>
+        <w:t xml:space="preserve">[13] S. Zaid, A. H. Alharbi, and H. Samra, "Multi-aspect sentiment classification of Arabic tourism reviews using BERT and classical machine learning," Data, vol. 10, no. 11, p. 168, 2025.</w:t>
       </w:r>
     </w:p>
     <w:p>

</xml_diff>

<commit_message>
Research paper: restructure to Abstract/Introduction/Related Work/Methodology/Evaluation/Conclusion/References
Co-Authored-By: Claude Opus 5.5 (1M context) <noreply@anthropic.com>
</commit_message>
<xml_diff>
--- a/research-paper/البحث_العلمي_تصنيف_استفسارات_الطلاب.docx
+++ b/research-paper/البحث_العلمي_تصنيف_استفسارات_الطلاب.docx
@@ -83,7 +83,7 @@
           <w:szCs w:val="32"/>
           <w:rtl/>
         </w:rPr>
-        <w:t xml:space="preserve">الملخّص</w:t>
+        <w:t xml:space="preserve">الملخّص (Abstract)</w:t>
       </w:r>
     </w:p>
     <w:p>
@@ -144,7 +144,7 @@
           <w:szCs w:val="32"/>
           <w:rtl/>
         </w:rPr>
-        <w:t xml:space="preserve">1. المقدّمة</w:t>
+        <w:t xml:space="preserve">1. المقدّمة (Introduction)</w:t>
       </w:r>
     </w:p>
     <w:p>
@@ -319,7 +319,7 @@
           <w:szCs w:val="28"/>
           <w:rtl/>
         </w:rPr>
-        <w:t xml:space="preserve">تُنظَّم بقية البحث كما يلي: يستعرض القسم 2 الدراسات السابقة، ويصف القسم 3 مجموعة البيانات، ويعرض القسم 4 المنهجية التجريبية، ويقدّم القسم 5 النتائج، ويناقشها القسم 6، ويختم القسم 7 بالاستنتاجات والعمل المستقبلي.</w:t>
+        <w:t xml:space="preserve">تُنظَّم بقية البحث كما يلي: يستعرض القسم 2 الدراسات السابقة، ويعرض القسم 3 المنهجية بما فيها بناء مجموعة البيانات وبروتوكول التدريب، ويقدّم القسم 4 تقييم النماذج ومناقشة النتائج، ويختم القسم 5 بالاستنتاجات والعمل المستقبلي.</w:t>
       </w:r>
     </w:p>
     <w:p>
@@ -337,7 +337,7 @@
           <w:szCs w:val="32"/>
           <w:rtl/>
         </w:rPr>
-        <w:t xml:space="preserve">2. الدراسات السابقة</w:t>
+        <w:t xml:space="preserve">2. الدراسات السابقة (Related Work)</w:t>
       </w:r>
     </w:p>
     <w:p>
@@ -399,7 +399,7 @@
           <w:szCs w:val="28"/>
           <w:rtl/>
         </w:rPr>
-        <w:t xml:space="preserve"> محددات التدريب المسبق لـ AraBERTv2 وللإصدارين الأولين من ARBERT وMARBERT [3], [4]؛ وتُعرض بيانات الإصدارين الثانيين في القسم 4.1.</w:t>
+        <w:t xml:space="preserve"> محددات التدريب المسبق لـ AraBERTv2 وللإصدارين الأولين من ARBERT وMARBERT [3], [4]؛ وتُعرض بيانات الإصدارين الثانيين في القسم 3.5.</w:t>
       </w:r>
     </w:p>
     <w:tbl>
@@ -3458,7 +3458,23 @@
           <w:szCs w:val="32"/>
           <w:rtl/>
         </w:rPr>
-        <w:t xml:space="preserve">3. مجموعة البيانات</w:t>
+        <w:t xml:space="preserve">3. المنهجية (Methodology)</w:t>
+      </w:r>
+    </w:p>
+    <w:p>
+      <w:pPr>
+        <w:bidi/>
+        <w:spacing w:after="120" w:line="300"/>
+        <w:jc w:val="both"/>
+      </w:pPr>
+      <w:r>
+        <w:rPr>
+          <w:rFonts w:ascii="Times New Roman" w:hAnsi="Times New Roman" w:cs="Times New Roman" w:eastAsia="Times New Roman"/>
+          <w:sz w:val="28"/>
+          <w:szCs w:val="28"/>
+          <w:rtl/>
+        </w:rPr>
+        <w:t xml:space="preserve">يتألف المسار المنهجي لهذا البحث من مرحلتين: بناء مجموعة البيانات وتوصيفها (الأقسام 3.1–3.4)، ثم إعداد النماذج وبروتوكول التدريب والتقييم (الأقسام 3.5–3.11).</w:t>
       </w:r>
     </w:p>
     <w:p>
@@ -3476,7 +3492,7 @@
           <w:szCs w:val="28"/>
           <w:rtl/>
         </w:rPr>
-        <w:t xml:space="preserve">3.1 منهجية الجمع</w:t>
+        <w:t xml:space="preserve">3.1 جمع البيانات</w:t>
       </w:r>
     </w:p>
     <w:p>
@@ -5177,24 +5193,6 @@
     </w:p>
     <w:p>
       <w:pPr>
-        <w:pStyle w:val="Heading1"/>
-        <w:bidi/>
-        <w:spacing w:before="300" w:after="140"/>
-      </w:pPr>
-      <w:r>
-        <w:rPr>
-          <w:rFonts w:ascii="Times New Roman" w:hAnsi="Times New Roman" w:cs="Times New Roman" w:eastAsia="Times New Roman"/>
-          <w:b/>
-          <w:bCs/>
-          <w:sz w:val="32"/>
-          <w:szCs w:val="32"/>
-          <w:rtl/>
-        </w:rPr>
-        <w:t xml:space="preserve">4. المنهجية</w:t>
-      </w:r>
-    </w:p>
-    <w:p>
-      <w:pPr>
         <w:pStyle w:val="Heading2"/>
         <w:bidi/>
         <w:spacing w:before="200" w:after="100"/>
@@ -5208,7 +5206,7 @@
           <w:szCs w:val="28"/>
           <w:rtl/>
         </w:rPr>
-        <w:t xml:space="preserve">4.1 النماذج المعتمدة</w:t>
+        <w:t xml:space="preserve">3.5 النماذج المعتمدة</w:t>
       </w:r>
     </w:p>
     <w:p>
@@ -5846,7 +5844,7 @@
           <w:szCs w:val="28"/>
           <w:rtl/>
         </w:rPr>
-        <w:t xml:space="preserve">4.2 الضبط الدقيق والتمثيل النصي</w:t>
+        <w:t xml:space="preserve">3.6 الضبط الدقيق والتمثيل النصي</w:t>
       </w:r>
     </w:p>
     <w:p>
@@ -5880,7 +5878,7 @@
           <w:szCs w:val="28"/>
           <w:rtl/>
         </w:rPr>
-        <w:t xml:space="preserve">4.3 بروتوكول التقييم</w:t>
+        <w:t xml:space="preserve">3.7 بروتوكول التقييم</w:t>
       </w:r>
     </w:p>
     <w:p>
@@ -6461,7 +6459,7 @@
           <w:szCs w:val="28"/>
           <w:rtl/>
         </w:rPr>
-        <w:t xml:space="preserve">4.4 السيناريو الأول: معاملات فائقة موحّدة</w:t>
+        <w:t xml:space="preserve">3.8 السيناريو الأول: معاملات فائقة موحّدة</w:t>
       </w:r>
     </w:p>
     <w:p>
@@ -7276,7 +7274,7 @@
           <w:szCs w:val="28"/>
           <w:rtl/>
         </w:rPr>
-        <w:t xml:space="preserve">4.5 السيناريو الثاني: ضبط المعاملات بإطار Optuna</w:t>
+        <w:t xml:space="preserve">3.9 السيناريو الثاني: ضبط المعاملات بإطار Optuna</w:t>
       </w:r>
     </w:p>
     <w:p>
@@ -7518,7 +7516,7 @@
           <w:szCs w:val="28"/>
           <w:rtl/>
         </w:rPr>
-        <w:t xml:space="preserve">4.6 مقاييس الأداء</w:t>
+        <w:t xml:space="preserve">3.10 مقاييس الأداء</w:t>
       </w:r>
     </w:p>
     <w:p>
@@ -7603,7 +7601,7 @@
           <w:szCs w:val="28"/>
           <w:rtl/>
         </w:rPr>
-        <w:t xml:space="preserve">4.7 بيئة التنفيذ</w:t>
+        <w:t xml:space="preserve">3.11 بيئة التنفيذ</w:t>
       </w:r>
     </w:p>
     <w:p>
@@ -7637,7 +7635,23 @@
           <w:szCs w:val="32"/>
           <w:rtl/>
         </w:rPr>
-        <w:t xml:space="preserve">5. النتائج</w:t>
+        <w:t xml:space="preserve">4. التقييم (Evaluation)</w:t>
+      </w:r>
+    </w:p>
+    <w:p>
+      <w:pPr>
+        <w:bidi/>
+        <w:spacing w:after="120" w:line="300"/>
+        <w:jc w:val="both"/>
+      </w:pPr>
+      <w:r>
+        <w:rPr>
+          <w:rFonts w:ascii="Times New Roman" w:hAnsi="Times New Roman" w:cs="Times New Roman" w:eastAsia="Times New Roman"/>
+          <w:sz w:val="28"/>
+          <w:szCs w:val="28"/>
+          <w:rtl/>
+        </w:rPr>
+        <w:t xml:space="preserve">يعرض هذا القسم نتائج التجارب (الأقسام 4.1–4.5)، ثم يناقش دلالاتها وحدود البحث (الأقسام 4.6–4.10).</w:t>
       </w:r>
     </w:p>
     <w:p>
@@ -7655,7 +7669,7 @@
           <w:szCs w:val="28"/>
           <w:rtl/>
         </w:rPr>
-        <w:t xml:space="preserve">5.1 السيناريو الأول: معاملات موحّدة</w:t>
+        <w:t xml:space="preserve">4.1 السيناريو الأول: معاملات موحّدة</w:t>
       </w:r>
     </w:p>
     <w:p>
@@ -9797,7 +9811,7 @@
           <w:szCs w:val="28"/>
           <w:rtl/>
         </w:rPr>
-        <w:t xml:space="preserve">5.2 السيناريو الثاني: ضبط المعاملات بإطار Optuna</w:t>
+        <w:t xml:space="preserve">4.2 السيناريو الثاني: ضبط المعاملات بإطار Optuna</w:t>
       </w:r>
     </w:p>
     <w:p>
@@ -11460,7 +11474,7 @@
           <w:szCs w:val="28"/>
           <w:rtl/>
         </w:rPr>
-        <w:t xml:space="preserve">5.3 المقارنة بين السيناريوهين</w:t>
+        <w:t xml:space="preserve">4.3 المقارنة بين السيناريوهين</w:t>
       </w:r>
     </w:p>
     <w:p>
@@ -12442,7 +12456,7 @@
           <w:szCs w:val="28"/>
           <w:rtl/>
         </w:rPr>
-        <w:t xml:space="preserve">5.4 مصفوفات الارتباك والأداء حسب الفئة</w:t>
+        <w:t xml:space="preserve">4.4 مصفوفات الارتباك والأداء حسب الفئة</w:t>
       </w:r>
     </w:p>
     <w:p>
@@ -13291,7 +13305,7 @@
           <w:szCs w:val="28"/>
           <w:rtl/>
         </w:rPr>
-        <w:t xml:space="preserve">5.5 تحليل الأخطاء</w:t>
+        <w:t xml:space="preserve">4.5 تحليل الأخطاء</w:t>
       </w:r>
     </w:p>
     <w:p>
@@ -16730,20 +16744,36 @@
     </w:p>
     <w:p>
       <w:pPr>
-        <w:pStyle w:val="Heading1"/>
+        <w:pStyle w:val="Heading2"/>
         <w:bidi/>
-        <w:spacing w:before="300" w:after="140"/>
+        <w:spacing w:before="200" w:after="100"/>
       </w:pPr>
       <w:r>
         <w:rPr>
           <w:rFonts w:ascii="Times New Roman" w:hAnsi="Times New Roman" w:cs="Times New Roman" w:eastAsia="Times New Roman"/>
           <w:b/>
           <w:bCs/>
-          <w:sz w:val="32"/>
-          <w:szCs w:val="32"/>
+          <w:sz w:val="28"/>
+          <w:szCs w:val="28"/>
           <w:rtl/>
         </w:rPr>
-        <w:t xml:space="preserve">6. المناقشة</w:t>
+        <w:t xml:space="preserve">4.6 تفسير تفوق AraBERTv2</w:t>
+      </w:r>
+    </w:p>
+    <w:p>
+      <w:pPr>
+        <w:bidi/>
+        <w:spacing w:after="120" w:line="300"/>
+        <w:jc w:val="both"/>
+      </w:pPr>
+      <w:r>
+        <w:rPr>
+          <w:rFonts w:ascii="Times New Roman" w:hAnsi="Times New Roman" w:cs="Times New Roman" w:eastAsia="Times New Roman"/>
+          <w:sz w:val="28"/>
+          <w:szCs w:val="28"/>
+          <w:rtl/>
+        </w:rPr>
+        <w:t xml:space="preserve">يطرح تفوق AraBERTv2 تساؤلاً جوهرياً: كيف يتفوق نموذج مدرّب على الفصحى على نموذج مدرّب على العامية (MARBERTv2) في بيانات تحتوي على عامية سورية واضحة؟ يمكن تفسير ذلك بثلاثة عوامل متشابكة. أولاً، يحمل الاستفسار الجامعي حتى حين يُكتب بالعامية مفردات أكاديمية وإدارية فصيحة الجذر كـ«التسجيل» و«الامتحان» و«الرسوم» و«الاعتراض»، وهي مفردات يمثّلها AraBERTv2 بعمق لكثافتها في بيانات تدريبه. ثانياً، تميل العامية في الاستفسارات الجامعية إلى التخفيف اللهجي، فهي أقرب إلى الفصحى من عامية منصات التواصل التي دُرّب عليها MARBERT، ما يضيّق الفجوة التوزيعية. ثالثاً، يحتاج AraBERTv2 إلى عدد أكبر من حقب التدريب للتقارب، ما يشير إلى أنه يستخرج تمثيلات أكثر تدرجاً بدلاً من التقارب السريع على أنماط سطحية. وتتسق هذه التفسيرات مع أفضلية AraBERT في تصنيف المواضيع على معيار ARLUE [4] وفي المهام الموضوعية الرسمية [9], [11].</w:t>
       </w:r>
     </w:p>
     <w:p>
@@ -16761,7 +16791,7 @@
           <w:szCs w:val="28"/>
           <w:rtl/>
         </w:rPr>
-        <w:t xml:space="preserve">6.1 تفسير تفوق AraBERTv2</w:t>
+        <w:t xml:space="preserve">4.7 حساسية النماذج للمعاملات الفائقة</w:t>
       </w:r>
     </w:p>
     <w:p>
@@ -16777,7 +16807,7 @@
           <w:szCs w:val="28"/>
           <w:rtl/>
         </w:rPr>
-        <w:t xml:space="preserve">يطرح تفوق AraBERTv2 تساؤلاً جوهرياً: كيف يتفوق نموذج مدرّب على الفصحى على نموذج مدرّب على العامية (MARBERTv2) في بيانات تحتوي على عامية سورية واضحة؟ يمكن تفسير ذلك بثلاثة عوامل متشابكة. أولاً، يحمل الاستفسار الجامعي حتى حين يُكتب بالعامية مفردات أكاديمية وإدارية فصيحة الجذر كـ«التسجيل» و«الامتحان» و«الرسوم» و«الاعتراض»، وهي مفردات يمثّلها AraBERTv2 بعمق لكثافتها في بيانات تدريبه. ثانياً، تميل العامية في الاستفسارات الجامعية إلى التخفيف اللهجي، فهي أقرب إلى الفصحى من عامية منصات التواصل التي دُرّب عليها MARBERT، ما يضيّق الفجوة التوزيعية. ثالثاً، يحتاج AraBERTv2 إلى عدد أكبر من حقب التدريب للتقارب، ما يشير إلى أنه يستخرج تمثيلات أكثر تدرجاً بدلاً من التقارب السريع على أنماط سطحية. وتتسق هذه التفسيرات مع أفضلية AraBERT في تصنيف المواضيع على معيار ARLUE [4] وفي المهام الموضوعية الرسمية [9], [11].</w:t>
+        <w:t xml:space="preserve">غيّر ضبط المعاملات ترتيب النماذج: انتقل ARBERTv2 من المرتبة الأخيرة إلى الثانية، وتقلص الفارق بين الأول والأخير من 1.40 إلى 0.30 نقطة مئوية. ويشير ذلك إلى أن جزءاً من تأخر ARBERTv2 في السيناريو الأول مردّه عدم ملاءمة المعاملات الموحّدة لخصائصه التدريبية، لا قصور في تمثيله اللغوي؛ ويتسق هذا مع تقاربه المبكر جداً في السيناريو الأول. وتحمل المعاملات المثلى دلالة تفسيرية: فضّل MARBERTv2 تحديثات وزنية متكررة وحذرة (معدل تعلم منخفض ودفعات صغيرة) تلائم حساسية تمثيلاته المدرّبة على العامية عند نقلها إلى المجال الجامعي، بينما استفاد AraBERTv2 وARBERTv2 من معدلات أعلى ودفعات أكبر بما يعكس استقرار تمثيلاتهما الفصيحة الأقرب إلى مفردات الاستفسارات الأكاديمية. ومع ذلك، حافظ AraBERTv2 على صدارته تحت الشرطين، ما يمنح استنتاج تفوقه درجة عالية من الثبات.</w:t>
       </w:r>
     </w:p>
     <w:p>
@@ -16795,41 +16825,7 @@
           <w:szCs w:val="28"/>
           <w:rtl/>
         </w:rPr>
-        <w:t xml:space="preserve">6.2 حساسية النماذج للمعاملات الفائقة</w:t>
-      </w:r>
-    </w:p>
-    <w:p>
-      <w:pPr>
-        <w:bidi/>
-        <w:spacing w:after="120" w:line="300"/>
-        <w:jc w:val="both"/>
-      </w:pPr>
-      <w:r>
-        <w:rPr>
-          <w:rFonts w:ascii="Times New Roman" w:hAnsi="Times New Roman" w:cs="Times New Roman" w:eastAsia="Times New Roman"/>
-          <w:sz w:val="28"/>
-          <w:szCs w:val="28"/>
-          <w:rtl/>
-        </w:rPr>
-        <w:t xml:space="preserve">غيّر ضبط المعاملات ترتيب النماذج: انتقل ARBERTv2 من المرتبة الأخيرة إلى الثانية، وتقلص الفارق بين الأول والأخير من 1.40 إلى 0.30 نقطة مئوية. ويشير ذلك إلى أن جزءاً من تأخر ARBERTv2 في السيناريو الأول مردّه عدم ملاءمة المعاملات الموحّدة لخصائصه التدريبية، لا قصور في تمثيله اللغوي؛ ويتسق هذا مع تقاربه المبكر جداً في السيناريو الأول. وتحمل المعاملات المثلى دلالة تفسيرية: فضّل MARBERTv2 تحديثات وزنية متكررة وحذرة (معدل تعلم منخفض ودفعات صغيرة) تلائم حساسية تمثيلاته المدرّبة على العامية عند نقلها إلى المجال الجامعي، بينما استفاد AraBERTv2 وARBERTv2 من معدلات أعلى ودفعات أكبر بما يعكس استقرار تمثيلاتهما الفصيحة الأقرب إلى مفردات الاستفسارات الأكاديمية. ومع ذلك، حافظ AraBERTv2 على صدارته تحت الشرطين، ما يمنح استنتاج تفوقه درجة عالية من الثبات.</w:t>
-      </w:r>
-    </w:p>
-    <w:p>
-      <w:pPr>
-        <w:pStyle w:val="Heading2"/>
-        <w:bidi/>
-        <w:spacing w:before="200" w:after="100"/>
-      </w:pPr>
-      <w:r>
-        <w:rPr>
-          <w:rFonts w:ascii="Times New Roman" w:hAnsi="Times New Roman" w:cs="Times New Roman" w:eastAsia="Times New Roman"/>
-          <w:b/>
-          <w:bCs/>
-          <w:sz w:val="28"/>
-          <w:szCs w:val="28"/>
-          <w:rtl/>
-        </w:rPr>
-        <w:t xml:space="preserve">6.3 مصادر الالتباس الدلالي</w:t>
+        <w:t xml:space="preserve">4.8 مصادر الالتباس الدلالي</w:t>
       </w:r>
     </w:p>
     <w:p>
@@ -16975,7 +16971,7 @@
           <w:szCs w:val="28"/>
           <w:rtl/>
         </w:rPr>
-        <w:t xml:space="preserve">6.4 الدلالات المنهجية والتطبيقية</w:t>
+        <w:t xml:space="preserve">4.9 الدلالات المنهجية والتطبيقية</w:t>
       </w:r>
     </w:p>
     <w:p>
@@ -17009,7 +17005,7 @@
           <w:szCs w:val="28"/>
           <w:rtl/>
         </w:rPr>
-        <w:t xml:space="preserve">6.5 حدود البحث</w:t>
+        <w:t xml:space="preserve">4.10 حدود البحث</w:t>
       </w:r>
     </w:p>
     <w:p>
@@ -17155,7 +17151,7 @@
           <w:szCs w:val="32"/>
           <w:rtl/>
         </w:rPr>
-        <w:t xml:space="preserve">7. الخلاصة والعمل المستقبلي</w:t>
+        <w:t xml:space="preserve">5. الخلاصة (Conclusion)</w:t>
       </w:r>
     </w:p>
     <w:p>
@@ -17187,7 +17183,7 @@
           <w:szCs w:val="28"/>
           <w:rtl/>
         </w:rPr>
-        <w:t xml:space="preserve">ونقترح للعمل المستقبلي: (1) توسيع مجموعة البيانات لتشمل جامعات ولهجات وفئات أخرى؛ (2) إثراء البيانات بأمثلة للحالات الحدية ودراسة التصنيف الهرمي ومتعدد الوسوم؛ (3) إعادة التدريب الدوري للنموذج بالاستفسارات التي صحّح الموظفون توجيهها يدوياً؛ (4) تطوير وحدة إجابة آلية عن الاستفسارات العامة المرتبطة باللوائح الجامعية اعتماداً على نماذج الإجابة عن الأسئلة أو التوليد المعزز بالاسترجاع؛ (5) دمج تحليل المشاعر لترتيب أولوية الاستفسارات بحسب درجة استعجال الطالب.</w:t>
+        <w:t xml:space="preserve">ونقترح للعمل المستقبلي: (1) توسيع مجموعة البيانات لتشمل جامعات ولهجات وفئات أخرى؛ (2) إثراء البيانات بأمثلة للحالات الحدية ودراسة التصنيف الهرمي ومتعدد الوسوم؛ (3) إعادة التدريب الدوري للنموذج بالاستفسارات التي صحّح الموظفون توجيهها يدوياً؛ (4) تطوير وحدة إجابة آلية عن الاستفسارات العامة المرتبطة باللوائح الجامعية اعتماداً على نماذج الإجابة عن الأسئلة أو التوليد المعزز بالاسترجاع؛ (5) دمج تحليل المشاعر لترتيب أولوية الاستفسارات بحسب درجة استعجال الطالب. ومجموعة البيانات متاحة على منصة Hugging Face بالمعرّف daliaalkelani/University_Student_Inquiries_Dataset_new3، وشيفرة التجارب متاحة في المستودع https://github.com/Daliaalkilani/Arabic-Nlp-University-Routing.</w:t>
       </w:r>
     </w:p>
     <w:p>
@@ -17205,109 +17201,7 @@
           <w:szCs w:val="32"/>
           <w:rtl/>
         </w:rPr>
-        <w:t xml:space="preserve">توافر البيانات والشيفرة</w:t>
-      </w:r>
-    </w:p>
-    <w:p>
-      <w:pPr>
-        <w:bidi/>
-        <w:spacing w:after="120" w:line="300"/>
-        <w:jc w:val="both"/>
-      </w:pPr>
-      <w:r>
-        <w:rPr>
-          <w:rFonts w:ascii="Times New Roman" w:hAnsi="Times New Roman" w:cs="Times New Roman" w:eastAsia="Times New Roman"/>
-          <w:sz w:val="28"/>
-          <w:szCs w:val="28"/>
-          <w:rtl/>
-        </w:rPr>
-        <w:t xml:space="preserve">مجموعة البيانات متاحة على منصة Hugging Face بالمعرّف daliaalkelani/University_Student_Inquiries_Dataset_new3، وشيفرة التجارب متاحة في المستودع: https://github.com/Daliaalkilani/Arabic-Nlp-University-Routing</w:t>
-      </w:r>
-    </w:p>
-    <w:p>
-      <w:pPr>
-        <w:pStyle w:val="Heading1"/>
-        <w:bidi/>
-        <w:spacing w:before="300" w:after="140"/>
-      </w:pPr>
-      <w:r>
-        <w:rPr>
-          <w:rFonts w:ascii="Times New Roman" w:hAnsi="Times New Roman" w:cs="Times New Roman" w:eastAsia="Times New Roman"/>
-          <w:b/>
-          <w:bCs/>
-          <w:sz w:val="32"/>
-          <w:szCs w:val="32"/>
-          <w:rtl/>
-        </w:rPr>
-        <w:t xml:space="preserve">شكر وتقدير</w:t>
-      </w:r>
-    </w:p>
-    <w:p>
-      <w:pPr>
-        <w:bidi/>
-        <w:spacing w:after="120" w:line="300"/>
-        <w:jc w:val="both"/>
-      </w:pPr>
-      <w:r>
-        <w:rPr>
-          <w:rFonts w:ascii="Times New Roman" w:hAnsi="Times New Roman" w:cs="Times New Roman" w:eastAsia="Times New Roman"/>
-          <w:sz w:val="28"/>
-          <w:szCs w:val="28"/>
-          <w:rtl/>
-        </w:rPr>
-        <w:t xml:space="preserve">يشكر المؤلفون موظفي مكاتب الشؤون المالية وشؤون الطلاب والمعلوماتية والامتحانات في الجامعة الوطنية الخاصة على تعاونهم في مرحلة الجمع الميداني.</w:t>
-      </w:r>
-    </w:p>
-    <w:p>
-      <w:pPr>
-        <w:pStyle w:val="Heading1"/>
-        <w:bidi/>
-        <w:spacing w:before="300" w:after="140"/>
-      </w:pPr>
-      <w:r>
-        <w:rPr>
-          <w:rFonts w:ascii="Times New Roman" w:hAnsi="Times New Roman" w:cs="Times New Roman" w:eastAsia="Times New Roman"/>
-          <w:b/>
-          <w:bCs/>
-          <w:sz w:val="32"/>
-          <w:szCs w:val="32"/>
-          <w:rtl/>
-        </w:rPr>
-        <w:t xml:space="preserve">تضارب المصالح</w:t>
-      </w:r>
-    </w:p>
-    <w:p>
-      <w:pPr>
-        <w:bidi/>
-        <w:spacing w:after="120" w:line="300"/>
-        <w:jc w:val="both"/>
-      </w:pPr>
-      <w:r>
-        <w:rPr>
-          <w:rFonts w:ascii="Times New Roman" w:hAnsi="Times New Roman" w:cs="Times New Roman" w:eastAsia="Times New Roman"/>
-          <w:sz w:val="28"/>
-          <w:szCs w:val="28"/>
-          <w:rtl/>
-        </w:rPr>
-        <w:t xml:space="preserve">يصرّح المؤلفون بعدم وجود أي تضارب في المصالح.</w:t>
-      </w:r>
-    </w:p>
-    <w:p>
-      <w:pPr>
-        <w:pStyle w:val="Heading1"/>
-        <w:bidi/>
-        <w:spacing w:before="300" w:after="140"/>
-      </w:pPr>
-      <w:r>
-        <w:rPr>
-          <w:rFonts w:ascii="Times New Roman" w:hAnsi="Times New Roman" w:cs="Times New Roman" w:eastAsia="Times New Roman"/>
-          <w:b/>
-          <w:bCs/>
-          <w:sz w:val="32"/>
-          <w:szCs w:val="32"/>
-          <w:rtl/>
-        </w:rPr>
-        <w:t xml:space="preserve">المراجع</w:t>
+        <w:t xml:space="preserve">المراجع (References)</w:t>
       </w:r>
     </w:p>
     <w:p>

</xml_diff>

<commit_message>
Research paper: drop unpublished news-classification reference and renumber
Co-Authored-By: Claude Opus 5.5 (1M context) <noreply@anthropic.com>
</commit_message>
<xml_diff>
--- a/research-paper/البحث_العلمي_تصنيف_استفسارات_الطلاب.docx
+++ b/research-paper/البحث_العلمي_تصنيف_استفسارات_الطلاب.docx
@@ -1009,7 +1009,7 @@
           <w:szCs w:val="28"/>
           <w:rtl/>
         </w:rPr>
-        <w:t xml:space="preserve">يُخضِع AraBERTv2 النص لمعالجة صرفية مسبقة بأداة Farasa تفكك الكلمة إلى سوابقها وجذعها ولواحقها قبل تمريرها إلى مجزّئ SentencePiece [3], [15]؛ فتُفكَّك كلمة «اللغة» مثلاً إلى «ال + لغ + ة». ويقلل هذا التصميم تضخم القاموس الناجم عن الطبيعة الالتصاقية للعربية، ويحسّن تعميم الفهم بين الصيغ المشتقة من الجذر ذاته. أما ARBERTv2 وMARBERTv2 فيطبقان خوارزمية WordPiece مباشرة على النص الخام [4]. وقد خلصت دراسة لاستراتيجيات التجزئة العربية إلى أن دمج ترميز زوج البايتات (BPE) مع التجزئة الصرفية لأداة Farasa يتفوق في مهام متعددة منها تصنيف الأخبار، لكنها رصدت أيضاً تراجع الأداء في تحليل المشاعر بسبب صعوبات تجزئة البنى اللهجية [8]. وأظهرت دراسة أخرى أنه لا يوجد مجزّئ يتفوق في كل الحالات، وأن الأداء يتوقف على حجم البيانات ونوع المهمة ودرجة الغنى الصرفي للنص [7]. وهذا يعني أن الميزة الصرفية لـ AraBERTv2 قد تتحول إلى نقطة ضعف كلما ابتعد النص عن الفصحى، وهو احتمال قائم في الاستفسارات الطلابية. ومن جهة أخرى، دُرّب AraBERTv2 على تسلسلات تصل إلى 512 رمزاً، بينما اقتصر تدريب ARBERT وMARBERT الأصليين على 128 رمزاً تماشياً مع قِصر التغريدات [4].</w:t>
+        <w:t xml:space="preserve">يُخضِع AraBERTv2 النص لمعالجة صرفية مسبقة بأداة Farasa تفكك الكلمة إلى سوابقها وجذعها ولواحقها قبل تمريرها إلى مجزّئ SentencePiece [3], [14]؛ فتُفكَّك كلمة «اللغة» مثلاً إلى «ال + لغ + ة». ويقلل هذا التصميم تضخم القاموس الناجم عن الطبيعة الالتصاقية للعربية، ويحسّن تعميم الفهم بين الصيغ المشتقة من الجذر ذاته. أما ARBERTv2 وMARBERTv2 فيطبقان خوارزمية WordPiece مباشرة على النص الخام [4]. وقد خلصت دراسة لاستراتيجيات التجزئة العربية إلى أن دمج ترميز زوج البايتات (BPE) مع التجزئة الصرفية لأداة Farasa يتفوق في مهام متعددة منها تصنيف الأخبار، لكنها رصدت أيضاً تراجع الأداء في تحليل المشاعر بسبب صعوبات تجزئة البنى اللهجية [8]. وأظهرت دراسة أخرى أنه لا يوجد مجزّئ يتفوق في كل الحالات، وأن الأداء يتوقف على حجم البيانات ونوع المهمة ودرجة الغنى الصرفي للنص [7]. وهذا يعني أن الميزة الصرفية لـ AraBERTv2 قد تتحول إلى نقطة ضعف كلما ابتعد النص عن الفصحى، وهو احتمال قائم في الاستفسارات الطلابية. ومن جهة أخرى، دُرّب AraBERTv2 على تسلسلات تصل إلى 512 رمزاً، بينما اقتصر تدريب ARBERT وMARBERT الأصليين على 128 رمزاً تماشياً مع قِصر التغريدات [4].</w:t>
       </w:r>
     </w:p>
     <w:p>
@@ -3390,7 +3390,7 @@
           <w:szCs w:val="28"/>
           <w:rtl/>
         </w:rPr>
-        <w:t xml:space="preserve">خلصت مراجعة منهجية لنماذج BERT العربية في تصنيف النصوص [6] إلى أن MARBERT هو الأفضل أداءً بحسب عدد مرات تفوقه على النماذج الأخرى، يليه QARiB ثم ARBERT ثم AraBERT، وعزت ذلك إلى أن معظم مجموعات الاختبار المشمولة تحتوي نصوصاً لهجية، لكنها تجمع نتائج من بيئات تجريبية متباينة في المعاملات الفائقة وأحجام البيانات وبروتوكولات التقييم، فتصلح مؤشراً لاتجاه عام لا أرقاماً قابلة للمقارنة المباشرة. وفي تصنيف الأخبار، أفادت دراسة منشورة كمسودة بحثية بتفوق AraBERT بدقة 96.04% على CAMeLBERT (94.18%) وmBERT (94.14%) على مجموعة متوازنة من نحو 68 ألف مقال مع معاملات فائقة موحّدة [9].</w:t>
+        <w:t xml:space="preserve">خلصت مراجعة منهجية لنماذج BERT العربية في تصنيف النصوص [6] إلى أن MARBERT هو الأفضل أداءً بحسب عدد مرات تفوقه على النماذج الأخرى، يليه QARiB ثم ARBERT ثم AraBERT، وعزت ذلك إلى أن معظم مجموعات الاختبار المشمولة تحتوي نصوصاً لهجية، لكنها تجمع نتائج من بيئات تجريبية متباينة في المعاملات الفائقة وأحجام البيانات وبروتوكولات التقييم، فتصلح مؤشراً لاتجاه عام لا أرقاماً قابلة للمقارنة المباشرة.</w:t>
       </w:r>
     </w:p>
     <w:p>
@@ -3406,7 +3406,7 @@
           <w:szCs w:val="28"/>
           <w:rtl/>
         </w:rPr>
-        <w:t xml:space="preserve">وفي السياقات التعليمية، حقق AraBERT دقة 78% في تحليل مشاعر الطلاب تجاه تقييم أعضاء هيئة التدريس [10]، وحقق بعد الضبط الدقيق F1 يساوي 0.89 في تحليل التغريدات المرتبطة بالإصلاحات التعليمية، متفوقاً على MARBERT وCAMeLBERT [11]. في المقابل، تفوّق MARBERT على AraBERT بفارق 2.0% إلى 3.3% في F1-Micro في تحليل المشاعر الدقيق لتغريدات كوفيد-19 متعددة اللهجات، وعزا الباحثون ذلك إلى تدريبه على محتوى تويتر بأخطائه الإملائية واختصاراته [12]. ويورد [13] أن دمج MARBERT مع SVM حقق دقة 92.14% على مجموعة HEAR لتقييمات المستشفيات (أكثر من 31 ألف تقييم)، بينما تفوقت نماذج BERT متعددة الرؤوس، وفي مقدمتها AraBERT، على المصنفات التقليدية في تحليل الجوانب الفرعية لتقييمات المواقع السياحية [13]. وأشارت دراسة لتصنيف نصوص الجرائم الإلكترونية [14] إلى تباين الأدبيات بين مسارات تُظهر تفوق AraBERT وأخرى تُظهر تفوق MARBERT. ويتسق هذا النمط عبر الدراسات: يتفوق AraBERTv2 في المهام الموضوعية ذات الطابع المؤسسي شبه الرسمي، ويتفوق MARBERTv2 في المهام اللهجية العفوية.</w:t>
+        <w:t xml:space="preserve">وفي السياقات التعليمية، حقق AraBERT دقة 78% في تحليل مشاعر الطلاب تجاه تقييم أعضاء هيئة التدريس [9]، وحقق بعد الضبط الدقيق F1 يساوي 0.89 في تحليل التغريدات المرتبطة بالإصلاحات التعليمية، متفوقاً على MARBERT وCAMeLBERT [10]. في المقابل، تفوّق MARBERT على AraBERT بفارق 2.0% إلى 3.3% في F1-Micro في تحليل المشاعر الدقيق لتغريدات كوفيد-19 متعددة اللهجات، وعزا الباحثون ذلك إلى تدريبه على محتوى تويتر بأخطائه الإملائية واختصاراته [11]. ويورد [12] أن دمج MARBERT مع SVM حقق دقة 92.14% على مجموعة HEAR لتقييمات المستشفيات (أكثر من 31 ألف تقييم)، بينما تفوقت نماذج BERT متعددة الرؤوس، وفي مقدمتها AraBERT، على المصنفات التقليدية في تحليل الجوانب الفرعية لتقييمات المواقع السياحية [12]. وأشارت دراسة لتصنيف نصوص الجرائم الإلكترونية [13] إلى تباين الأدبيات بين مسارات تُظهر تفوق AraBERT وأخرى تُظهر تفوق MARBERT. ويتسق هذا النمط عبر الدراسات: يتفوق AraBERTv2 في المهام الموضوعية ذات الطابع المؤسسي شبه الرسمي، ويتفوق MARBERTv2 في المهام اللهجية العفوية.</w:t>
       </w:r>
     </w:p>
     <w:p>
@@ -3440,7 +3440,7 @@
           <w:szCs w:val="28"/>
           <w:rtl/>
         </w:rPr>
-        <w:t xml:space="preserve">تتباين منهجيات التقييم في الدراسات المستعرضة تبايناً يحدّ من المقارنة المباشرة بين نتائجها: فبعضها يعتمد تقسيماً ثابتاً وحيداً للبيانات فتحمل نتائجه تبايناً عشوائياً ناجماً عن التقسيم ذاته [4], [9]؛ وبعضها يُبلغ الدقة الكلية فقط وبعضها F1-Macro وبعضها F1 لفئة واحدة؛ كما تتفاوت أحجام البيانات من بضعة آلاف إلى مئات الآلاف [9], [11]. وفوق ذلك، لم تتناول أيٌّ من الدراسات القائمة تصنيف الاستفسارات الجامعية الإدارية، وهي نصوص تحمل بصمة لغوية خاصة: مضمون موضوعي إداري واضح ومفردات مؤسسية فصيحة، بصياغة عامية دارجة. ويعالج هذا البحث هذه الفجوة بمقارنة مستقلة بين النماذج الثلاثة على هذه البيئة اللغوية، بتحقق متقاطع طبقي خماسي يتجاوز قيد التقسيم الوحيد.</w:t>
+        <w:t xml:space="preserve">تتباين منهجيات التقييم في الدراسات المستعرضة تبايناً يحدّ من المقارنة المباشرة بين نتائجها: فبعضها يعتمد تقسيماً ثابتاً وحيداً للبيانات فتحمل نتائجه تبايناً عشوائياً ناجماً عن التقسيم ذاته [4]؛ وبعضها يُبلغ الدقة الكلية فقط وبعضها F1-Macro وبعضها F1 لفئة واحدة؛ كما تتفاوت أحجام البيانات من بضعة آلاف إلى مئات الآلاف [10]. وفوق ذلك، لم تتناول أيٌّ من الدراسات القائمة تصنيف الاستفسارات الجامعية الإدارية، وهي نصوص تحمل بصمة لغوية خاصة: مضمون موضوعي إداري واضح ومفردات مؤسسية فصيحة، بصياغة عامية دارجة. ويعالج هذا البحث هذه الفجوة بمقارنة مستقلة بين النماذج الثلاثة على هذه البيئة اللغوية، بتحقق متقاطع طبقي خماسي يتجاوز قيد التقسيم الوحيد.</w:t>
       </w:r>
     </w:p>
     <w:p>
@@ -5860,7 +5860,7 @@
           <w:szCs w:val="28"/>
           <w:rtl/>
         </w:rPr>
-        <w:t xml:space="preserve">مُرّرت النصوص إلى المجزّئ الخاص بكل نموذج لضمان التوافق مع قاموسه، بحد أقصى للطول قدره 128 رمزاً، وهو حد ملائم لقِصر غالبية الاستفسارات. وتُقطع النصوص الأطول من نهايتها للحفاظ على بداية الاستفسار، وأُدير الحشو ديناميكياً على مستوى الدفعة (DataCollatorWithPadding) لتقليل الكلفة الحسابية. واعتُمد الضبط الدقيق الكامل (Full Fine-Tuning) الذي تُحدَّث فيه أوزان جميع الطبقات، بما يتيح للنموذج التكيف مع الطابع العامي الهجين للبيانات الذي قد يختلف عن توزيع بيانات التدريب المسبق. وأُضيفت فوق مخرجات النموذج طبقة تصنيف خطية بأربعة عصبونات تقابل الفئات الأربع، تُطبَّق على مخرجاتها دالة argmax لتحديد الفئة المتنبأ بها، باستخدام الصنف AutoModelForSequenceClassification من مكتبة Transformers [17].</w:t>
+        <w:t xml:space="preserve">مُرّرت النصوص إلى المجزّئ الخاص بكل نموذج لضمان التوافق مع قاموسه، بحد أقصى للطول قدره 128 رمزاً، وهو حد ملائم لقِصر غالبية الاستفسارات. وتُقطع النصوص الأطول من نهايتها للحفاظ على بداية الاستفسار، وأُدير الحشو ديناميكياً على مستوى الدفعة (DataCollatorWithPadding) لتقليل الكلفة الحسابية. واعتُمد الضبط الدقيق الكامل (Full Fine-Tuning) الذي تُحدَّث فيه أوزان جميع الطبقات، بما يتيح للنموذج التكيف مع الطابع العامي الهجين للبيانات الذي قد يختلف عن توزيع بيانات التدريب المسبق. وأُضيفت فوق مخرجات النموذج طبقة تصنيف خطية بأربعة عصبونات تقابل الفئات الأربع، تُطبَّق على مخرجاتها دالة argmax لتحديد الفئة المتنبأ بها، باستخدام الصنف AutoModelForSequenceClassification من مكتبة Transformers [16].</w:t>
       </w:r>
     </w:p>
     <w:p>
@@ -5894,7 +5894,7 @@
           <w:szCs w:val="28"/>
           <w:rtl/>
         </w:rPr>
-        <w:t xml:space="preserve">اعتُمد تحقق متقاطع طبقي خماسي (Stratified 5-Fold Cross-Validation) بديلاً عن التقسيم الثنائي التقليدي، باستخدام StratifiedKFold وStratifiedShuffleSplit من مكتبة scikit-learn [18]. يُخصَّص في كل دورة جزء واحد للاختبار، ويُقتطع من بيانات التدريب الباقية جزء طبقي بنسبة 10% للتحقق ولتوجيه التوقف المبكر (الجدول 6). وثُبّتت الفولدات الخمسة مرة واحدة قبل تدريب أي نموذج، فخضعت النماذج الثلاثة لتقسيمات متطابقة. وتُحسب المقاييس النهائية متوسطاً عبر الفولدات الخمسة، وتُجمّع تنبؤات الفولدات لبناء مصفوفة ارتباك واحدة تغطي العينات الألفين.</w:t>
+        <w:t xml:space="preserve">اعتُمد تحقق متقاطع طبقي خماسي (Stratified 5-Fold Cross-Validation) بديلاً عن التقسيم الثنائي التقليدي، باستخدام StratifiedKFold وStratifiedShuffleSplit من مكتبة scikit-learn [17]. يُخصَّص في كل دورة جزء واحد للاختبار، ويُقتطع من بيانات التدريب الباقية جزء طبقي بنسبة 10% للتحقق ولتوجيه التوقف المبكر (الجدول 6). وثُبّتت الفولدات الخمسة مرة واحدة قبل تدريب أي نموذج، فخضعت النماذج الثلاثة لتقسيمات متطابقة. وتُحسب المقاييس النهائية متوسطاً عبر الفولدات الخمسة، وتُجمّع تنبؤات الفولدات لبناء مصفوفة ارتباك واحدة تغطي العينات الألفين.</w:t>
       </w:r>
     </w:p>
     <w:p>
@@ -6475,7 +6475,7 @@
           <w:szCs w:val="28"/>
           <w:rtl/>
         </w:rPr>
-        <w:t xml:space="preserve">طُبّقت معاملات فائقة موحّدة على النماذج الثلاثة (الجدول 7) لضمان عدالة المقارنة وإزالة أي تحيز ناجم عن اختلاف إعدادات التدريب. ولتفادي الإفراط في التخصيص، اعتُمد التوقف المبكر (EarlyStoppingCallback) بصبر قدره حقبتان: يتوقف التدريب إذا لم تتحسن خسارة التحقق على مدى حقبتين متتاليتين، وتُستعاد أوزان أفضل حقبة (load_best_model_at_end). ولضمان قابلية الاستنساخ، ثُبّتت البذرة (42) على مستوى مكتبات random وNumPy وPyTorch [19] على المعالجين المركزي والرسومي ومتغيرات البيئة، إضافة إلى data_seed داخل إعدادات التدريب.</w:t>
+        <w:t xml:space="preserve">طُبّقت معاملات فائقة موحّدة على النماذج الثلاثة (الجدول 7) لضمان عدالة المقارنة وإزالة أي تحيز ناجم عن اختلاف إعدادات التدريب. ولتفادي الإفراط في التخصيص، اعتُمد التوقف المبكر (EarlyStoppingCallback) بصبر قدره حقبتان: يتوقف التدريب إذا لم تتحسن خسارة التحقق على مدى حقبتين متتاليتين، وتُستعاد أوزان أفضل حقبة (load_best_model_at_end). ولضمان قابلية الاستنساخ، ثُبّتت البذرة (42) على مستوى مكتبات random وNumPy وPyTorch [18] على المعالجين المركزي والرسومي ومتغيرات البيئة، إضافة إلى data_seed داخل إعدادات التدريب.</w:t>
       </w:r>
     </w:p>
     <w:p>
@@ -7290,7 +7290,7 @@
           <w:szCs w:val="28"/>
           <w:rtl/>
         </w:rPr>
-        <w:t xml:space="preserve">لاختبار ثبات نتيجة المقارنة عندما يعمل كل نموذج بأفضل إعداداته، ضُبطت المعاملات الفائقة لكل نموذج على حدة بإطار Optuna [16]، مع مطابقة البروتوكول التدريبي للسيناريو الأول في كل ما عدا المعاملات الخاضعة للضبط:</w:t>
+        <w:t xml:space="preserve">لاختبار ثبات نتيجة المقارنة عندما يعمل كل نموذج بأفضل إعداداته، ضُبطت المعاملات الفائقة لكل نموذج على حدة بإطار Optuna [15]، مع مطابقة البروتوكول التدريبي للسيناريو الأول في كل ما عدا المعاملات الخاضعة للضبط:</w:t>
       </w:r>
     </w:p>
     <w:p>
@@ -7617,7 +7617,7 @@
           <w:szCs w:val="28"/>
           <w:rtl/>
         </w:rPr>
-        <w:t xml:space="preserve">نُفّذت التجارب على منصة Google Colab بوحدة معالجة رسومية، باستخدام منظومة Hugging Face (مكتبتا Transformers [17] وDatasets)، وإطار PyTorch [19]، ومكتبة scikit-learn [18] لتقسيم البيانات وحساب المقاييس، وإطار Optuna [16] لضبط المعاملات.</w:t>
+        <w:t xml:space="preserve">نُفّذت التجارب على منصة Google Colab بوحدة معالجة رسومية، باستخدام منظومة Hugging Face (مكتبتا Transformers [16] وDatasets)، وإطار PyTorch [18]، ومكتبة scikit-learn [17] لتقسيم البيانات وحساب المقاييس، وإطار Optuna [15] لضبط المعاملات.</w:t>
       </w:r>
     </w:p>
     <w:p>
@@ -16773,7 +16773,7 @@
           <w:szCs w:val="28"/>
           <w:rtl/>
         </w:rPr>
-        <w:t xml:space="preserve">يطرح تفوق AraBERTv2 تساؤلاً جوهرياً: كيف يتفوق نموذج مدرّب على الفصحى على نموذج مدرّب على العامية (MARBERTv2) في بيانات تحتوي على عامية سورية واضحة؟ يمكن تفسير ذلك بثلاثة عوامل متشابكة. أولاً، يحمل الاستفسار الجامعي حتى حين يُكتب بالعامية مفردات أكاديمية وإدارية فصيحة الجذر كـ«التسجيل» و«الامتحان» و«الرسوم» و«الاعتراض»، وهي مفردات يمثّلها AraBERTv2 بعمق لكثافتها في بيانات تدريبه. ثانياً، تميل العامية في الاستفسارات الجامعية إلى التخفيف اللهجي، فهي أقرب إلى الفصحى من عامية منصات التواصل التي دُرّب عليها MARBERT، ما يضيّق الفجوة التوزيعية. ثالثاً، يحتاج AraBERTv2 إلى عدد أكبر من حقب التدريب للتقارب، ما يشير إلى أنه يستخرج تمثيلات أكثر تدرجاً بدلاً من التقارب السريع على أنماط سطحية. وتتسق هذه التفسيرات مع أفضلية AraBERT في تصنيف المواضيع على معيار ARLUE [4] وفي المهام الموضوعية الرسمية [9], [11].</w:t>
+        <w:t xml:space="preserve">يطرح تفوق AraBERTv2 تساؤلاً جوهرياً: كيف يتفوق نموذج مدرّب على الفصحى على نموذج مدرّب على العامية (MARBERTv2) في بيانات تحتوي على عامية سورية واضحة؟ يمكن تفسير ذلك بثلاثة عوامل متشابكة. أولاً، يحمل الاستفسار الجامعي حتى حين يُكتب بالعامية مفردات أكاديمية وإدارية فصيحة الجذر كـ«التسجيل» و«الامتحان» و«الرسوم» و«الاعتراض»، وهي مفردات يمثّلها AraBERTv2 بعمق لكثافتها في بيانات تدريبه. ثانياً، تميل العامية في الاستفسارات الجامعية إلى التخفيف اللهجي، فهي أقرب إلى الفصحى من عامية منصات التواصل التي دُرّب عليها MARBERT، ما يضيّق الفجوة التوزيعية. ثالثاً، يحتاج AraBERTv2 إلى عدد أكبر من حقب التدريب للتقارب، ما يشير إلى أنه يستخرج تمثيلات أكثر تدرجاً بدلاً من التقارب السريع على أنماط سطحية. وتتسق هذه التفسيرات مع أفضلية AraBERT في تصنيف المواضيع على معيار ARLUE [4] وفي المهام ذات الطابع المؤسسي الرسمي [10].</w:t>
       </w:r>
     </w:p>
     <w:p>
@@ -17354,7 +17354,7 @@
           <w:szCs w:val="28"/>
           <w:rtl w:val="false"/>
         </w:rPr>
-        <w:t xml:space="preserve">[9] "Comparing the performance of specialized BERT models in classifying Arabic news: AraBERT, CAMeLBERT, and mBERT," ResearchGate preprint, 2025. [أسماء المؤلفين: يُرجى استكمالها]</w:t>
+        <w:t xml:space="preserve">[9] H. Alamoudi et al., "Arabic sentiment analysis for student evaluation using machine learning and the AraBERT transformer," Engineering, Technology &amp; Applied Science Research, vol. 13, no. 5, pp. 11945–11952, 2023.</w:t>
       </w:r>
     </w:p>
     <w:p>
@@ -17371,7 +17371,7 @@
           <w:szCs w:val="28"/>
           <w:rtl w:val="false"/>
         </w:rPr>
-        <w:t xml:space="preserve">[10] H. Alamoudi et al., "Arabic sentiment analysis for student evaluation using machine learning and the AraBERT transformer," Engineering, Technology &amp; Applied Science Research, vol. 13, no. 5, pp. 11945–11952, 2023.</w:t>
+        <w:t xml:space="preserve">[10] A. Alotaibi and F. Nadeem, "Leveraging social media and deep learning for sentiment analysis for smart governance: A case study of public reactions to educational reforms in Saudi Arabia," Computers, vol. 13, no. 11, p. 280, 2024.</w:t>
       </w:r>
     </w:p>
     <w:p>
@@ -17388,7 +17388,7 @@
           <w:szCs w:val="28"/>
           <w:rtl w:val="false"/>
         </w:rPr>
-        <w:t xml:space="preserve">[11] A. Alotaibi and F. Nadeem, "Leveraging social media and deep learning for sentiment analysis for smart governance: A case study of public reactions to educational reforms in Saudi Arabia," Computers, vol. 13, no. 11, p. 280, 2024.</w:t>
+        <w:t xml:space="preserve">[11] N. S. Alturayeif and H. Luqman, "Fine-grained sentiment analysis of Arabic COVID-19 tweets using BERT-based transformers and dynamically weighted loss function," Applied Sciences, vol. 11, no. 22, p. 10694, 2021.</w:t>
       </w:r>
     </w:p>
     <w:p>
@@ -17405,7 +17405,7 @@
           <w:szCs w:val="28"/>
           <w:rtl w:val="false"/>
         </w:rPr>
-        <w:t xml:space="preserve">[12] N. S. Alturayeif and H. Luqman, "Fine-grained sentiment analysis of Arabic COVID-19 tweets using BERT-based transformers and dynamically weighted loss function," Applied Sciences, vol. 11, no. 22, p. 10694, 2021.</w:t>
+        <w:t xml:space="preserve">[12] S. Zaid, A. H. Alharbi, and H. Samra, "Multi-aspect sentiment classification of Arabic tourism reviews using BERT and classical machine learning," Data, vol. 10, no. 11, p. 168, 2025.</w:t>
       </w:r>
     </w:p>
     <w:p>
@@ -17422,7 +17422,7 @@
           <w:szCs w:val="28"/>
           <w:rtl w:val="false"/>
         </w:rPr>
-        <w:t xml:space="preserve">[13] S. Zaid, A. H. Alharbi, and H. Samra, "Multi-aspect sentiment classification of Arabic tourism reviews using BERT and classical machine learning," Data, vol. 10, no. 11, p. 168, 2025.</w:t>
+        <w:t xml:space="preserve">[13] N. K. Al-Harbi and M. Alghieth, "Assessing BERT-based models for Arabic and low-resource languages in crime text classification," PeerJ Computer Science, vol. 11, p. e3017, 2025.</w:t>
       </w:r>
     </w:p>
     <w:p>
@@ -17439,7 +17439,7 @@
           <w:szCs w:val="28"/>
           <w:rtl w:val="false"/>
         </w:rPr>
-        <w:t xml:space="preserve">[14] N. K. Al-Harbi and M. Alghieth, "Assessing BERT-based models for Arabic and low-resource languages in crime text classification," PeerJ Computer Science, vol. 11, p. e3017, 2025.</w:t>
+        <w:t xml:space="preserve">[14] T. Kudo and J. Richardson, "SentencePiece: A simple and language independent subword tokenizer and detokenizer for neural text processing," in Proc. EMNLP: System Demonstrations, 2018, pp. 66–71.</w:t>
       </w:r>
     </w:p>
     <w:p>
@@ -17456,7 +17456,7 @@
           <w:szCs w:val="28"/>
           <w:rtl w:val="false"/>
         </w:rPr>
-        <w:t xml:space="preserve">[15] T. Kudo and J. Richardson, "SentencePiece: A simple and language independent subword tokenizer and detokenizer for neural text processing," in Proc. EMNLP: System Demonstrations, 2018, pp. 66–71.</w:t>
+        <w:t xml:space="preserve">[15] T. Akiba, S. Sano, T. Yanase, T. Ohta, and M. Koyama, "Optuna: A next-generation hyperparameter optimization framework," in Proc. 25th ACM SIGKDD, 2019, pp. 2623–2631.</w:t>
       </w:r>
     </w:p>
     <w:p>
@@ -17473,7 +17473,7 @@
           <w:szCs w:val="28"/>
           <w:rtl w:val="false"/>
         </w:rPr>
-        <w:t xml:space="preserve">[16] T. Akiba, S. Sano, T. Yanase, T. Ohta, and M. Koyama, "Optuna: A next-generation hyperparameter optimization framework," in Proc. 25th ACM SIGKDD, 2019, pp. 2623–2631.</w:t>
+        <w:t xml:space="preserve">[16] T. Wolf et al., "Transformers: State-of-the-art natural language processing," in Proc. EMNLP: System Demonstrations, 2020, pp. 38–45.</w:t>
       </w:r>
     </w:p>
     <w:p>
@@ -17490,7 +17490,7 @@
           <w:szCs w:val="28"/>
           <w:rtl w:val="false"/>
         </w:rPr>
-        <w:t xml:space="preserve">[17] T. Wolf et al., "Transformers: State-of-the-art natural language processing," in Proc. EMNLP: System Demonstrations, 2020, pp. 38–45.</w:t>
+        <w:t xml:space="preserve">[17] F. Pedregosa et al., "Scikit-learn: Machine learning in Python," Journal of Machine Learning Research, vol. 12, pp. 2825–2830, 2011.</w:t>
       </w:r>
     </w:p>
     <w:p>
@@ -17507,24 +17507,7 @@
           <w:szCs w:val="28"/>
           <w:rtl w:val="false"/>
         </w:rPr>
-        <w:t xml:space="preserve">[18] F. Pedregosa et al., "Scikit-learn: Machine learning in Python," Journal of Machine Learning Research, vol. 12, pp. 2825–2830, 2011.</w:t>
-      </w:r>
-    </w:p>
-    <w:p>
-      <w:pPr>
-        <w:bidi w:val="false"/>
-        <w:spacing w:after="60"/>
-        <w:ind w:left="400" w:hanging="400"/>
-        <w:jc w:val="left"/>
-      </w:pPr>
-      <w:r>
-        <w:rPr>
-          <w:rFonts w:ascii="Times New Roman" w:hAnsi="Times New Roman" w:cs="Times New Roman"/>
-          <w:sz w:val="28"/>
-          <w:szCs w:val="28"/>
-          <w:rtl w:val="false"/>
-        </w:rPr>
-        <w:t xml:space="preserve">[19] A. Paszke et al., "PyTorch: An imperative style, high-performance deep learning library," in Advances in Neural Information Processing Systems (NeurIPS), 2019.</w:t>
+        <w:t xml:space="preserve">[18] A. Paszke et al., "PyTorch: An imperative style, high-performance deep learning library," in Advances in Neural Information Processing Systems (NeurIPS), 2019.</w:t>
       </w:r>
     </w:p>
     <w:sectPr>

</xml_diff>

<commit_message>
Research paper: number references in order of first citation (IEEE)
Co-Authored-By: Claude Opus 5.5 (1M context) <noreply@anthropic.com>
</commit_message>
<xml_diff>
--- a/research-paper/البحث_العلمي_تصنيف_استفسارات_الطلاب.docx
+++ b/research-paper/البحث_العلمي_تصنيف_استفسارات_الطلاب.docx
@@ -1009,7 +1009,7 @@
           <w:szCs w:val="28"/>
           <w:rtl/>
         </w:rPr>
-        <w:t xml:space="preserve">يُخضِع AraBERTv2 النص لمعالجة صرفية مسبقة بأداة Farasa تفكك الكلمة إلى سوابقها وجذعها ولواحقها قبل تمريرها إلى مجزّئ SentencePiece [3], [14]؛ فتُفكَّك كلمة «اللغة» مثلاً إلى «ال + لغ + ة». ويقلل هذا التصميم تضخم القاموس الناجم عن الطبيعة الالتصاقية للعربية، ويحسّن تعميم الفهم بين الصيغ المشتقة من الجذر ذاته. أما ARBERTv2 وMARBERTv2 فيطبقان خوارزمية WordPiece مباشرة على النص الخام [4]. وقد خلصت دراسة لاستراتيجيات التجزئة العربية إلى أن دمج ترميز زوج البايتات (BPE) مع التجزئة الصرفية لأداة Farasa يتفوق في مهام متعددة منها تصنيف الأخبار، لكنها رصدت أيضاً تراجع الأداء في تحليل المشاعر بسبب صعوبات تجزئة البنى اللهجية [8]. وأظهرت دراسة أخرى أنه لا يوجد مجزّئ يتفوق في كل الحالات، وأن الأداء يتوقف على حجم البيانات ونوع المهمة ودرجة الغنى الصرفي للنص [7]. وهذا يعني أن الميزة الصرفية لـ AraBERTv2 قد تتحول إلى نقطة ضعف كلما ابتعد النص عن الفصحى، وهو احتمال قائم في الاستفسارات الطلابية. ومن جهة أخرى، دُرّب AraBERTv2 على تسلسلات تصل إلى 512 رمزاً، بينما اقتصر تدريب ARBERT وMARBERT الأصليين على 128 رمزاً تماشياً مع قِصر التغريدات [4].</w:t>
+        <w:t xml:space="preserve">يُخضِع AraBERTv2 النص لمعالجة صرفية مسبقة بأداة Farasa تفكك الكلمة إلى سوابقها وجذعها ولواحقها قبل تمريرها إلى مجزّئ SentencePiece [3], [7]؛ فتُفكَّك كلمة «اللغة» مثلاً إلى «ال + لغ + ة». ويقلل هذا التصميم تضخم القاموس الناجم عن الطبيعة الالتصاقية للعربية، ويحسّن تعميم الفهم بين الصيغ المشتقة من الجذر ذاته. أما ARBERTv2 وMARBERTv2 فيطبقان خوارزمية WordPiece مباشرة على النص الخام [4]. وقد خلصت دراسة لاستراتيجيات التجزئة العربية إلى أن دمج ترميز زوج البايتات (BPE) مع التجزئة الصرفية لأداة Farasa يتفوق في مهام متعددة منها تصنيف الأخبار، لكنها رصدت أيضاً تراجع الأداء في تحليل المشاعر بسبب صعوبات تجزئة البنى اللهجية [8]. وأظهرت دراسة أخرى أنه لا يوجد مجزّئ يتفوق في كل الحالات، وأن الأداء يتوقف على حجم البيانات ونوع المهمة ودرجة الغنى الصرفي للنص [9]. وهذا يعني أن الميزة الصرفية لـ AraBERTv2 قد تتحول إلى نقطة ضعف كلما ابتعد النص عن الفصحى، وهو احتمال قائم في الاستفسارات الطلابية. ومن جهة أخرى، دُرّب AraBERTv2 على تسلسلات تصل إلى 512 رمزاً، بينما اقتصر تدريب ARBERT وMARBERT الأصليين على 128 رمزاً تماشياً مع قِصر التغريدات [4].</w:t>
       </w:r>
     </w:p>
     <w:p>
@@ -3406,7 +3406,7 @@
           <w:szCs w:val="28"/>
           <w:rtl/>
         </w:rPr>
-        <w:t xml:space="preserve">وفي السياقات التعليمية، حقق AraBERT دقة 78% في تحليل مشاعر الطلاب تجاه تقييم أعضاء هيئة التدريس [9]، وحقق بعد الضبط الدقيق F1 يساوي 0.89 في تحليل التغريدات المرتبطة بالإصلاحات التعليمية، متفوقاً على MARBERT وCAMeLBERT [10]. في المقابل، تفوّق MARBERT على AraBERT بفارق 2.0% إلى 3.3% في F1-Micro في تحليل المشاعر الدقيق لتغريدات كوفيد-19 متعددة اللهجات، وعزا الباحثون ذلك إلى تدريبه على محتوى تويتر بأخطائه الإملائية واختصاراته [11]. ويورد [12] أن دمج MARBERT مع SVM حقق دقة 92.14% على مجموعة HEAR لتقييمات المستشفيات (أكثر من 31 ألف تقييم)، بينما تفوقت نماذج BERT متعددة الرؤوس، وفي مقدمتها AraBERT، على المصنفات التقليدية في تحليل الجوانب الفرعية لتقييمات المواقع السياحية [12]. وأشارت دراسة لتصنيف نصوص الجرائم الإلكترونية [13] إلى تباين الأدبيات بين مسارات تُظهر تفوق AraBERT وأخرى تُظهر تفوق MARBERT. ويتسق هذا النمط عبر الدراسات: يتفوق AraBERTv2 في المهام الموضوعية ذات الطابع المؤسسي شبه الرسمي، ويتفوق MARBERTv2 في المهام اللهجية العفوية.</w:t>
+        <w:t xml:space="preserve">وفي السياقات التعليمية، حقق AraBERT دقة 78% في تحليل مشاعر الطلاب تجاه تقييم أعضاء هيئة التدريس [10]، وحقق بعد الضبط الدقيق F1 يساوي 0.89 في تحليل التغريدات المرتبطة بالإصلاحات التعليمية، متفوقاً على MARBERT وCAMeLBERT [11]. في المقابل، تفوّق MARBERT على AraBERT بفارق 2.0% إلى 3.3% في F1-Micro في تحليل المشاعر الدقيق لتغريدات كوفيد-19 متعددة اللهجات، وعزا الباحثون ذلك إلى تدريبه على محتوى تويتر بأخطائه الإملائية واختصاراته [12]. ويورد [13] أن دمج MARBERT مع SVM حقق دقة 92.14% على مجموعة HEAR لتقييمات المستشفيات (أكثر من 31 ألف تقييم)، بينما تفوقت نماذج BERT متعددة الرؤوس، وفي مقدمتها AraBERT، على المصنفات التقليدية في تحليل الجوانب الفرعية لتقييمات المواقع السياحية [13]. وأشارت دراسة لتصنيف نصوص الجرائم الإلكترونية [14] إلى تباين الأدبيات بين مسارات تُظهر تفوق AraBERT وأخرى تُظهر تفوق MARBERT. ويتسق هذا النمط عبر الدراسات: يتفوق AraBERTv2 في المهام الموضوعية ذات الطابع المؤسسي شبه الرسمي، ويتفوق MARBERTv2 في المهام اللهجية العفوية.</w:t>
       </w:r>
     </w:p>
     <w:p>
@@ -3440,7 +3440,7 @@
           <w:szCs w:val="28"/>
           <w:rtl/>
         </w:rPr>
-        <w:t xml:space="preserve">تتباين منهجيات التقييم في الدراسات المستعرضة تبايناً يحدّ من المقارنة المباشرة بين نتائجها: فبعضها يعتمد تقسيماً ثابتاً وحيداً للبيانات فتحمل نتائجه تبايناً عشوائياً ناجماً عن التقسيم ذاته [4]؛ وبعضها يُبلغ الدقة الكلية فقط وبعضها F1-Macro وبعضها F1 لفئة واحدة؛ كما تتفاوت أحجام البيانات من بضعة آلاف إلى مئات الآلاف [10]. وفوق ذلك، لم تتناول أيٌّ من الدراسات القائمة تصنيف الاستفسارات الجامعية الإدارية، وهي نصوص تحمل بصمة لغوية خاصة: مضمون موضوعي إداري واضح ومفردات مؤسسية فصيحة، بصياغة عامية دارجة. ويعالج هذا البحث هذه الفجوة بمقارنة مستقلة بين النماذج الثلاثة على هذه البيئة اللغوية، بتحقق متقاطع طبقي خماسي يتجاوز قيد التقسيم الوحيد.</w:t>
+        <w:t xml:space="preserve">تتباين منهجيات التقييم في الدراسات المستعرضة تبايناً يحدّ من المقارنة المباشرة بين نتائجها: فبعضها يعتمد تقسيماً ثابتاً وحيداً للبيانات فتحمل نتائجه تبايناً عشوائياً ناجماً عن التقسيم ذاته [4]؛ وبعضها يُبلغ الدقة الكلية فقط وبعضها F1-Macro وبعضها F1 لفئة واحدة؛ كما تتفاوت أحجام البيانات من بضعة آلاف إلى مئات الآلاف [11]. وفوق ذلك، لم تتناول أيٌّ من الدراسات القائمة تصنيف الاستفسارات الجامعية الإدارية، وهي نصوص تحمل بصمة لغوية خاصة: مضمون موضوعي إداري واضح ومفردات مؤسسية فصيحة، بصياغة عامية دارجة. ويعالج هذا البحث هذه الفجوة بمقارنة مستقلة بين النماذج الثلاثة على هذه البيئة اللغوية، بتحقق متقاطع طبقي خماسي يتجاوز قيد التقسيم الوحيد.</w:t>
       </w:r>
     </w:p>
     <w:p>
@@ -5860,7 +5860,7 @@
           <w:szCs w:val="28"/>
           <w:rtl/>
         </w:rPr>
-        <w:t xml:space="preserve">مُرّرت النصوص إلى المجزّئ الخاص بكل نموذج لضمان التوافق مع قاموسه، بحد أقصى للطول قدره 128 رمزاً، وهو حد ملائم لقِصر غالبية الاستفسارات. وتُقطع النصوص الأطول من نهايتها للحفاظ على بداية الاستفسار، وأُدير الحشو ديناميكياً على مستوى الدفعة (DataCollatorWithPadding) لتقليل الكلفة الحسابية. واعتُمد الضبط الدقيق الكامل (Full Fine-Tuning) الذي تُحدَّث فيه أوزان جميع الطبقات، بما يتيح للنموذج التكيف مع الطابع العامي الهجين للبيانات الذي قد يختلف عن توزيع بيانات التدريب المسبق. وأُضيفت فوق مخرجات النموذج طبقة تصنيف خطية بأربعة عصبونات تقابل الفئات الأربع، تُطبَّق على مخرجاتها دالة argmax لتحديد الفئة المتنبأ بها، باستخدام الصنف AutoModelForSequenceClassification من مكتبة Transformers [16].</w:t>
+        <w:t xml:space="preserve">مُرّرت النصوص إلى المجزّئ الخاص بكل نموذج لضمان التوافق مع قاموسه، بحد أقصى للطول قدره 128 رمزاً، وهو حد ملائم لقِصر غالبية الاستفسارات. وتُقطع النصوص الأطول من نهايتها للحفاظ على بداية الاستفسار، وأُدير الحشو ديناميكياً على مستوى الدفعة (DataCollatorWithPadding) لتقليل الكلفة الحسابية. واعتُمد الضبط الدقيق الكامل (Full Fine-Tuning) الذي تُحدَّث فيه أوزان جميع الطبقات، بما يتيح للنموذج التكيف مع الطابع العامي الهجين للبيانات الذي قد يختلف عن توزيع بيانات التدريب المسبق. وأُضيفت فوق مخرجات النموذج طبقة تصنيف خطية بأربعة عصبونات تقابل الفئات الأربع، تُطبَّق على مخرجاتها دالة argmax لتحديد الفئة المتنبأ بها، باستخدام الصنف AutoModelForSequenceClassification من مكتبة Transformers [15].</w:t>
       </w:r>
     </w:p>
     <w:p>
@@ -5894,7 +5894,7 @@
           <w:szCs w:val="28"/>
           <w:rtl/>
         </w:rPr>
-        <w:t xml:space="preserve">اعتُمد تحقق متقاطع طبقي خماسي (Stratified 5-Fold Cross-Validation) بديلاً عن التقسيم الثنائي التقليدي، باستخدام StratifiedKFold وStratifiedShuffleSplit من مكتبة scikit-learn [17]. يُخصَّص في كل دورة جزء واحد للاختبار، ويُقتطع من بيانات التدريب الباقية جزء طبقي بنسبة 10% للتحقق ولتوجيه التوقف المبكر (الجدول 6). وثُبّتت الفولدات الخمسة مرة واحدة قبل تدريب أي نموذج، فخضعت النماذج الثلاثة لتقسيمات متطابقة. وتُحسب المقاييس النهائية متوسطاً عبر الفولدات الخمسة، وتُجمّع تنبؤات الفولدات لبناء مصفوفة ارتباك واحدة تغطي العينات الألفين.</w:t>
+        <w:t xml:space="preserve">اعتُمد تحقق متقاطع طبقي خماسي (Stratified 5-Fold Cross-Validation) بديلاً عن التقسيم الثنائي التقليدي، باستخدام StratifiedKFold وStratifiedShuffleSplit من مكتبة scikit-learn [16]. يُخصَّص في كل دورة جزء واحد للاختبار، ويُقتطع من بيانات التدريب الباقية جزء طبقي بنسبة 10% للتحقق ولتوجيه التوقف المبكر (الجدول 6). وثُبّتت الفولدات الخمسة مرة واحدة قبل تدريب أي نموذج، فخضعت النماذج الثلاثة لتقسيمات متطابقة. وتُحسب المقاييس النهائية متوسطاً عبر الفولدات الخمسة، وتُجمّع تنبؤات الفولدات لبناء مصفوفة ارتباك واحدة تغطي العينات الألفين.</w:t>
       </w:r>
     </w:p>
     <w:p>
@@ -6475,7 +6475,7 @@
           <w:szCs w:val="28"/>
           <w:rtl/>
         </w:rPr>
-        <w:t xml:space="preserve">طُبّقت معاملات فائقة موحّدة على النماذج الثلاثة (الجدول 7) لضمان عدالة المقارنة وإزالة أي تحيز ناجم عن اختلاف إعدادات التدريب. ولتفادي الإفراط في التخصيص، اعتُمد التوقف المبكر (EarlyStoppingCallback) بصبر قدره حقبتان: يتوقف التدريب إذا لم تتحسن خسارة التحقق على مدى حقبتين متتاليتين، وتُستعاد أوزان أفضل حقبة (load_best_model_at_end). ولضمان قابلية الاستنساخ، ثُبّتت البذرة (42) على مستوى مكتبات random وNumPy وPyTorch [18] على المعالجين المركزي والرسومي ومتغيرات البيئة، إضافة إلى data_seed داخل إعدادات التدريب.</w:t>
+        <w:t xml:space="preserve">طُبّقت معاملات فائقة موحّدة على النماذج الثلاثة (الجدول 7) لضمان عدالة المقارنة وإزالة أي تحيز ناجم عن اختلاف إعدادات التدريب. ولتفادي الإفراط في التخصيص، اعتُمد التوقف المبكر (EarlyStoppingCallback) بصبر قدره حقبتان: يتوقف التدريب إذا لم تتحسن خسارة التحقق على مدى حقبتين متتاليتين، وتُستعاد أوزان أفضل حقبة (load_best_model_at_end). ولضمان قابلية الاستنساخ، ثُبّتت البذرة (42) على مستوى مكتبات random وNumPy وPyTorch [17] على المعالجين المركزي والرسومي ومتغيرات البيئة، إضافة إلى data_seed داخل إعدادات التدريب.</w:t>
       </w:r>
     </w:p>
     <w:p>
@@ -7290,7 +7290,7 @@
           <w:szCs w:val="28"/>
           <w:rtl/>
         </w:rPr>
-        <w:t xml:space="preserve">لاختبار ثبات نتيجة المقارنة عندما يعمل كل نموذج بأفضل إعداداته، ضُبطت المعاملات الفائقة لكل نموذج على حدة بإطار Optuna [15]، مع مطابقة البروتوكول التدريبي للسيناريو الأول في كل ما عدا المعاملات الخاضعة للضبط:</w:t>
+        <w:t xml:space="preserve">لاختبار ثبات نتيجة المقارنة عندما يعمل كل نموذج بأفضل إعداداته، ضُبطت المعاملات الفائقة لكل نموذج على حدة بإطار Optuna [18]، مع مطابقة البروتوكول التدريبي للسيناريو الأول في كل ما عدا المعاملات الخاضعة للضبط:</w:t>
       </w:r>
     </w:p>
     <w:p>
@@ -7617,7 +7617,7 @@
           <w:szCs w:val="28"/>
           <w:rtl/>
         </w:rPr>
-        <w:t xml:space="preserve">نُفّذت التجارب على منصة Google Colab بوحدة معالجة رسومية، باستخدام منظومة Hugging Face (مكتبتا Transformers [16] وDatasets)، وإطار PyTorch [18]، ومكتبة scikit-learn [17] لتقسيم البيانات وحساب المقاييس، وإطار Optuna [15] لضبط المعاملات.</w:t>
+        <w:t xml:space="preserve">نُفّذت التجارب على منصة Google Colab بوحدة معالجة رسومية، باستخدام منظومة Hugging Face (مكتبتا Transformers [15] وDatasets)، وإطار PyTorch [17]، ومكتبة scikit-learn [16] لتقسيم البيانات وحساب المقاييس، وإطار Optuna [18] لضبط المعاملات.</w:t>
       </w:r>
     </w:p>
     <w:p>
@@ -16773,7 +16773,7 @@
           <w:szCs w:val="28"/>
           <w:rtl/>
         </w:rPr>
-        <w:t xml:space="preserve">يطرح تفوق AraBERTv2 تساؤلاً جوهرياً: كيف يتفوق نموذج مدرّب على الفصحى على نموذج مدرّب على العامية (MARBERTv2) في بيانات تحتوي على عامية سورية واضحة؟ يمكن تفسير ذلك بثلاثة عوامل متشابكة. أولاً، يحمل الاستفسار الجامعي حتى حين يُكتب بالعامية مفردات أكاديمية وإدارية فصيحة الجذر كـ«التسجيل» و«الامتحان» و«الرسوم» و«الاعتراض»، وهي مفردات يمثّلها AraBERTv2 بعمق لكثافتها في بيانات تدريبه. ثانياً، تميل العامية في الاستفسارات الجامعية إلى التخفيف اللهجي، فهي أقرب إلى الفصحى من عامية منصات التواصل التي دُرّب عليها MARBERT، ما يضيّق الفجوة التوزيعية. ثالثاً، يحتاج AraBERTv2 إلى عدد أكبر من حقب التدريب للتقارب، ما يشير إلى أنه يستخرج تمثيلات أكثر تدرجاً بدلاً من التقارب السريع على أنماط سطحية. وتتسق هذه التفسيرات مع أفضلية AraBERT في تصنيف المواضيع على معيار ARLUE [4] وفي المهام ذات الطابع المؤسسي الرسمي [10].</w:t>
+        <w:t xml:space="preserve">يطرح تفوق AraBERTv2 تساؤلاً جوهرياً: كيف يتفوق نموذج مدرّب على الفصحى على نموذج مدرّب على العامية (MARBERTv2) في بيانات تحتوي على عامية سورية واضحة؟ يمكن تفسير ذلك بثلاثة عوامل متشابكة. أولاً، يحمل الاستفسار الجامعي حتى حين يُكتب بالعامية مفردات أكاديمية وإدارية فصيحة الجذر كـ«التسجيل» و«الامتحان» و«الرسوم» و«الاعتراض»، وهي مفردات يمثّلها AraBERTv2 بعمق لكثافتها في بيانات تدريبه. ثانياً، تميل العامية في الاستفسارات الجامعية إلى التخفيف اللهجي، فهي أقرب إلى الفصحى من عامية منصات التواصل التي دُرّب عليها MARBERT، ما يضيّق الفجوة التوزيعية. ثالثاً، يحتاج AraBERTv2 إلى عدد أكبر من حقب التدريب للتقارب، ما يشير إلى أنه يستخرج تمثيلات أكثر تدرجاً بدلاً من التقارب السريع على أنماط سطحية. وتتسق هذه التفسيرات مع أفضلية AraBERT في تصنيف المواضيع على معيار ARLUE [4] وفي المهام ذات الطابع المؤسسي الرسمي [11].</w:t>
       </w:r>
     </w:p>
     <w:p>
@@ -17320,7 +17320,7 @@
           <w:szCs w:val="28"/>
           <w:rtl w:val="false"/>
         </w:rPr>
-        <w:t xml:space="preserve">[7] Z. Alyafeai, M. S. Al-shaibani, M. Ghaleb, and I. Ahmad, "Evaluating various tokenizers for Arabic text classification," Neural Processing Letters, 2023, doi: 10.1007/s11063-022-10990-8.</w:t>
+        <w:t xml:space="preserve">[7] T. Kudo and J. Richardson, "SentencePiece: A simple and language independent subword tokenizer and detokenizer for neural text processing," in Proc. EMNLP: System Demonstrations, 2018, pp. 66–71.</w:t>
       </w:r>
     </w:p>
     <w:p>
@@ -17354,7 +17354,7 @@
           <w:szCs w:val="28"/>
           <w:rtl w:val="false"/>
         </w:rPr>
-        <w:t xml:space="preserve">[9] H. Alamoudi et al., "Arabic sentiment analysis for student evaluation using machine learning and the AraBERT transformer," Engineering, Technology &amp; Applied Science Research, vol. 13, no. 5, pp. 11945–11952, 2023.</w:t>
+        <w:t xml:space="preserve">[9] Z. Alyafeai, M. S. Al-shaibani, M. Ghaleb, and I. Ahmad, "Evaluating various tokenizers for Arabic text classification," Neural Processing Letters, 2023, doi: 10.1007/s11063-022-10990-8.</w:t>
       </w:r>
     </w:p>
     <w:p>
@@ -17371,7 +17371,7 @@
           <w:szCs w:val="28"/>
           <w:rtl w:val="false"/>
         </w:rPr>
-        <w:t xml:space="preserve">[10] A. Alotaibi and F. Nadeem, "Leveraging social media and deep learning for sentiment analysis for smart governance: A case study of public reactions to educational reforms in Saudi Arabia," Computers, vol. 13, no. 11, p. 280, 2024.</w:t>
+        <w:t xml:space="preserve">[10] H. Alamoudi et al., "Arabic sentiment analysis for student evaluation using machine learning and the AraBERT transformer," Engineering, Technology &amp; Applied Science Research, vol. 13, no. 5, pp. 11945–11952, 2023.</w:t>
       </w:r>
     </w:p>
     <w:p>
@@ -17388,7 +17388,7 @@
           <w:szCs w:val="28"/>
           <w:rtl w:val="false"/>
         </w:rPr>
-        <w:t xml:space="preserve">[11] N. S. Alturayeif and H. Luqman, "Fine-grained sentiment analysis of Arabic COVID-19 tweets using BERT-based transformers and dynamically weighted loss function," Applied Sciences, vol. 11, no. 22, p. 10694, 2021.</w:t>
+        <w:t xml:space="preserve">[11] A. Alotaibi and F. Nadeem, "Leveraging social media and deep learning for sentiment analysis for smart governance: A case study of public reactions to educational reforms in Saudi Arabia," Computers, vol. 13, no. 11, p. 280, 2024.</w:t>
       </w:r>
     </w:p>
     <w:p>
@@ -17405,7 +17405,7 @@
           <w:szCs w:val="28"/>
           <w:rtl w:val="false"/>
         </w:rPr>
-        <w:t xml:space="preserve">[12] S. Zaid, A. H. Alharbi, and H. Samra, "Multi-aspect sentiment classification of Arabic tourism reviews using BERT and classical machine learning," Data, vol. 10, no. 11, p. 168, 2025.</w:t>
+        <w:t xml:space="preserve">[12] N. S. Alturayeif and H. Luqman, "Fine-grained sentiment analysis of Arabic COVID-19 tweets using BERT-based transformers and dynamically weighted loss function," Applied Sciences, vol. 11, no. 22, p. 10694, 2021.</w:t>
       </w:r>
     </w:p>
     <w:p>
@@ -17422,7 +17422,7 @@
           <w:szCs w:val="28"/>
           <w:rtl w:val="false"/>
         </w:rPr>
-        <w:t xml:space="preserve">[13] N. K. Al-Harbi and M. Alghieth, "Assessing BERT-based models for Arabic and low-resource languages in crime text classification," PeerJ Computer Science, vol. 11, p. e3017, 2025.</w:t>
+        <w:t xml:space="preserve">[13] S. Zaid, A. H. Alharbi, and H. Samra, "Multi-aspect sentiment classification of Arabic tourism reviews using BERT and classical machine learning," Data, vol. 10, no. 11, p. 168, 2025.</w:t>
       </w:r>
     </w:p>
     <w:p>
@@ -17439,7 +17439,7 @@
           <w:szCs w:val="28"/>
           <w:rtl w:val="false"/>
         </w:rPr>
-        <w:t xml:space="preserve">[14] T. Kudo and J. Richardson, "SentencePiece: A simple and language independent subword tokenizer and detokenizer for neural text processing," in Proc. EMNLP: System Demonstrations, 2018, pp. 66–71.</w:t>
+        <w:t xml:space="preserve">[14] N. K. Al-Harbi and M. Alghieth, "Assessing BERT-based models for Arabic and low-resource languages in crime text classification," PeerJ Computer Science, vol. 11, p. e3017, 2025.</w:t>
       </w:r>
     </w:p>
     <w:p>
@@ -17456,7 +17456,7 @@
           <w:szCs w:val="28"/>
           <w:rtl w:val="false"/>
         </w:rPr>
-        <w:t xml:space="preserve">[15] T. Akiba, S. Sano, T. Yanase, T. Ohta, and M. Koyama, "Optuna: A next-generation hyperparameter optimization framework," in Proc. 25th ACM SIGKDD, 2019, pp. 2623–2631.</w:t>
+        <w:t xml:space="preserve">[15] T. Wolf et al., "Transformers: State-of-the-art natural language processing," in Proc. EMNLP: System Demonstrations, 2020, pp. 38–45.</w:t>
       </w:r>
     </w:p>
     <w:p>
@@ -17473,7 +17473,7 @@
           <w:szCs w:val="28"/>
           <w:rtl w:val="false"/>
         </w:rPr>
-        <w:t xml:space="preserve">[16] T. Wolf et al., "Transformers: State-of-the-art natural language processing," in Proc. EMNLP: System Demonstrations, 2020, pp. 38–45.</w:t>
+        <w:t xml:space="preserve">[16] F. Pedregosa et al., "Scikit-learn: Machine learning in Python," Journal of Machine Learning Research, vol. 12, pp. 2825–2830, 2011.</w:t>
       </w:r>
     </w:p>
     <w:p>
@@ -17490,7 +17490,7 @@
           <w:szCs w:val="28"/>
           <w:rtl w:val="false"/>
         </w:rPr>
-        <w:t xml:space="preserve">[17] F. Pedregosa et al., "Scikit-learn: Machine learning in Python," Journal of Machine Learning Research, vol. 12, pp. 2825–2830, 2011.</w:t>
+        <w:t xml:space="preserve">[17] A. Paszke et al., "PyTorch: An imperative style, high-performance deep learning library," in Advances in Neural Information Processing Systems (NeurIPS), 2019.</w:t>
       </w:r>
     </w:p>
     <w:p>
@@ -17507,7 +17507,7 @@
           <w:szCs w:val="28"/>
           <w:rtl w:val="false"/>
         </w:rPr>
-        <w:t xml:space="preserve">[18] A. Paszke et al., "PyTorch: An imperative style, high-performance deep learning library," in Advances in Neural Information Processing Systems (NeurIPS), 2019.</w:t>
+        <w:t xml:space="preserve">[18] T. Akiba, S. Sano, T. Yanase, T. Ohta, and M. Koyama, "Optuna: A next-generation hyperparameter optimization framework," in Proc. 25th ACM SIGKDD, 2019, pp. 2623–2631.</w:t>
       </w:r>
     </w:p>
     <w:sectPr>

</xml_diff>